<commit_message>
docs: expand build log and hosting walkthrough
</commit_message>
<xml_diff>
--- a/AURA/submission/AURA_BUILD_LOG.docx
+++ b/AURA/submission/AURA_BUILD_LOG.docx
@@ -4,150 +4,332 @@
   <w:body>
     <w:p>
       <w:pPr>
-        <w:spacing w:after="40"/>
+        <w:pStyle w:val="Title"/>
+        <w:keepNext/>
+        <w:spacing w:after="20"/>
+        <w:jc w:val="center"/>
+        <w:pBdr>
+          <w:bottom w:val="nil" w:sz="0" w:space="0"/>
+        </w:pBdr>
+      </w:pPr>
+      <w:r>
+        <w:rPr>
+          <w:rFonts w:ascii="Arial" w:hAnsi="Arial" w:eastAsia="Arial"/>
+          <w:b/>
+          <w:color w:val="000000"/>
+          <w:sz w:val="36"/>
+        </w:rPr>
+        <w:t>AURA BUILD LOG SPRINT 1</w:t>
+      </w:r>
+    </w:p>
+    <w:p>
+      <w:pPr>
+        <w:spacing w:after="100"/>
         <w:jc w:val="center"/>
       </w:pPr>
       <w:r>
         <w:rPr>
-          <w:rFonts w:ascii="Arial" w:hAnsi="Arial"/>
-          <w:b/>
-          <w:color w:val="194491"/>
-          <w:sz w:val="36"/>
+          <w:rFonts w:ascii="Arial" w:hAnsi="Arial" w:eastAsia="Arial"/>
+          <w:i/>
+          <w:color w:val="555555"/>
+          <w:sz w:val="18"/>
         </w:rPr>
-        <w:t>AURA — BUILD LOG SPRINT 1</w:t>
+        <w:t>Track A The Escalation Referee | 22 09 2026 | Pham Gia Phu</w:t>
       </w:r>
     </w:p>
     <w:p>
       <w:pPr>
-        <w:spacing w:after="140"/>
-        <w:jc w:val="center"/>
+        <w:spacing w:after="80" w:line="252" w:lineRule="auto"/>
       </w:pPr>
       <w:r>
         <w:rPr>
-          <w:i/>
-          <w:color w:val="586478"/>
-          <w:sz w:val="17"/>
+          <w:rFonts w:ascii="Arial" w:hAnsi="Arial" w:eastAsia="Arial"/>
+          <w:sz w:val="20"/>
         </w:rPr>
-        <w:t>Track A: The Escalation Referee  •  22/09/2026  •  1 trang</w:t>
+        <w:t>Trong Sprint 1, tôi dùng AI để rút ngắn thời gian đọc code, thử nghiệm kiến trúc và chuẩn hóa dữ liệu hóa đơn, nhưng giữ quyết định nghiệp vụ trong policy C# có thể kiểm thử. Kết quả là một vertical slice chạy thật từ upload, trích xuất và phân loại đến chuyển quản lý, audit và hoàn tác; các giới hạn của model được hiển thị thay vì che giấu.</w:t>
+      </w:r>
+    </w:p>
+    <w:p>
+      <w:pPr>
+        <w:keepNext/>
+        <w:spacing w:before="100" w:after="30"/>
+      </w:pPr>
+      <w:r>
+        <w:rPr>
+          <w:rFonts w:ascii="Arial" w:hAnsi="Arial" w:eastAsia="Arial"/>
+          <w:b/>
+          <w:color w:val="000000"/>
+          <w:sz w:val="23"/>
+        </w:rPr>
+        <w:t>1 Công cụ và phạm vi sử dụng</w:t>
+      </w:r>
+    </w:p>
+    <w:p>
+      <w:pPr>
+        <w:spacing w:after="50" w:line="247" w:lineRule="auto"/>
+      </w:pPr>
+      <w:r>
+        <w:rPr>
+          <w:rFonts w:ascii="Arial" w:hAnsi="Arial" w:eastAsia="Arial"/>
+          <w:sz w:val="20"/>
+        </w:rPr>
+        <w:t>Qwen3-VL-8B-Instruct qua OpenRouter đọc một ảnh JPG hoặc PNG và trả dữ kiện theo JSON Schema. Codex và Antigravity hỗ trợ truy route, phát hiện lỗi JavaScript, refactor, viết test và đồng bộ tài liệu. Tôi không dùng output của AI như bằng chứng duy nhất: thay đổi chỉ được giữ lại sau build, test và kiểm tra UI.</w:t>
+      </w:r>
+    </w:p>
+    <w:p>
+      <w:pPr>
+        <w:keepNext/>
+        <w:spacing w:before="100" w:after="30"/>
+      </w:pPr>
+      <w:r>
+        <w:rPr>
+          <w:rFonts w:ascii="Arial" w:hAnsi="Arial" w:eastAsia="Arial"/>
+          <w:b/>
+          <w:color w:val="000000"/>
+          <w:sz w:val="23"/>
+        </w:rPr>
+        <w:t>2 Hành trình xây dựng và các lần AI sai</w:t>
+      </w:r>
+    </w:p>
+    <w:p>
+      <w:pPr>
+        <w:spacing w:after="50" w:line="247" w:lineRule="auto"/>
+      </w:pPr>
+      <w:r>
+        <w:rPr>
+          <w:rFonts w:ascii="Arial" w:hAnsi="Arial" w:eastAsia="Arial"/>
+          <w:sz w:val="20"/>
+        </w:rPr>
+        <w:t>Prototype đầu tiên dùng Gemini Free Tier nhưng gặp HTTP 429 và quota không ổn định. Khi chuyển sang OpenRouter, một model slug hoặc endpoint sai từng gây HTTP 404; sau đó Qwen có lúc trả JSON lệch schema hoặc xem câu mô tả trên fixture tổng hợp là prompt injection. Các lỗi này dẫn tới ba thay đổi: chuẩn hóa cấu hình provider, parser có giới hạn rõ, và fail-safe sang ESCALATE_SYSTEM_ERROR thay vì cố suy đoán một quyết định.</w:t>
       </w:r>
     </w:p>
     <w:tbl>
       <w:tblPr>
         <w:tblW w:type="auto" w:w="0"/>
+        <w:jc w:val="center"/>
         <w:tblLayout w:type="fixed"/>
         <w:tblLook w:firstColumn="1" w:firstRow="1" w:lastColumn="0" w:lastRow="0" w:noHBand="0" w:noVBand="1" w:val="04A0"/>
+        <w:tblBorders>
+          <w:top w:val="single" w:sz="4" w:color="D9D9D9"/>
+          <w:left w:val="single" w:sz="4" w:color="D9D9D9"/>
+          <w:bottom w:val="single" w:sz="4" w:color="D9D9D9"/>
+          <w:right w:val="single" w:sz="4" w:color="D9D9D9"/>
+          <w:insideH w:val="single" w:sz="4" w:color="D9D9D9"/>
+          <w:insideV w:val="single" w:sz="4" w:color="D9D9D9"/>
+        </w:tblBorders>
       </w:tblPr>
       <w:tblGrid>
-        <w:gridCol w:w="3288"/>
-        <w:gridCol w:w="3288"/>
-        <w:gridCol w:w="3288"/>
+        <w:gridCol w:w="5046"/>
+        <w:gridCol w:w="5046"/>
       </w:tblGrid>
       <w:tr>
         <w:tc>
           <w:tcPr>
-            <w:tcW w:type="dxa" w:w="3459"/>
-            <w:shd w:fill="EAF1FF"/>
+            <w:tcW w:type="dxa" w:w="5188"/>
+            <w:shd w:fill="17365D"/>
             <w:tcMar>
-              <w:top w:w="90" w:type="dxa"/>
-              <w:start w:w="120" w:type="dxa"/>
-              <w:bottom w:w="90" w:type="dxa"/>
-              <w:end w:w="120" w:type="dxa"/>
+              <w:top w:w="85" w:type="dxa"/>
+              <w:start w:w="115" w:type="dxa"/>
+              <w:bottom w:w="85" w:type="dxa"/>
+              <w:end w:w="115" w:type="dxa"/>
             </w:tcMar>
             <w:vAlign w:val="center"/>
           </w:tcPr>
           <w:p>
             <w:pPr>
-              <w:spacing w:after="20"/>
               <w:jc w:val="center"/>
             </w:pPr>
             <w:r>
               <w:rPr>
+                <w:rFonts w:ascii="Arial" w:hAnsi="Arial" w:eastAsia="Arial"/>
                 <w:b/>
-                <w:color w:val="485974"/>
-                <w:sz w:val="15"/>
+                <w:color w:val="FFFFFF"/>
+                <w:sz w:val="19"/>
               </w:rPr>
-              <w:t>OFFLINE TEST</w:t>
-              <w:br/>
-            </w:r>
-            <w:r>
-              <w:rPr>
-                <w:b/>
-                <w:color w:val="194491"/>
-                <w:sz w:val="20"/>
-              </w:rPr>
-              <w:t>54/54 PASS</w:t>
+              <w:t>AI giúp tăng tốc</w:t>
             </w:r>
           </w:p>
         </w:tc>
         <w:tc>
           <w:tcPr>
-            <w:tcW w:type="dxa" w:w="3459"/>
-            <w:shd w:fill="EAF1FF"/>
+            <w:tcW w:type="dxa" w:w="5188"/>
+            <w:shd w:fill="17365D"/>
             <w:tcMar>
-              <w:top w:w="90" w:type="dxa"/>
-              <w:start w:w="120" w:type="dxa"/>
-              <w:bottom w:w="90" w:type="dxa"/>
-              <w:end w:w="120" w:type="dxa"/>
+              <w:top w:w="85" w:type="dxa"/>
+              <w:start w:w="115" w:type="dxa"/>
+              <w:bottom w:w="85" w:type="dxa"/>
+              <w:end w:w="115" w:type="dxa"/>
             </w:tcMar>
             <w:vAlign w:val="center"/>
           </w:tcPr>
           <w:p>
             <w:pPr>
-              <w:spacing w:after="20"/>
               <w:jc w:val="center"/>
             </w:pPr>
             <w:r>
               <w:rPr>
+                <w:rFonts w:ascii="Arial" w:hAnsi="Arial" w:eastAsia="Arial"/>
                 <w:b/>
-                <w:color w:val="485974"/>
-                <w:sz w:val="15"/>
+                <w:color w:val="FFFFFF"/>
+                <w:sz w:val="19"/>
               </w:rPr>
-              <w:t>VERIFY V2 LOCAL</w:t>
-              <w:br/>
+              <w:t>AI làm tốn công khi</w:t>
             </w:r>
+          </w:p>
+        </w:tc>
+      </w:tr>
+      <w:tr>
+        <w:tc>
+          <w:tcPr>
+            <w:tcW w:type="dxa" w:w="5046"/>
+            <w:shd w:fill="EAF2F8"/>
+            <w:tcMar>
+              <w:top w:w="85" w:type="dxa"/>
+              <w:start w:w="115" w:type="dxa"/>
+              <w:bottom w:w="85" w:type="dxa"/>
+              <w:end w:w="115" w:type="dxa"/>
+            </w:tcMar>
+            <w:vAlign w:val="center"/>
+          </w:tcPr>
+          <w:p>
+            <w:pPr>
+              <w:spacing w:after="0"/>
+            </w:pPr>
             <w:r>
               <w:rPr>
-                <w:b/>
-                <w:color w:val="194491"/>
-                <w:sz w:val="20"/>
+                <w:rFonts w:ascii="Arial" w:hAnsi="Arial" w:eastAsia="Arial"/>
+                <w:sz w:val="18"/>
               </w:rPr>
-              <w:t>5/5 — người dùng xác nhận</w:t>
+              <w:t>Tìm nhanh luồng upload, Verify, reviewer và audit.</w:t>
             </w:r>
           </w:p>
         </w:tc>
         <w:tc>
           <w:tcPr>
-            <w:tcW w:type="dxa" w:w="3459"/>
-            <w:shd w:fill="EAF1FF"/>
+            <w:tcW w:type="dxa" w:w="5046"/>
+            <w:shd w:fill="EAF2F8"/>
             <w:tcMar>
-              <w:top w:w="90" w:type="dxa"/>
-              <w:start w:w="120" w:type="dxa"/>
-              <w:bottom w:w="90" w:type="dxa"/>
-              <w:end w:w="120" w:type="dxa"/>
+              <w:top w:w="85" w:type="dxa"/>
+              <w:start w:w="115" w:type="dxa"/>
+              <w:bottom w:w="85" w:type="dxa"/>
+              <w:end w:w="115" w:type="dxa"/>
             </w:tcMar>
             <w:vAlign w:val="center"/>
           </w:tcPr>
           <w:p>
             <w:pPr>
-              <w:spacing w:after="20"/>
-              <w:jc w:val="center"/>
+              <w:spacing w:after="0"/>
             </w:pPr>
             <w:r>
               <w:rPr>
-                <w:b/>
-                <w:color w:val="485974"/>
-                <w:sz w:val="15"/>
+                <w:rFonts w:ascii="Arial" w:hAnsi="Arial" w:eastAsia="Arial"/>
+                <w:sz w:val="18"/>
               </w:rPr>
-              <w:t>QUYẾT ĐỊNH KIẾN TRÚC</w:t>
-              <w:br/>
+              <w:t>Đề xuất model hoặc API không tồn tại/chưa đúng slug.</w:t>
             </w:r>
+          </w:p>
+        </w:tc>
+      </w:tr>
+      <w:tr>
+        <w:tc>
+          <w:tcPr>
+            <w:tcW w:type="dxa" w:w="5046"/>
+            <w:shd w:fill="FFFFFF"/>
+            <w:tcMar>
+              <w:top w:w="85" w:type="dxa"/>
+              <w:start w:w="115" w:type="dxa"/>
+              <w:bottom w:w="85" w:type="dxa"/>
+              <w:end w:w="115" w:type="dxa"/>
+            </w:tcMar>
+            <w:vAlign w:val="center"/>
+          </w:tcPr>
+          <w:p>
+            <w:pPr>
+              <w:spacing w:after="0"/>
+            </w:pPr>
             <w:r>
               <w:rPr>
-                <w:b/>
-                <w:color w:val="194491"/>
-                <w:sz w:val="20"/>
+                <w:rFonts w:ascii="Arial" w:hAnsi="Arial" w:eastAsia="Arial"/>
+                <w:sz w:val="18"/>
               </w:rPr>
-              <w:t>AI đọc • C# quyết định</w:t>
+              <w:t>Sinh test policy, contract và kiểm tra fixture offline.</w:t>
+            </w:r>
+          </w:p>
+        </w:tc>
+        <w:tc>
+          <w:tcPr>
+            <w:tcW w:type="dxa" w:w="5046"/>
+            <w:shd w:fill="FFFFFF"/>
+            <w:tcMar>
+              <w:top w:w="85" w:type="dxa"/>
+              <w:start w:w="115" w:type="dxa"/>
+              <w:bottom w:w="85" w:type="dxa"/>
+              <w:end w:w="115" w:type="dxa"/>
+            </w:tcMar>
+            <w:vAlign w:val="center"/>
+          </w:tcPr>
+          <w:p>
+            <w:pPr>
+              <w:spacing w:after="0"/>
+            </w:pPr>
+            <w:r>
+              <w:rPr>
+                <w:rFonts w:ascii="Arial" w:hAnsi="Arial" w:eastAsia="Arial"/>
+                <w:sz w:val="18"/>
+              </w:rPr>
+              <w:t>Output trông hợp lý nhưng không đúng schema hoặc policy.</w:t>
+            </w:r>
+          </w:p>
+        </w:tc>
+      </w:tr>
+      <w:tr>
+        <w:tc>
+          <w:tcPr>
+            <w:tcW w:type="dxa" w:w="5046"/>
+            <w:shd w:fill="EAF2F8"/>
+            <w:tcMar>
+              <w:top w:w="85" w:type="dxa"/>
+              <w:start w:w="115" w:type="dxa"/>
+              <w:bottom w:w="85" w:type="dxa"/>
+              <w:end w:w="115" w:type="dxa"/>
+            </w:tcMar>
+            <w:vAlign w:val="center"/>
+          </w:tcPr>
+          <w:p>
+            <w:pPr>
+              <w:spacing w:after="0"/>
+            </w:pPr>
+            <w:r>
+              <w:rPr>
+                <w:rFonts w:ascii="Arial" w:hAnsi="Arial" w:eastAsia="Arial"/>
+                <w:sz w:val="18"/>
+              </w:rPr>
+              <w:t>Đối chiếu prompt, UI và tài liệu sau mỗi thay đổi.</w:t>
+            </w:r>
+          </w:p>
+        </w:tc>
+        <w:tc>
+          <w:tcPr>
+            <w:tcW w:type="dxa" w:w="5046"/>
+            <w:shd w:fill="EAF2F8"/>
+            <w:tcMar>
+              <w:top w:w="85" w:type="dxa"/>
+              <w:start w:w="115" w:type="dxa"/>
+              <w:bottom w:w="85" w:type="dxa"/>
+              <w:end w:w="115" w:type="dxa"/>
+            </w:tcMar>
+            <w:vAlign w:val="center"/>
+          </w:tcPr>
+          <w:p>
+            <w:pPr>
+              <w:spacing w:after="0"/>
+            </w:pPr>
+            <w:r>
+              <w:rPr>
+                <w:rFonts w:ascii="Arial" w:hAnsi="Arial" w:eastAsia="Arial"/>
+                <w:sz w:val="18"/>
+              </w:rPr>
+              <w:t>Tài liệu dễ tuyên bố quá mức nếu không đọc lại code thực tế.</w:t>
             </w:r>
           </w:p>
         </w:tc>
@@ -155,205 +337,393 @@
     </w:tbl>
     <w:p>
       <w:pPr>
-        <w:spacing w:before="120" w:after="40"/>
+        <w:keepNext/>
+        <w:spacing w:before="100" w:after="30"/>
       </w:pPr>
       <w:r>
         <w:rPr>
+          <w:rFonts w:ascii="Arial" w:hAnsi="Arial" w:eastAsia="Arial"/>
           <w:b/>
-          <w:color w:val="194491"/>
+          <w:color w:val="000000"/>
           <w:sz w:val="23"/>
         </w:rPr>
-        <w:t>1. Công cụ AI và cách dùng</w:t>
+        <w:t>3 Bằng chứng kiểm thử</w:t>
+      </w:r>
+    </w:p>
+    <w:tbl>
+      <w:tblPr>
+        <w:tblW w:type="auto" w:w="0"/>
+        <w:jc w:val="center"/>
+        <w:tblLayout w:type="fixed"/>
+        <w:tblLook w:firstColumn="1" w:firstRow="1" w:lastColumn="0" w:lastRow="0" w:noHBand="0" w:noVBand="1" w:val="04A0"/>
+        <w:tblBorders>
+          <w:top w:val="single" w:sz="4" w:color="D9D9D9"/>
+          <w:left w:val="single" w:sz="4" w:color="D9D9D9"/>
+          <w:bottom w:val="single" w:sz="4" w:color="D9D9D9"/>
+          <w:right w:val="single" w:sz="4" w:color="D9D9D9"/>
+          <w:insideH w:val="single" w:sz="4" w:color="D9D9D9"/>
+          <w:insideV w:val="single" w:sz="4" w:color="D9D9D9"/>
+        </w:tblBorders>
+      </w:tblPr>
+      <w:tblGrid>
+        <w:gridCol w:w="2466"/>
+        <w:gridCol w:w="2466"/>
+        <w:gridCol w:w="2466"/>
+        <w:gridCol w:w="2466"/>
+      </w:tblGrid>
+      <w:tr>
+        <w:tc>
+          <w:tcPr>
+            <w:tcW w:type="dxa" w:w="2594"/>
+            <w:shd w:fill="17365D"/>
+            <w:tcMar>
+              <w:top w:w="85" w:type="dxa"/>
+              <w:start w:w="115" w:type="dxa"/>
+              <w:bottom w:w="85" w:type="dxa"/>
+              <w:end w:w="115" w:type="dxa"/>
+            </w:tcMar>
+            <w:vAlign w:val="center"/>
+          </w:tcPr>
+          <w:p>
+            <w:pPr>
+              <w:jc w:val="center"/>
+            </w:pPr>
+            <w:r>
+              <w:rPr>
+                <w:rFonts w:ascii="Arial" w:hAnsi="Arial" w:eastAsia="Arial"/>
+                <w:b/>
+                <w:color w:val="FFFFFF"/>
+                <w:sz w:val="17"/>
+              </w:rPr>
+              <w:t>Build</w:t>
+            </w:r>
+          </w:p>
+        </w:tc>
+        <w:tc>
+          <w:tcPr>
+            <w:tcW w:type="dxa" w:w="2594"/>
+            <w:shd w:fill="17365D"/>
+            <w:tcMar>
+              <w:top w:w="85" w:type="dxa"/>
+              <w:start w:w="115" w:type="dxa"/>
+              <w:bottom w:w="85" w:type="dxa"/>
+              <w:end w:w="115" w:type="dxa"/>
+            </w:tcMar>
+            <w:vAlign w:val="center"/>
+          </w:tcPr>
+          <w:p>
+            <w:pPr>
+              <w:jc w:val="center"/>
+            </w:pPr>
+            <w:r>
+              <w:rPr>
+                <w:rFonts w:ascii="Arial" w:hAnsi="Arial" w:eastAsia="Arial"/>
+                <w:b/>
+                <w:color w:val="FFFFFF"/>
+                <w:sz w:val="17"/>
+              </w:rPr>
+              <w:t>Test offline</w:t>
+            </w:r>
+          </w:p>
+        </w:tc>
+        <w:tc>
+          <w:tcPr>
+            <w:tcW w:type="dxa" w:w="2594"/>
+            <w:shd w:fill="17365D"/>
+            <w:tcMar>
+              <w:top w:w="85" w:type="dxa"/>
+              <w:start w:w="115" w:type="dxa"/>
+              <w:bottom w:w="85" w:type="dxa"/>
+              <w:end w:w="115" w:type="dxa"/>
+            </w:tcMar>
+            <w:vAlign w:val="center"/>
+          </w:tcPr>
+          <w:p>
+            <w:pPr>
+              <w:jc w:val="center"/>
+            </w:pPr>
+            <w:r>
+              <w:rPr>
+                <w:rFonts w:ascii="Arial" w:hAnsi="Arial" w:eastAsia="Arial"/>
+                <w:b/>
+                <w:color w:val="FFFFFF"/>
+                <w:sz w:val="17"/>
+              </w:rPr>
+              <w:t>Verify v2 local</w:t>
+            </w:r>
+          </w:p>
+        </w:tc>
+        <w:tc>
+          <w:tcPr>
+            <w:tcW w:type="dxa" w:w="2594"/>
+            <w:shd w:fill="17365D"/>
+            <w:tcMar>
+              <w:top w:w="85" w:type="dxa"/>
+              <w:start w:w="115" w:type="dxa"/>
+              <w:bottom w:w="85" w:type="dxa"/>
+              <w:end w:w="115" w:type="dxa"/>
+            </w:tcMar>
+            <w:vAlign w:val="center"/>
+          </w:tcPr>
+          <w:p>
+            <w:pPr>
+              <w:jc w:val="center"/>
+            </w:pPr>
+            <w:r>
+              <w:rPr>
+                <w:rFonts w:ascii="Arial" w:hAnsi="Arial" w:eastAsia="Arial"/>
+                <w:b/>
+                <w:color w:val="FFFFFF"/>
+                <w:sz w:val="17"/>
+              </w:rPr>
+              <w:t>Gói BGK</w:t>
+            </w:r>
+          </w:p>
+        </w:tc>
+      </w:tr>
+      <w:tr>
+        <w:tc>
+          <w:tcPr>
+            <w:tcW w:type="dxa" w:w="2594"/>
+            <w:shd w:fill="EAF2F8"/>
+            <w:tcMar>
+              <w:top w:w="95" w:type="dxa"/>
+              <w:start w:w="115" w:type="dxa"/>
+              <w:bottom w:w="95" w:type="dxa"/>
+              <w:end w:w="115" w:type="dxa"/>
+            </w:tcMar>
+            <w:vAlign w:val="center"/>
+          </w:tcPr>
+          <w:p>
+            <w:pPr>
+              <w:jc w:val="center"/>
+            </w:pPr>
+            <w:r>
+              <w:rPr>
+                <w:rFonts w:ascii="Arial" w:hAnsi="Arial" w:eastAsia="Arial"/>
+                <w:b/>
+                <w:sz w:val="18"/>
+              </w:rPr>
+              <w:t>0 warning 0 error</w:t>
+            </w:r>
+          </w:p>
+        </w:tc>
+        <w:tc>
+          <w:tcPr>
+            <w:tcW w:type="dxa" w:w="2594"/>
+            <w:shd w:fill="F5F6F7"/>
+            <w:tcMar>
+              <w:top w:w="95" w:type="dxa"/>
+              <w:start w:w="115" w:type="dxa"/>
+              <w:bottom w:w="95" w:type="dxa"/>
+              <w:end w:w="115" w:type="dxa"/>
+            </w:tcMar>
+            <w:vAlign w:val="center"/>
+          </w:tcPr>
+          <w:p>
+            <w:pPr>
+              <w:jc w:val="center"/>
+            </w:pPr>
+            <w:r>
+              <w:rPr>
+                <w:rFonts w:ascii="Arial" w:hAnsi="Arial" w:eastAsia="Arial"/>
+                <w:b/>
+                <w:sz w:val="18"/>
+              </w:rPr>
+              <w:t>54 trên 54 pass</w:t>
+            </w:r>
+          </w:p>
+        </w:tc>
+        <w:tc>
+          <w:tcPr>
+            <w:tcW w:type="dxa" w:w="2594"/>
+            <w:shd w:fill="EAF2F8"/>
+            <w:tcMar>
+              <w:top w:w="95" w:type="dxa"/>
+              <w:start w:w="115" w:type="dxa"/>
+              <w:bottom w:w="95" w:type="dxa"/>
+              <w:end w:w="115" w:type="dxa"/>
+            </w:tcMar>
+            <w:vAlign w:val="center"/>
+          </w:tcPr>
+          <w:p>
+            <w:pPr>
+              <w:jc w:val="center"/>
+            </w:pPr>
+            <w:r>
+              <w:rPr>
+                <w:rFonts w:ascii="Arial" w:hAnsi="Arial" w:eastAsia="Arial"/>
+                <w:b/>
+                <w:sz w:val="18"/>
+              </w:rPr>
+              <w:t>5 trên 5 đúng</w:t>
+            </w:r>
+          </w:p>
+        </w:tc>
+        <w:tc>
+          <w:tcPr>
+            <w:tcW w:type="dxa" w:w="2594"/>
+            <w:shd w:fill="F5F6F7"/>
+            <w:tcMar>
+              <w:top w:w="95" w:type="dxa"/>
+              <w:start w:w="115" w:type="dxa"/>
+              <w:bottom w:w="95" w:type="dxa"/>
+              <w:end w:w="115" w:type="dxa"/>
+            </w:tcMar>
+            <w:vAlign w:val="center"/>
+          </w:tcPr>
+          <w:p>
+            <w:pPr>
+              <w:jc w:val="center"/>
+            </w:pPr>
+            <w:r>
+              <w:rPr>
+                <w:rFonts w:ascii="Arial" w:hAnsi="Arial" w:eastAsia="Arial"/>
+                <w:b/>
+                <w:sz w:val="18"/>
+              </w:rPr>
+              <w:t>15 ca đã khóa</w:t>
+            </w:r>
+          </w:p>
+        </w:tc>
+      </w:tr>
+    </w:tbl>
+    <w:p>
+      <w:pPr>
+        <w:spacing w:after="50" w:line="247" w:lineRule="auto"/>
+      </w:pPr>
+      <w:r>
+        <w:rPr>
+          <w:rFonts w:ascii="Arial" w:hAnsi="Arial" w:eastAsia="Arial"/>
+          <w:sz w:val="20"/>
+        </w:rPr>
+        <w:t>Kết quả 5 trên 5 thuộc bộ fixture tổng hợp đã biết trước, nên chỉ chứng minh harness và policy hoạt động nhất quán; nó không phải độ chính xác tổng quát trên hóa đơn thực tế.</w:t>
+      </w:r>
+    </w:p>
+    <w:p>
+      <w:pPr>
+        <w:keepNext/>
+        <w:spacing w:before="100" w:after="30"/>
+      </w:pPr>
+      <w:r>
+        <w:rPr>
+          <w:rFonts w:ascii="Arial" w:hAnsi="Arial" w:eastAsia="Arial"/>
+          <w:b/>
+          <w:color w:val="000000"/>
+          <w:sz w:val="23"/>
+        </w:rPr>
+        <w:t>4 Cơ chế fail safe đã triển khai</w:t>
+      </w:r>
+    </w:p>
+    <w:p>
+      <w:pPr>
+        <w:spacing w:after="50" w:line="247" w:lineRule="auto"/>
+      </w:pPr>
+      <w:r>
+        <w:rPr>
+          <w:rFonts w:ascii="Arial" w:hAnsi="Arial" w:eastAsia="Arial"/>
+          <w:sz w:val="20"/>
+        </w:rPr>
+        <w:t>AURA không retry HTTP 429 để tránh đốt thêm quota, chỉ retry tối đa một lần với lỗi 5xx và dừng các ca Verify còn lại khi provider gặp lỗi mang tính hệ thống. Đây chưa phải circuit breaker hoặc exponential backoff nhiều lần; mọi lỗi extraction đều chuyển kiểm tra thủ công và không tạo kết quả PASS giả.</w:t>
+      </w:r>
+    </w:p>
+    <w:p>
+      <w:pPr>
+        <w:keepNext/>
+        <w:spacing w:before="100" w:after="30"/>
+      </w:pPr>
+      <w:r>
+        <w:rPr>
+          <w:rFonts w:ascii="Arial" w:hAnsi="Arial" w:eastAsia="Arial"/>
+          <w:b/>
+          <w:color w:val="000000"/>
+          <w:sz w:val="23"/>
+        </w:rPr>
+        <w:t>5 Quyết định kiến trúc và phần cắt giảm</w:t>
       </w:r>
     </w:p>
     <w:p>
       <w:pPr>
         <w:pStyle w:val="ListBullet"/>
-        <w:spacing w:after="40" w:line="240" w:lineRule="auto"/>
+        <w:spacing w:after="30" w:line="240" w:lineRule="auto"/>
       </w:pPr>
       <w:r>
         <w:rPr>
+          <w:rFonts w:ascii="Arial" w:hAnsi="Arial" w:eastAsia="Arial"/>
           <w:sz w:val="20"/>
         </w:rPr>
-        <w:t>Qwen3-VL-8B-Instruct qua OpenRouter trích xuất dữ kiện hóa đơn theo JSON Schema; model không được quyền duyệt hoặc từ chối hồ sơ.</w:t>
+        <w:t>Tách Qwen extraction khỏi PolicyDecisionEngine để model có thể thay đổi mà không đổi quy tắc duyệt.</w:t>
       </w:r>
     </w:p>
     <w:p>
       <w:pPr>
         <w:pStyle w:val="ListBullet"/>
-        <w:spacing w:after="40" w:line="240" w:lineRule="auto"/>
+        <w:spacing w:after="30" w:line="240" w:lineRule="auto"/>
       </w:pPr>
       <w:r>
         <w:rPr>
+          <w:rFonts w:ascii="Arial" w:hAnsi="Arial" w:eastAsia="Arial"/>
           <w:sz w:val="20"/>
         </w:rPr>
-        <w:t>Codex và Antigravity hỗ trợ đọc code, truy route, refactor, viết test và tài liệu. Mọi đề xuất vẫn được kiểm bằng build, test và thao tác UI trước khi chấp nhận.</w:t>
-      </w:r>
-    </w:p>
-    <w:p>
-      <w:pPr>
-        <w:spacing w:before="120" w:after="40"/>
-      </w:pPr>
-      <w:r>
-        <w:rPr>
-          <w:b/>
-          <w:color w:val="194491"/>
-          <w:sz w:val="23"/>
-        </w:rPr>
-        <w:t>2. Điều tạo ra giá trị</w:t>
+        <w:t>Giữ AuditLogs theo sự kiện append-only ở tầng ứng dụng, nhưng UI gom một hồ sơ thành một timeline để tránh cảm giác lặp.</w:t>
       </w:r>
     </w:p>
     <w:p>
       <w:pPr>
         <w:pStyle w:val="ListBullet"/>
-        <w:spacing w:after="40" w:line="240" w:lineRule="auto"/>
+        <w:spacing w:after="30" w:line="240" w:lineRule="auto"/>
       </w:pPr>
       <w:r>
         <w:rPr>
+          <w:rFonts w:ascii="Arial" w:hAnsi="Arial" w:eastAsia="Arial"/>
           <w:sz w:val="20"/>
         </w:rPr>
-        <w:t>Tách Vision khỏi PolicyDecisionEngine giúp quyết định FACT → POLICY → AUTHORITY giải thích được, kiểm thử được và không đổi theo cảm hứng của model.</w:t>
+        <w:t>Chọn hosted Qwen 8B cho demo; Qwen 4B self-host chỉ là hướng benchmark khi có dữ liệu và phần cứng phù hợp.</w:t>
       </w:r>
     </w:p>
     <w:p>
       <w:pPr>
         <w:pStyle w:val="ListBullet"/>
-        <w:spacing w:after="40" w:line="240" w:lineRule="auto"/>
+        <w:spacing w:after="30" w:line="240" w:lineRule="auto"/>
       </w:pPr>
       <w:r>
         <w:rPr>
+          <w:rFonts w:ascii="Arial" w:hAnsi="Arial" w:eastAsia="Arial"/>
           <w:sz w:val="20"/>
         </w:rPr>
-        <w:t>54/54 test offline khóa policy, workflow, audit projection, hợp đồng OpenRouter và tính toàn vẹn Test Kit; không tốn request AI.</w:t>
+        <w:t>Hoãn PDF nhiều trang, authentication theo role, tax lookup, antivirus, object storage và benchmark tập dữ liệu độc lập.</w:t>
       </w:r>
     </w:p>
     <w:p>
       <w:pPr>
-        <w:pStyle w:val="ListBullet"/>
-        <w:spacing w:after="40" w:line="240" w:lineRule="auto"/>
+        <w:keepNext/>
+        <w:spacing w:before="100" w:after="30"/>
       </w:pPr>
       <w:r>
         <w:rPr>
-          <w:sz w:val="20"/>
+          <w:rFonts w:ascii="Arial" w:hAnsi="Arial" w:eastAsia="Arial"/>
+          <w:b/>
+          <w:color w:val="000000"/>
+          <w:sz w:val="23"/>
         </w:rPr>
-        <w:t>Verify v2 gồm 5 ảnh tổng hợp đa layout; người dùng xác nhận local đạt đúng 3 AUTO_APPROVE + 2 ESCALATE ngày 22/09/2026. Gói BGK có đúng 15 ca trong ngân hàng 30 ảnh.</w:t>
+        <w:t>6 Bài học và bước tiếp theo</w:t>
       </w:r>
     </w:p>
     <w:p>
       <w:pPr>
-        <w:pStyle w:val="ListBullet"/>
-        <w:spacing w:after="40" w:line="240" w:lineRule="auto"/>
+        <w:spacing w:after="50" w:line="247" w:lineRule="auto"/>
       </w:pPr>
       <w:r>
         <w:rPr>
+          <w:rFonts w:ascii="Arial" w:hAnsi="Arial" w:eastAsia="Arial"/>
           <w:sz w:val="20"/>
         </w:rPr>
-        <w:t>UI cập nhật bằng fetch/fragment thay vì reload; Audit giữ event gốc nhưng chỉ hiện một hồ sơ với timeline mở rộng, tránh cảm giác lặp ba dòng.</w:t>
-      </w:r>
-    </w:p>
-    <w:p>
-      <w:pPr>
-        <w:spacing w:before="120" w:after="40"/>
-      </w:pPr>
-      <w:r>
-        <w:rPr>
-          <w:b/>
-          <w:color w:val="194491"/>
-          <w:sz w:val="23"/>
-        </w:rPr>
-        <w:t>3. Khi AI sai hoặc làm tốn công</w:t>
-      </w:r>
-    </w:p>
-    <w:p>
-      <w:pPr>
-        <w:pStyle w:val="ListBullet"/>
-        <w:spacing w:after="40" w:line="240" w:lineRule="auto"/>
-      </w:pPr>
-      <w:r>
-        <w:rPr>
-          <w:sz w:val="20"/>
-        </w:rPr>
-        <w:t>Gemini Free Tier chạm quota; endpoint/model Qwen cấu hình sai từng trả 404; output JSON có lúc lệch schema. Hệ thống phải map lỗi rõ và fail-safe sang kiểm tra thủ công.</w:t>
-      </w:r>
-    </w:p>
-    <w:p>
-      <w:pPr>
-        <w:pStyle w:val="ListBullet"/>
-        <w:spacing w:after="40" w:line="240" w:lineRule="auto"/>
-      </w:pPr>
-      <w:r>
-        <w:rPr>
-          <w:sz w:val="20"/>
-        </w:rPr>
-        <w:t>Fixture từng chứa câu mô tả tổng hợp bị model xem là prompt injection. Bộ ảnh và prompt đã được chỉnh để test đúng nghiệp vụ thay vì vô tình test watermark hướng dẫn.</w:t>
-      </w:r>
-    </w:p>
-    <w:p>
-      <w:pPr>
-        <w:pStyle w:val="ListBullet"/>
-        <w:spacing w:after="40" w:line="240" w:lineRule="auto"/>
-      </w:pPr>
-      <w:r>
-        <w:rPr>
-          <w:sz w:val="20"/>
-        </w:rPr>
-        <w:t>AURA không tuyên bố exponential backoff hay circuit breaker: mã hiện chỉ retry tối đa một lần cho 5xx, không retry 429 và dừng phần Verify còn lại khi gặp lỗi provider mang tính hệ thống.</w:t>
-      </w:r>
-    </w:p>
-    <w:p>
-      <w:pPr>
-        <w:spacing w:before="120" w:after="40"/>
-      </w:pPr>
-      <w:r>
-        <w:rPr>
-          <w:b/>
-          <w:color w:val="194491"/>
-          <w:sz w:val="23"/>
-        </w:rPr>
-        <w:t>4. Cắt giảm lớn nhất và lý do</w:t>
-      </w:r>
-    </w:p>
-    <w:p>
-      <w:pPr>
-        <w:pStyle w:val="ListBullet"/>
-        <w:spacing w:after="40" w:line="240" w:lineRule="auto"/>
-      </w:pPr>
-      <w:r>
-        <w:rPr>
-          <w:sz w:val="20"/>
-        </w:rPr>
-        <w:t>Không self-host Qwen 4B và không dùng model 125B sát deadline. Bản demo dùng hosted 8B; 4B là hướng benchmark khi doanh nghiệp có phần cứng hạn chế.</w:t>
-      </w:r>
-    </w:p>
-    <w:p>
-      <w:pPr>
-        <w:pStyle w:val="ListBullet"/>
-        <w:spacing w:after="40" w:line="240" w:lineRule="auto"/>
-      </w:pPr>
-      <w:r>
-        <w:rPr>
-          <w:sz w:val="20"/>
-        </w:rPr>
-        <w:t>Hoãn PDF/nhiều trang, tax/e-invoice lookup, ngoại tệ, antivirus và authentication theo role để bảo đảm một vertical slice chạy thật: upload → extract → policy → human decision → audit/undo.</w:t>
-      </w:r>
-    </w:p>
-    <w:p>
-      <w:pPr>
-        <w:spacing w:before="100" w:after="0"/>
-        <w:jc w:val="center"/>
-      </w:pPr>
-      <w:r>
-        <w:rPr>
-          <w:b/>
-          <w:color w:val="905214"/>
-          <w:sz w:val="16"/>
-        </w:rPr>
-        <w:t>Minh bạch: Test Kit là dữ liệu tổng hợp; 5/5 không phải độ chính xác tổng quát. Ảnh upload được gửi qua OpenRouter/provider Qwen.</w:t>
+        <w:t>Lợi ích lớn nhất của AI là tăng tốc vòng lặp khám phá và kiểm thử, không phải thay người chịu trách nhiệm. Trước khi nộp, tôi cần deploy lên SmarterASP.NET, kiểm tra lưu ảnh sau recycle, chạy một lượt Verify trên Live URL và quay video dưới ba phút. Ảnh upload được gửi qua OpenRouter/provider Qwen; dữ liệu cá nhân thật không được đưa vào Git.</w:t>
       </w:r>
     </w:p>
     <w:sectPr>
       <w:pgSz w:w="11906" w:h="16838"/>
-      <w:pgMar w:top="652" w:right="765" w:bottom="595" w:left="765" w:header="720" w:footer="720" w:gutter="0"/>
+      <w:pgMar w:top="595" w:right="765" w:bottom="567" w:left="765" w:header="720" w:footer="720" w:gutter="0"/>
       <w:cols w:space="720"/>
       <w:docGrid w:linePitch="360"/>
     </w:sectPr>
@@ -724,11 +1094,8 @@
     <w:name w:val="Normal"/>
     <w:qFormat/>
     <w:rsid w:val="00FC693F"/>
-    <w:pPr>
-      <w:spacing w:after="40"/>
-    </w:pPr>
     <w:rPr>
-      <w:rFonts w:ascii="Arial" w:hAnsi="Arial"/>
+      <w:rFonts w:ascii="Arial" w:hAnsi="Arial" w:eastAsia="Arial"/>
       <w:sz w:val="20"/>
     </w:rPr>
   </w:style>

</xml_diff>

<commit_message>
docs: refresh submission slides and build log
</commit_message>
<xml_diff>
--- a/AURA/submission/AURA_BUILD_LOG.docx
+++ b/AURA/submission/AURA_BUILD_LOG.docx
@@ -34,7 +34,7 @@
           <w:color w:val="555555"/>
           <w:sz w:val="18"/>
         </w:rPr>
-        <w:t>Track A The Escalation Referee | 22 09 2026 | Pham Gia Phu</w:t>
+        <w:t>Track A The Escalation Referee | 24 09 2026 | Pham Gia Phu</w:t>
       </w:r>
     </w:p>
     <w:p>
@@ -73,7 +73,7 @@
           <w:rFonts w:ascii="Arial" w:hAnsi="Arial" w:eastAsia="Arial"/>
           <w:sz w:val="20"/>
         </w:rPr>
-        <w:t>Qwen3-VL-8B-Instruct qua OpenRouter đọc một ảnh JPG hoặc PNG và trả dữ kiện theo JSON Schema. Codex và Antigravity hỗ trợ truy route, phát hiện lỗi JavaScript, refactor, viết test và đồng bộ tài liệu. Tôi không dùng output của AI như bằng chứng duy nhất: thay đổi chỉ được giữ lại sau build, test và kiểm tra UI.</w:t>
+        <w:t>Qwen3-VL-8B-Instruct qua OpenRouter đọc một ảnh JPG hoặc PNG và trả dữ kiện theo JSON Schema. Codex hỗ trợ truy route, phát hiện lỗi JavaScript, refactor, viết test và đồng bộ tài liệu. Tôi không dùng output của AI như bằng chứng duy nhất: thay đổi chỉ được giữ lại sau build, test và kiểm tra UI.</w:t>
       </w:r>
     </w:p>
     <w:p>
@@ -530,7 +530,7 @@
                 <w:b/>
                 <w:sz w:val="18"/>
               </w:rPr>
-              <w:t>54 trên 54 pass</w:t>
+              <w:t>56 trên 56 pass</w:t>
             </w:r>
           </w:p>
         </w:tc>
@@ -678,6 +678,19 @@
           <w:rFonts w:ascii="Arial" w:hAnsi="Arial" w:eastAsia="Arial"/>
           <w:sz w:val="20"/>
         </w:rPr>
+        <w:t>Chặn thao tác workflow chồng trong một instance, dùng RowVersion chống ghi đè đồng thời và reload sau mutation để đọc lại trạng thái đã commit.</w:t>
+      </w:r>
+    </w:p>
+    <w:p>
+      <w:pPr>
+        <w:pStyle w:val="ListBullet"/>
+        <w:spacing w:after="30" w:line="240" w:lineRule="auto"/>
+      </w:pPr>
+      <w:r>
+        <w:rPr>
+          <w:rFonts w:ascii="Arial" w:hAnsi="Arial" w:eastAsia="Arial"/>
+          <w:sz w:val="20"/>
+        </w:rPr>
         <w:t>Chọn hosted Qwen 8B cho demo; Qwen 4B self-host chỉ là hướng benchmark khi có dữ liệu và phần cứng phù hợp.</w:t>
       </w:r>
     </w:p>
@@ -718,7 +731,7 @@
           <w:rFonts w:ascii="Arial" w:hAnsi="Arial" w:eastAsia="Arial"/>
           <w:sz w:val="20"/>
         </w:rPr>
-        <w:t>Lợi ích lớn nhất của AI là tăng tốc vòng lặp khám phá và kiểm thử, không phải thay người chịu trách nhiệm. Tôi đã deploy AURA lên SmarterASP.NET tại https://bondphupham-001-site1.ltempurl.com/ và smoke thành công luồng upload, AI extraction và audit sau khi cập nhật API key trong Pool Manager. Lượt Verify production tiếp theo sẽ được dùng làm lượt quay chính thức; phần còn lại là hoàn tất video dưới ba phút và điền đủ ba URL nộp bài. Ảnh upload được gửi qua OpenRouter/provider Qwen; dữ liệu cá nhân thật không được đưa vào Git.</w:t>
+        <w:t>Lợi ích lớn nhất của AI là tăng tốc vòng lặp khám phá và kiểm thử, không phải thay người chịu trách nhiệm. AURA có đường chạy localhost tái lập trong README; bản SmarterASP.NET đã smoke thành công luồng upload, AI extraction và audit sau khi cập nhật API key trong Pool Manager. Gói Sprint 1 đã có video dưới ba phút, năm slide, Build Log, năm ca Verify và mười lăm ca tham chiếu cho BGK. Bước tiếp theo là pilot trên dữ liệu độc lập, đo field accuracy, over escalation, missed escalation và thời gian xử lý trước khi tuyên bố hiệu quả thực tế. Ảnh upload được gửi qua OpenRouter/provider Qwen; dữ liệu cá nhân thật không được đưa vào Git.</w:t>
       </w:r>
     </w:p>
     <w:sectPr>

</xml_diff>

<commit_message>
docs: refresh submission artifacts for provider options
</commit_message>
<xml_diff>
--- a/AURA/submission/AURA_BUILD_LOG.docx
+++ b/AURA/submission/AURA_BUILD_LOG.docx
@@ -34,7 +34,7 @@
           <w:color w:val="555555"/>
           <w:sz w:val="18"/>
         </w:rPr>
-        <w:t>Track A The Escalation Referee | 24 09 2026 | Pham Gia Phu</w:t>
+        <w:t>Track A The Escalation Referee | 26 09 2026 | Pham Gia Phu</w:t>
       </w:r>
     </w:p>
     <w:p>
@@ -530,7 +530,7 @@
                 <w:b/>
                 <w:sz w:val="18"/>
               </w:rPr>
-              <w:t>56 trên 56 pass</w:t>
+              <w:t>60 trên 60 pass</w:t>
             </w:r>
           </w:p>
         </w:tc>
@@ -691,7 +691,7 @@
           <w:rFonts w:ascii="Arial" w:hAnsi="Arial" w:eastAsia="Arial"/>
           <w:sz w:val="20"/>
         </w:rPr>
-        <w:t>Chọn hosted Qwen 8B cho demo; Qwen 4B self-host chỉ là hướng benchmark khi có dữ liệu và phần cứng phù hợp.</w:t>
+        <w:t>Giữ hosted Qwen 8B làm baseline; adapter Ollama/Qwen 4B local tắt mặc định để benchmark trên máy 16 GB.</w:t>
       </w:r>
     </w:p>
     <w:p>

</xml_diff>

<commit_message>
docs: refresh submission evidence artifacts
</commit_message>
<xml_diff>
--- a/AURA/submission/AURA_BUILD_LOG.docx
+++ b/AURA/submission/AURA_BUILD_LOG.docx
@@ -34,7 +34,7 @@
           <w:color w:val="555555"/>
           <w:sz w:val="18"/>
         </w:rPr>
-        <w:t>Track A The Escalation Referee | 26 09 2026 | Pham Gia Phu</w:t>
+        <w:t>Track A The Escalation Referee | 27 09 2026 | Pham Gia Phu</w:t>
       </w:r>
     </w:p>
     <w:p>
@@ -100,7 +100,7 @@
           <w:rFonts w:ascii="Arial" w:hAnsi="Arial" w:eastAsia="Arial"/>
           <w:sz w:val="20"/>
         </w:rPr>
-        <w:t>Prototype đầu tiên dùng Gemini Free Tier nhưng gặp HTTP 429 và quota không ổn định. Khi chuyển sang OpenRouter, một model slug hoặc endpoint sai từng gây HTTP 404; sau đó Qwen có lúc trả JSON lệch schema hoặc xem câu mô tả trên fixture tổng hợp là prompt injection. Các lỗi này dẫn tới ba thay đổi: chuẩn hóa cấu hình provider, parser có giới hạn rõ, và fail-safe sang ESCALATE_SYSTEM_ERROR thay vì cố suy đoán một quyết định.</w:t>
+        <w:t>Prototype đầu tiên dùng Gemini Free Tier nhưng gặp HTTP 429 và quota không ổn định. Khi chuyển sang OpenRouter, một model slug hoặc endpoint sai từng gây HTTP 404; sau đó Qwen có lúc trả JSON lệch schema hoặc xem câu mô tả trên fixture tổng hợp là prompt injection. Ollama 4B còn từng đọc 295.199 VND thành 295.199 theo số thập phân và nhầm đơn giao hàng thành ride-hailing. Các lỗi này dẫn tới cấu hình provider rõ ràng, parser giới hạn, kiểm tra ngữ nghĩa và đúng một lượt đọc lại có mục tiêu; kết quả vẫn mâu thuẫn được chuyển cho người thay vì suy đoán.</w:t>
       </w:r>
     </w:p>
     <w:tbl>
@@ -530,7 +530,7 @@
                 <w:b/>
                 <w:sz w:val="18"/>
               </w:rPr>
-              <w:t>60 trên 60 pass</w:t>
+              <w:t>70 trên 70 pass</w:t>
             </w:r>
           </w:p>
         </w:tc>
@@ -556,7 +556,7 @@
                 <w:b/>
                 <w:sz w:val="18"/>
               </w:rPr>
-              <w:t>5 trên 5 đúng</w:t>
+              <w:t>15 trên 15 fixture</w:t>
             </w:r>
           </w:p>
         </w:tc>
@@ -597,7 +597,7 @@
           <w:rFonts w:ascii="Arial" w:hAnsi="Arial" w:eastAsia="Arial"/>
           <w:sz w:val="20"/>
         </w:rPr>
-        <w:t>Kết quả 5 trên 5 thuộc bộ fixture tổng hợp đã biết trước, nên chỉ chứng minh harness và policy hoạt động nhất quán; nó không phải độ chính xác tổng quát trên hóa đơn thực tế.</w:t>
+        <w:t>Kết quả Ollama 15 trên 15 là ba batch liên tiếp của cùng 5 fixture tổng hợp đã biết trước. Nó chứng minh pipeline, semantic repair và policy hoạt động nhất quán trên bộ kiểm soát, không phải độ chính xác trên hóa đơn thực tế độc lập.</w:t>
       </w:r>
     </w:p>
     <w:p>
@@ -652,7 +652,7 @@
           <w:rFonts w:ascii="Arial" w:hAnsi="Arial" w:eastAsia="Arial"/>
           <w:sz w:val="20"/>
         </w:rPr>
-        <w:t>Tách Qwen extraction khỏi PolicyDecisionEngine để model có thể thay đổi mà không đổi quy tắc duyệt.</w:t>
+        <w:t>Tách Qwen extraction và semantic validation khỏi PolicyDecisionEngine để đổi model mà không đổi quy tắc duyệt.</w:t>
       </w:r>
     </w:p>
     <w:p>
@@ -691,7 +691,7 @@
           <w:rFonts w:ascii="Arial" w:hAnsi="Arial" w:eastAsia="Arial"/>
           <w:sz w:val="20"/>
         </w:rPr>
-        <w:t>Giữ hosted Qwen 8B làm baseline; adapter Ollama/Qwen 4B local tắt mặc định để benchmark trên máy 16 GB.</w:t>
+        <w:t>Giữ hosted Qwen 8B làm baseline; Ollama/Qwen 4B đã đạt 15/15 fixture nhưng vẫn tắt mặc định tới khi có benchmark độc lập.</w:t>
       </w:r>
     </w:p>
     <w:p>

</xml_diff>

<commit_message>
docs: refresh submission benchmark artifacts
</commit_message>
<xml_diff>
--- a/AURA/submission/AURA_BUILD_LOG.docx
+++ b/AURA/submission/AURA_BUILD_LOG.docx
@@ -556,7 +556,7 @@
                 <w:b/>
                 <w:sz w:val="18"/>
               </w:rPr>
-              <w:t>15 trên 15 fixture</w:t>
+              <w:t>25 trên 25 fixture</w:t>
             </w:r>
           </w:p>
         </w:tc>
@@ -597,7 +597,7 @@
           <w:rFonts w:ascii="Arial" w:hAnsi="Arial" w:eastAsia="Arial"/>
           <w:sz w:val="20"/>
         </w:rPr>
-        <w:t>Kết quả Ollama 15 trên 15 là ba batch liên tiếp của cùng 5 fixture tổng hợp đã biết trước. Nó chứng minh pipeline, semantic repair và policy hoạt động nhất quán trên bộ kiểm soát, không phải độ chính xác trên hóa đơn thực tế độc lập.</w:t>
+        <w:t>Kết quả Ollama 25 trên 25 là năm batch liên tiếp của cùng 5 fixture tổng hợp đã biết trước; upload thủ công HoaDon1 đạt AUTO_APPROVE 3 trên 3. Các số liệu chứng minh pipeline, semantic repair và policy hoạt động nhất quán trên bộ kiểm soát, không phải độ chính xác trên hóa đơn thực tế độc lập.</w:t>
       </w:r>
     </w:p>
     <w:p>
@@ -691,7 +691,7 @@
           <w:rFonts w:ascii="Arial" w:hAnsi="Arial" w:eastAsia="Arial"/>
           <w:sz w:val="20"/>
         </w:rPr>
-        <w:t>Giữ hosted Qwen 8B làm baseline; Ollama/Qwen 4B đã đạt 15/15 fixture nhưng vẫn tắt mặc định tới khi có benchmark độc lập.</w:t>
+        <w:t>Giữ hosted Qwen 8B làm baseline; Ollama/Qwen 4B đã đạt 25/25 fixture nhưng vẫn tắt mặc định tới khi có benchmark OpenRouter cùng build và tập độc lập.</w:t>
       </w:r>
     </w:p>
     <w:p>

</xml_diff>

<commit_message>
docs: record OpenRouter benchmark and model decision
</commit_message>
<xml_diff>
--- a/AURA/submission/AURA_BUILD_LOG.docx
+++ b/AURA/submission/AURA_BUILD_LOG.docx
@@ -597,7 +597,7 @@
           <w:rFonts w:ascii="Arial" w:hAnsi="Arial" w:eastAsia="Arial"/>
           <w:sz w:val="20"/>
         </w:rPr>
-        <w:t>Kết quả Ollama 25 trên 25 là năm batch liên tiếp của cùng 5 fixture tổng hợp đã biết trước; upload thủ công HoaDon1 đạt AUTO_APPROVE 3 trên 3. Các số liệu chứng minh pipeline, semantic repair và policy hoạt động nhất quán trên bộ kiểm soát, không phải độ chính xác trên hóa đơn thực tế độc lập.</w:t>
+        <w:t>OpenRouter đạt 15 trên 15 quyết định qua ba batch cùng build, upload HoaDon1 đạt AUTO_APPROVE 3 trên 3 và adjusted P95 là 11,317 giây. Ollama đạt 25 trên 25 nhưng ba batch đo mất khoảng 303–304 giây mỗi batch. Đây là fixture tổng hợp lặp lại, không phải độ chính xác trên hóa đơn thực tế độc lập.</w:t>
       </w:r>
     </w:p>
     <w:p>
@@ -691,7 +691,7 @@
           <w:rFonts w:ascii="Arial" w:hAnsi="Arial" w:eastAsia="Arial"/>
           <w:sz w:val="20"/>
         </w:rPr>
-        <w:t>Giữ hosted Qwen 8B làm baseline; Ollama/Qwen 4B đã đạt 25/25 fixture nhưng vẫn tắt mặc định tới khi có benchmark OpenRouter cùng build và tập độc lập.</w:t>
+        <w:t>Giữ hosted Qwen 8B làm baseline nhờ benchmark cùng build đáp ứng demo; Ollama/Qwen 4B giữ tùy chọn local vì chậm trên RTX 3050 4 GB.</w:t>
       </w:r>
     </w:p>
     <w:p>

</xml_diff>

<commit_message>
docs: align proposal with resilient AI pipeline
</commit_message>
<xml_diff>
--- a/AURA/submission/AURA_BUILD_LOG.docx
+++ b/AURA/submission/AURA_BUILD_LOG.docx
@@ -19,7 +19,7 @@
           <w:color w:val="000000"/>
           <w:sz w:val="36"/>
         </w:rPr>
-        <w:t>AURA BUILD LOG SPRINT 1</w:t>
+        <w:t>AURA BUILD LOG SPRINT 1 VÀ HARDENING</w:t>
       </w:r>
     </w:p>
     <w:p>
@@ -34,7 +34,7 @@
           <w:color w:val="555555"/>
           <w:sz w:val="18"/>
         </w:rPr>
-        <w:t>Track A The Escalation Referee | 27 09 2026 | Pham Gia Phu</w:t>
+        <w:t>Track A The Escalation Referee | 28 09 2026 | Pham Gia Phu</w:t>
       </w:r>
     </w:p>
     <w:p>
@@ -530,7 +530,7 @@
                 <w:b/>
                 <w:sz w:val="18"/>
               </w:rPr>
-              <w:t>70 trên 70 pass</w:t>
+              <w:t>80 trên 80 pass</w:t>
             </w:r>
           </w:p>
         </w:tc>
@@ -624,7 +624,7 @@
           <w:rFonts w:ascii="Arial" w:hAnsi="Arial" w:eastAsia="Arial"/>
           <w:sz w:val="20"/>
         </w:rPr>
-        <w:t>AURA không retry HTTP 429 để tránh đốt thêm quota, chỉ retry tối đa một lần với lỗi 5xx và dừng các ca Verify còn lại khi provider gặp lỗi mang tính hệ thống. Đây chưa phải circuit breaker hoặc exponential backoff nhiều lần; mọi lỗi extraction đều chuyển kiểm tra thủ công và không tạo kết quả PASS giả.</w:t>
+        <w:t>Upload lưu hồ sơ PENDING rồi trả HTTP 202; worker claim job bằng lease nên refresh hoặc restart không làm mất hàng đợi. Fallback OpenRouter sang Ollama mặc định tắt. Khi bật, hệ thống chỉ chuyển một lần cho lỗi hạ tầng đủ điều kiện, mở circuit sau ngưỡng lỗi và ghi provider thực sự phục vụ. Lỗi schema hoặc semantic không được che bằng đổi model.</w:t>
       </w:r>
     </w:p>
     <w:p>
@@ -678,7 +678,20 @@
           <w:rFonts w:ascii="Arial" w:hAnsi="Arial" w:eastAsia="Arial"/>
           <w:sz w:val="20"/>
         </w:rPr>
-        <w:t>Chặn thao tác workflow chồng trong một instance, dùng RowVersion chống ghi đè đồng thời và reload sau mutation để đọc lại trạng thái đã commit.</w:t>
+        <w:t>Dùng DB-backed queue và lease cho upload; giữ gate riêng cho Verify và dùng RowVersion chống ghi đè cùng hồ sơ.</w:t>
+      </w:r>
+    </w:p>
+    <w:p>
+      <w:pPr>
+        <w:pStyle w:val="ListBullet"/>
+        <w:spacing w:after="30" w:line="240" w:lineRule="auto"/>
+      </w:pPr>
+      <w:r>
+        <w:rPr>
+          <w:rFonts w:ascii="Arial" w:hAnsi="Arial" w:eastAsia="Arial"/>
+          <w:sz w:val="20"/>
+        </w:rPr>
+        <w:t>Ghi ngữ cảnh người gửi, provider chính, provider phục vụ, fallback flag và mã lỗi trong hồ sơ/audit.</w:t>
       </w:r>
     </w:p>
     <w:p>
@@ -731,7 +744,7 @@
           <w:rFonts w:ascii="Arial" w:hAnsi="Arial" w:eastAsia="Arial"/>
           <w:sz w:val="20"/>
         </w:rPr>
-        <w:t>Lợi ích lớn nhất của AI là tăng tốc vòng lặp khám phá và kiểm thử, không phải thay người chịu trách nhiệm. AURA có đường chạy localhost tái lập trong README; bản SmarterASP.NET đã smoke thành công luồng upload, AI extraction và audit sau khi cập nhật API key trong Pool Manager. Gói Sprint 1 đã có video dưới ba phút, năm slide, Build Log, năm ca Verify và mười lăm ca tham chiếu cho BGK. Bước tiếp theo là pilot trên dữ liệu độc lập, đo field accuracy, over escalation, missed escalation và thời gian xử lý trước khi tuyên bố hiệu quả thực tế. Ảnh upload được gửi qua OpenRouter/provider Qwen; dữ liệu cá nhân thật không được đưa vào Git.</w:t>
+        <w:t>Lợi ích lớn nhất của AI là tăng tốc vòng lặp khám phá và kiểm thử, không phải thay người chịu trách nhiệm. AURA có đường chạy localhost tái lập trong README. Pipeline mới cần được test lại với OpenRouter, Ollama và năm upload đồng thời trước khi chốt số đo end-to-end. Gói Sprint 1 đã có video dưới ba phút, năm slide, Build Log, năm ca Verify và mười lăm ca tham chiếu cho BGK. Bước tiếp theo là pilot trên dữ liệu độc lập, đo field accuracy, over escalation, missed escalation và thời gian xử lý trước khi tuyên bố hiệu quả thực tế. Ảnh upload được gửi qua OpenRouter/provider Qwen; dữ liệu cá nhân thật không được đưa vào Git.</w:t>
       </w:r>
     </w:p>
     <w:sectPr>

</xml_diff>

<commit_message>
docs: align submission with extended evaluation workflow
</commit_message>
<xml_diff>
--- a/AURA/submission/AURA_BUILD_LOG.docx
+++ b/AURA/submission/AURA_BUILD_LOG.docx
@@ -449,7 +449,7 @@
                 <w:color w:val="FFFFFF"/>
                 <w:sz w:val="17"/>
               </w:rPr>
-              <w:t>Verify v2 local</w:t>
+              <w:t>Dependency</w:t>
             </w:r>
           </w:p>
         </w:tc>
@@ -476,7 +476,7 @@
                 <w:color w:val="FFFFFF"/>
                 <w:sz w:val="17"/>
               </w:rPr>
-              <w:t>Gói BGK</w:t>
+              <w:t>Evaluator</w:t>
             </w:r>
           </w:p>
         </w:tc>
@@ -556,7 +556,7 @@
                 <w:b/>
                 <w:sz w:val="18"/>
               </w:rPr>
-              <w:t>25 trên 25 fixture</w:t>
+              <w:t>Không còn advisory</w:t>
             </w:r>
           </w:p>
         </w:tc>
@@ -582,7 +582,7 @@
                 <w:b/>
                 <w:sz w:val="18"/>
               </w:rPr>
-              <w:t>15 ca đã khóa</w:t>
+              <w:t>15/30 ca ngoài UI</w:t>
             </w:r>
           </w:p>
         </w:tc>
@@ -598,6 +598,11 @@
           <w:sz w:val="20"/>
         </w:rPr>
         <w:t>OpenRouter đạt 15 trên 15 quyết định qua ba batch cùng build, upload HoaDon1 đạt AUTO_APPROVE 3 trên 3 và adjusted P95 là 11,317 giây. Ollama đạt 25 trên 25 nhưng ba batch đo mất khoảng 303–304 giây mỗi batch. Đây là fixture tổng hợp lặp lại, không phải độ chính xác trên hóa đơn thực tế độc lập.</w:t>
+      </w:r>
+    </w:p>
+    <w:p>
+      <w:r>
+        <w:br w:type="page"/>
       </w:r>
     </w:p>
     <w:p>
@@ -624,7 +629,7 @@
           <w:rFonts w:ascii="Arial" w:hAnsi="Arial" w:eastAsia="Arial"/>
           <w:sz w:val="20"/>
         </w:rPr>
-        <w:t>Upload lưu hồ sơ PENDING rồi trả HTTP 202; worker claim job bằng lease nên refresh hoặc restart không làm mất hàng đợi. Fallback OpenRouter sang Ollama mặc định tắt. Khi bật, hệ thống chỉ chuyển một lần cho lỗi hạ tầng đủ điều kiện, mở circuit sau ngưỡng lỗi và ghi provider thực sự phục vụ. Lỗi schema hoặc semantic không được che bằng đổi model.</w:t>
+        <w:t>Upload lưu hồ sơ PENDING rồi trả HTTP 202; worker claim job bằng lease nên refresh hoặc restart không làm mất hàng đợi. Fallback OpenRouter sang Ollama mặc định tắt. Khi bật, hệ thống chỉ chuyển một lần cho lỗi hạ tầng đủ điều kiện, mở circuit sau ngưỡng lỗi và ghi provider thực sự phục vụ. Lỗi schema hoặc semantic không được che bằng đổi model. Readiness trả degraded nếu database hoặc thư mục receipt không sẵn sàng mà không gọi provider. EF Core và dotnet-ef đã được vá đồng bộ lên 8.0.31; vulnerability scan không còn advisory tại lần kiểm tra cuối.</w:t>
       </w:r>
     </w:p>
     <w:p>
@@ -704,6 +709,19 @@
           <w:rFonts w:ascii="Arial" w:hAnsi="Arial" w:eastAsia="Arial"/>
           <w:sz w:val="20"/>
         </w:rPr>
+        <w:t>Giữ Official Verify đúng năm ca; runner ngoài UI chạy gói 15/30 ca qua cùng upload endpoint và xuất evidence CSV/JSON.</w:t>
+      </w:r>
+    </w:p>
+    <w:p>
+      <w:pPr>
+        <w:pStyle w:val="ListBullet"/>
+        <w:spacing w:after="30" w:line="240" w:lineRule="auto"/>
+      </w:pPr>
+      <w:r>
+        <w:rPr>
+          <w:rFonts w:ascii="Arial" w:hAnsi="Arial" w:eastAsia="Arial"/>
+          <w:sz w:val="20"/>
+        </w:rPr>
         <w:t>Giữ hosted Qwen 8B làm baseline nhờ benchmark cùng build đáp ứng demo; Ollama/Qwen 4B giữ tùy chọn local vì chậm trên RTX 3050 4 GB.</w:t>
       </w:r>
     </w:p>
@@ -744,7 +762,7 @@
           <w:rFonts w:ascii="Arial" w:hAnsi="Arial" w:eastAsia="Arial"/>
           <w:sz w:val="20"/>
         </w:rPr>
-        <w:t>Lợi ích lớn nhất của AI là tăng tốc vòng lặp khám phá và kiểm thử, không phải thay người chịu trách nhiệm. AURA có đường chạy localhost tái lập trong README. Pipeline mới cần được test lại với OpenRouter, Ollama và năm upload đồng thời trước khi chốt số đo end-to-end. Gói Sprint 1 đã có video dưới ba phút, năm slide, Build Log, năm ca Verify và mười lăm ca tham chiếu cho BGK. Bước tiếp theo là pilot trên dữ liệu độc lập, đo field accuracy, over escalation, missed escalation và thời gian xử lý trước khi tuyên bố hiệu quả thực tế. Ảnh upload được gửi qua OpenRouter/provider Qwen; dữ liệu cá nhân thật không được đưa vào Git.</w:t>
+        <w:t>Lợi ích lớn nhất của AI là tăng tốc vòng lặp khám phá và kiểm thử, không phải thay người chịu trách nhiệm. AURA có đường chạy localhost tái lập trong README. Pipeline mới cần được test lại với OpenRouter, Ollama và năm upload đồng thời trước khi chốt số đo end-to-end. Gói Sprint 1 đã có video dưới ba phút, năm slide, Build Log, năm ca Verify và runner cho mười lăm hoặc ba mươi ca tham chiếu. Bước tiếp theo là pilot trên dữ liệu độc lập, đo field accuracy, over escalation, missed escalation và thời gian xử lý trước khi tuyên bố hiệu quả thực tế. Ảnh upload được gửi qua OpenRouter/provider Qwen; dữ liệu cá nhân thật không được đưa vào Git.</w:t>
       </w:r>
     </w:p>
     <w:sectPr>

</xml_diff>

<commit_message>
docs: align submission with demo readiness
</commit_message>
<xml_diff>
--- a/AURA/submission/AURA_BUILD_LOG.docx
+++ b/AURA/submission/AURA_BUILD_LOG.docx
@@ -17,7 +17,7 @@
           <w:rFonts w:ascii="Arial" w:hAnsi="Arial" w:eastAsia="Arial"/>
           <w:b/>
           <w:color w:val="000000"/>
-          <w:sz w:val="36"/>
+          <w:sz w:val="32"/>
         </w:rPr>
         <w:t>AURA BUILD LOG SPRINT 1 VÀ HARDENING</w:t>
       </w:r>
@@ -34,7 +34,7 @@
           <w:color w:val="555555"/>
           <w:sz w:val="18"/>
         </w:rPr>
-        <w:t>Track A The Escalation Referee | 28 09 2026 | Pham Gia Phu</w:t>
+        <w:t>Track A The Escalation Referee | 29 09 2026 | Pham Gia Phu</w:t>
       </w:r>
     </w:p>
     <w:p>
@@ -44,9 +44,9 @@
       <w:r>
         <w:rPr>
           <w:rFonts w:ascii="Arial" w:hAnsi="Arial" w:eastAsia="Arial"/>
-          <w:sz w:val="20"/>
+          <w:sz w:val="18"/>
         </w:rPr>
-        <w:t>Trong Sprint 1, tôi dùng AI để rút ngắn thời gian đọc code, thử nghiệm kiến trúc và chuẩn hóa dữ liệu hóa đơn, nhưng giữ quyết định nghiệp vụ trong policy C# có thể kiểm thử. Kết quả là một vertical slice chạy thật từ upload, trích xuất và phân loại đến chuyển quản lý, audit và hoàn tác; các giới hạn của model được hiển thị thay vì che giấu.</w:t>
+        <w:t>Tôi dùng AI để tăng tốc việc đọc code, thử nghiệm kiến trúc và chuẩn hóa dữ liệu hóa đơn, nhưng giữ quyết định nghiệp vụ trong policy C# có thể kiểm thử. AURA chạy trọn luồng từ upload đến quản lý, audit và hoàn tác; lỗi model được chuyển cho con người thay vì tạo kết quả giả.</w:t>
       </w:r>
     </w:p>
     <w:p>
@@ -59,7 +59,7 @@
           <w:rFonts w:ascii="Arial" w:hAnsi="Arial" w:eastAsia="Arial"/>
           <w:b/>
           <w:color w:val="000000"/>
-          <w:sz w:val="23"/>
+          <w:sz w:val="21"/>
         </w:rPr>
         <w:t>1 Công cụ và phạm vi sử dụng</w:t>
       </w:r>
@@ -71,9 +71,9 @@
       <w:r>
         <w:rPr>
           <w:rFonts w:ascii="Arial" w:hAnsi="Arial" w:eastAsia="Arial"/>
-          <w:sz w:val="20"/>
+          <w:sz w:val="18"/>
         </w:rPr>
-        <w:t>Qwen3-VL-8B-Instruct qua OpenRouter đọc một ảnh JPG hoặc PNG và trả dữ kiện theo JSON Schema. Codex hỗ trợ truy route, phát hiện lỗi JavaScript, refactor, viết test và đồng bộ tài liệu. Tôi không dùng output của AI như bằng chứng duy nhất: thay đổi chỉ được giữ lại sau build, test và kiểm tra UI.</w:t>
+        <w:t>Qwen3-VL-8B-Instruct qua OpenRouter đọc một ảnh JPG hoặc PNG và trả dữ kiện theo JSON Schema. Codex hỗ trợ truy route, refactor, viết test và đồng bộ tài liệu. Mọi thay đổi chỉ được giữ sau build, test và kiểm tra UI.</w:t>
       </w:r>
     </w:p>
     <w:p>
@@ -86,7 +86,7 @@
           <w:rFonts w:ascii="Arial" w:hAnsi="Arial" w:eastAsia="Arial"/>
           <w:b/>
           <w:color w:val="000000"/>
-          <w:sz w:val="23"/>
+          <w:sz w:val="21"/>
         </w:rPr>
         <w:t>2 Hành trình xây dựng và các lần AI sai</w:t>
       </w:r>
@@ -98,9 +98,9 @@
       <w:r>
         <w:rPr>
           <w:rFonts w:ascii="Arial" w:hAnsi="Arial" w:eastAsia="Arial"/>
-          <w:sz w:val="20"/>
+          <w:sz w:val="18"/>
         </w:rPr>
-        <w:t>Prototype đầu tiên dùng Gemini Free Tier nhưng gặp HTTP 429 và quota không ổn định. Khi chuyển sang OpenRouter, một model slug hoặc endpoint sai từng gây HTTP 404; sau đó Qwen có lúc trả JSON lệch schema hoặc xem câu mô tả trên fixture tổng hợp là prompt injection. Ollama 4B còn từng đọc 295.199 VND thành 295.199 theo số thập phân và nhầm đơn giao hàng thành ride-hailing. Các lỗi này dẫn tới cấu hình provider rõ ràng, parser giới hạn, kiểm tra ngữ nghĩa và đúng một lượt đọc lại có mục tiêu; kết quả vẫn mâu thuẫn được chuyển cho người thay vì suy đoán.</w:t>
+        <w:t>Gemini Free Tier từng gặp 429; model slug sai gây 404; Qwen có lúc trả JSON lệch schema hoặc đọc 295.199 VND sai đơn vị. Các lỗi này dẫn tới cấu hình provider rõ ràng, parser giới hạn, semantic validation và đúng một lượt repair. Kết quả còn mâu thuẫn luôn chuyển người xử lý.</w:t>
       </w:r>
     </w:p>
     <w:tbl>
@@ -282,58 +282,6 @@
           </w:p>
         </w:tc>
       </w:tr>
-      <w:tr>
-        <w:tc>
-          <w:tcPr>
-            <w:tcW w:type="dxa" w:w="5046"/>
-            <w:shd w:fill="EAF2F8"/>
-            <w:tcMar>
-              <w:top w:w="85" w:type="dxa"/>
-              <w:start w:w="115" w:type="dxa"/>
-              <w:bottom w:w="85" w:type="dxa"/>
-              <w:end w:w="115" w:type="dxa"/>
-            </w:tcMar>
-            <w:vAlign w:val="center"/>
-          </w:tcPr>
-          <w:p>
-            <w:pPr>
-              <w:spacing w:after="0"/>
-            </w:pPr>
-            <w:r>
-              <w:rPr>
-                <w:rFonts w:ascii="Arial" w:hAnsi="Arial" w:eastAsia="Arial"/>
-                <w:sz w:val="18"/>
-              </w:rPr>
-              <w:t>Đối chiếu prompt, UI và tài liệu sau mỗi thay đổi.</w:t>
-            </w:r>
-          </w:p>
-        </w:tc>
-        <w:tc>
-          <w:tcPr>
-            <w:tcW w:type="dxa" w:w="5046"/>
-            <w:shd w:fill="EAF2F8"/>
-            <w:tcMar>
-              <w:top w:w="85" w:type="dxa"/>
-              <w:start w:w="115" w:type="dxa"/>
-              <w:bottom w:w="85" w:type="dxa"/>
-              <w:end w:w="115" w:type="dxa"/>
-            </w:tcMar>
-            <w:vAlign w:val="center"/>
-          </w:tcPr>
-          <w:p>
-            <w:pPr>
-              <w:spacing w:after="0"/>
-            </w:pPr>
-            <w:r>
-              <w:rPr>
-                <w:rFonts w:ascii="Arial" w:hAnsi="Arial" w:eastAsia="Arial"/>
-                <w:sz w:val="18"/>
-              </w:rPr>
-              <w:t>Tài liệu dễ tuyên bố quá mức nếu không đọc lại code thực tế.</w:t>
-            </w:r>
-          </w:p>
-        </w:tc>
-      </w:tr>
     </w:tbl>
     <w:p>
       <w:pPr>
@@ -345,7 +293,7 @@
           <w:rFonts w:ascii="Arial" w:hAnsi="Arial" w:eastAsia="Arial"/>
           <w:b/>
           <w:color w:val="000000"/>
-          <w:sz w:val="23"/>
+          <w:sz w:val="21"/>
         </w:rPr>
         <w:t>3 Bằng chứng kiểm thử</w:t>
       </w:r>
@@ -530,7 +478,7 @@
                 <w:b/>
                 <w:sz w:val="18"/>
               </w:rPr>
-              <w:t>80 trên 80 pass</w:t>
+              <w:t>88 trên 88 pass</w:t>
             </w:r>
           </w:p>
         </w:tc>
@@ -582,7 +530,7 @@
                 <w:b/>
                 <w:sz w:val="18"/>
               </w:rPr>
-              <w:t>15/30 ca ngoài UI</w:t>
+              <w:t>15 ca đã chạy thật</w:t>
             </w:r>
           </w:p>
         </w:tc>
@@ -595,14 +543,17 @@
       <w:r>
         <w:rPr>
           <w:rFonts w:ascii="Arial" w:hAnsi="Arial" w:eastAsia="Arial"/>
-          <w:sz w:val="20"/>
+          <w:b/>
+          <w:sz w:val="18"/>
         </w:rPr>
-        <w:t>OpenRouter đạt 15 trên 15 quyết định qua ba batch cùng build, upload HoaDon1 đạt AUTO_APPROVE 3 trên 3 và adjusted P95 là 11,317 giây. Ollama đạt 25 trên 25 nhưng ba batch đo mất khoảng 303–304 giây mỗi batch. Đây là fixture tổng hợp lặp lại, không phải độ chính xác trên hóa đơn thực tế độc lập.</w:t>
+        <w:t xml:space="preserve">Kết luận đo lường: </w:t>
       </w:r>
-    </w:p>
-    <w:p>
       <w:r>
-        <w:br w:type="page"/>
+        <w:rPr>
+          <w:rFonts w:ascii="Arial" w:hAnsi="Arial" w:eastAsia="Arial"/>
+          <w:sz w:val="18"/>
+        </w:rPr>
+        <w:t>Trên cùng judge set 15 ca và fallback tắt, OpenRouter đạt 15 trên 15 quyết định, 70 trên 75 field và P95 16,459 giây. Ollama đạt 14 trên 15, 73 trên 75 field và P95 58,318 giây, đồng thời bỏ sót escalation TK-12. Đây là regression tổng hợp, không phải accuracy trên hóa đơn thật.</w:t>
       </w:r>
     </w:p>
     <w:p>
@@ -615,7 +566,7 @@
           <w:rFonts w:ascii="Arial" w:hAnsi="Arial" w:eastAsia="Arial"/>
           <w:b/>
           <w:color w:val="000000"/>
-          <w:sz w:val="23"/>
+          <w:sz w:val="21"/>
         </w:rPr>
         <w:t>4 Cơ chế fail safe đã triển khai</w:t>
       </w:r>
@@ -627,9 +578,9 @@
       <w:r>
         <w:rPr>
           <w:rFonts w:ascii="Arial" w:hAnsi="Arial" w:eastAsia="Arial"/>
-          <w:sz w:val="20"/>
+          <w:sz w:val="18"/>
         </w:rPr>
-        <w:t>Upload lưu hồ sơ PENDING rồi trả HTTP 202; worker claim job bằng lease nên refresh hoặc restart không làm mất hàng đợi. Fallback OpenRouter sang Ollama mặc định tắt. Khi bật, hệ thống chỉ chuyển một lần cho lỗi hạ tầng đủ điều kiện, mở circuit sau ngưỡng lỗi và ghi provider thực sự phục vụ. Lỗi schema hoặc semantic không được che bằng đổi model. Readiness trả degraded nếu database hoặc thư mục receipt không sẵn sàng mà không gọi provider. EF Core và dotnet-ef đã được vá đồng bộ lên 8.0.31; vulnerability scan không còn advisory tại lần kiểm tra cuối.</w:t>
+        <w:t>Upload lưu PENDING rồi trả HTTP 202; worker claim bằng lease nên refresh hoặc restart không làm mất job. Worker backoff 5 đến 60 giây khi SQL tạm lỗi. Fallback mặc định tắt và chỉ chuyển một lần cho lỗi hạ tầng đủ điều kiện. `/healthz` kiểm database, migration, storage, policy và cấu hình AI mà không gọi provider.</w:t>
       </w:r>
     </w:p>
     <w:p>
@@ -642,7 +593,7 @@
           <w:rFonts w:ascii="Arial" w:hAnsi="Arial" w:eastAsia="Arial"/>
           <w:b/>
           <w:color w:val="000000"/>
-          <w:sz w:val="23"/>
+          <w:sz w:val="21"/>
         </w:rPr>
         <w:t>5 Quyết định kiến trúc và phần cắt giảm</w:t>
       </w:r>
@@ -655,9 +606,9 @@
       <w:r>
         <w:rPr>
           <w:rFonts w:ascii="Arial" w:hAnsi="Arial" w:eastAsia="Arial"/>
-          <w:sz w:val="20"/>
+          <w:sz w:val="18"/>
         </w:rPr>
-        <w:t>Tách Qwen extraction và semantic validation khỏi PolicyDecisionEngine để đổi model mà không đổi quy tắc duyệt.</w:t>
+        <w:t>Tách extraction, semantic validation và PolicyDecisionEngine để đổi model mà không đổi luật duyệt.</w:t>
       </w:r>
     </w:p>
     <w:p>
@@ -668,9 +619,9 @@
       <w:r>
         <w:rPr>
           <w:rFonts w:ascii="Arial" w:hAnsi="Arial" w:eastAsia="Arial"/>
-          <w:sz w:val="20"/>
+          <w:sz w:val="18"/>
         </w:rPr>
-        <w:t>Giữ AuditLogs theo sự kiện append-only ở tầng ứng dụng, nhưng UI gom một hồ sơ thành một timeline để tránh cảm giác lặp.</w:t>
+        <w:t>Giữ Official Verify đúng năm ca; evaluator 15/30 nằm ngoài UI và đi qua cùng production endpoint.</w:t>
       </w:r>
     </w:p>
     <w:p>
@@ -681,9 +632,9 @@
       <w:r>
         <w:rPr>
           <w:rFonts w:ascii="Arial" w:hAnsi="Arial" w:eastAsia="Arial"/>
-          <w:sz w:val="20"/>
+          <w:sz w:val="18"/>
         </w:rPr>
-        <w:t>Dùng DB-backed queue và lease cho upload; giữ gate riêng cho Verify và dùng RowVersion chống ghi đè cùng hồ sơ.</w:t>
+        <w:t>Chọn OpenRouter làm primary; giữ Ollama cho offline/manual vì còn missed escalation và chậm trên RTX 3050 4 GB.</w:t>
       </w:r>
     </w:p>
     <w:p>
@@ -694,48 +645,9 @@
       <w:r>
         <w:rPr>
           <w:rFonts w:ascii="Arial" w:hAnsi="Arial" w:eastAsia="Arial"/>
-          <w:sz w:val="20"/>
+          <w:sz w:val="18"/>
         </w:rPr>
-        <w:t>Ghi ngữ cảnh người gửi, provider chính, provider phục vụ, fallback flag và mã lỗi trong hồ sơ/audit.</w:t>
-      </w:r>
-    </w:p>
-    <w:p>
-      <w:pPr>
-        <w:pStyle w:val="ListBullet"/>
-        <w:spacing w:after="30" w:line="240" w:lineRule="auto"/>
-      </w:pPr>
-      <w:r>
-        <w:rPr>
-          <w:rFonts w:ascii="Arial" w:hAnsi="Arial" w:eastAsia="Arial"/>
-          <w:sz w:val="20"/>
-        </w:rPr>
-        <w:t>Giữ Official Verify đúng năm ca; runner ngoài UI chạy gói 15/30 ca qua cùng upload endpoint và xuất evidence CSV/JSON.</w:t>
-      </w:r>
-    </w:p>
-    <w:p>
-      <w:pPr>
-        <w:pStyle w:val="ListBullet"/>
-        <w:spacing w:after="30" w:line="240" w:lineRule="auto"/>
-      </w:pPr>
-      <w:r>
-        <w:rPr>
-          <w:rFonts w:ascii="Arial" w:hAnsi="Arial" w:eastAsia="Arial"/>
-          <w:sz w:val="20"/>
-        </w:rPr>
-        <w:t>Giữ hosted Qwen 8B làm baseline nhờ benchmark cùng build đáp ứng demo; Ollama/Qwen 4B giữ tùy chọn local vì chậm trên RTX 3050 4 GB.</w:t>
-      </w:r>
-    </w:p>
-    <w:p>
-      <w:pPr>
-        <w:pStyle w:val="ListBullet"/>
-        <w:spacing w:after="30" w:line="240" w:lineRule="auto"/>
-      </w:pPr>
-      <w:r>
-        <w:rPr>
-          <w:rFonts w:ascii="Arial" w:hAnsi="Arial" w:eastAsia="Arial"/>
-          <w:sz w:val="20"/>
-        </w:rPr>
-        <w:t>Hoãn PDF nhiều trang, authentication theo role, tax lookup, antivirus, object storage và benchmark tập dữ liệu độc lập.</w:t>
+        <w:t>Hoãn PDF nhiều trang, authentication, tax lookup, antivirus và object storage sang scope production.</w:t>
       </w:r>
     </w:p>
     <w:p>
@@ -748,7 +660,7 @@
           <w:rFonts w:ascii="Arial" w:hAnsi="Arial" w:eastAsia="Arial"/>
           <w:b/>
           <w:color w:val="000000"/>
-          <w:sz w:val="23"/>
+          <w:sz w:val="21"/>
         </w:rPr>
         <w:t>6 Bài học và bước tiếp theo</w:t>
       </w:r>
@@ -760,9 +672,9 @@
       <w:r>
         <w:rPr>
           <w:rFonts w:ascii="Arial" w:hAnsi="Arial" w:eastAsia="Arial"/>
-          <w:sz w:val="20"/>
+          <w:sz w:val="18"/>
         </w:rPr>
-        <w:t>Lợi ích lớn nhất của AI là tăng tốc vòng lặp khám phá và kiểm thử, không phải thay người chịu trách nhiệm. AURA có đường chạy localhost tái lập trong README. Pipeline mới cần được test lại với OpenRouter, Ollama và năm upload đồng thời trước khi chốt số đo end-to-end. Gói Sprint 1 đã có video dưới ba phút, năm slide, Build Log, năm ca Verify và runner cho mười lăm hoặc ba mươi ca tham chiếu. Bước tiếp theo là pilot trên dữ liệu độc lập, đo field accuracy, over escalation, missed escalation và thời gian xử lý trước khi tuyên bố hiệu quả thực tế. Ảnh upload được gửi qua OpenRouter/provider Qwen; dữ liệu cá nhân thật không được đưa vào Git.</w:t>
+        <w:t>Core workflow đã sẵn sàng để diễn tập. Các cổng còn mở là smoke Live URL sau hardening, holdout 10 đến 15 hóa đơn đã ẩn danh, phản hồi của ba người dùng và ba lượt Verify dưới 90 giây. Dữ liệu cá nhân thật không được đưa vào Git.</w:t>
       </w:r>
     </w:p>
     <w:sectPr>
@@ -1140,7 +1052,7 @@
     <w:rsid w:val="00FC693F"/>
     <w:rPr>
       <w:rFonts w:ascii="Arial" w:hAnsi="Arial" w:eastAsia="Arial"/>
-      <w:sz w:val="20"/>
+      <w:sz w:val="18"/>
     </w:rPr>
   </w:style>
   <w:style w:type="paragraph" w:styleId="Header">

</xml_diff>

<commit_message>
docs: sync hardening evidence and cloud plan
</commit_message>
<xml_diff>
--- a/AURA/submission/AURA_BUILD_LOG.docx
+++ b/AURA/submission/AURA_BUILD_LOG.docx
@@ -34,7 +34,7 @@
           <w:color w:val="555555"/>
           <w:sz w:val="18"/>
         </w:rPr>
-        <w:t>Track A The Escalation Referee | 29 09 2026 | Pham Gia Phu</w:t>
+        <w:t>Track A The Escalation Referee | 30 09 2026 | Pham Gia Phu</w:t>
       </w:r>
     </w:p>
     <w:p>
@@ -478,7 +478,7 @@
                 <w:b/>
                 <w:sz w:val="18"/>
               </w:rPr>
-              <w:t>88 trên 88 pass</w:t>
+              <w:t>93 trên 93 pass</w:t>
             </w:r>
           </w:p>
         </w:tc>
@@ -504,7 +504,7 @@
                 <w:b/>
                 <w:sz w:val="18"/>
               </w:rPr>
-              <w:t>Không còn advisory</w:t>
+              <w:t>Không có advisory</w:t>
             </w:r>
           </w:p>
         </w:tc>
@@ -585,6 +585,18 @@
     </w:p>
     <w:p>
       <w:pPr>
+        <w:spacing w:after="50" w:line="247" w:lineRule="auto"/>
+      </w:pPr>
+      <w:r>
+        <w:rPr>
+          <w:rFonts w:ascii="Arial" w:hAnsi="Arial" w:eastAsia="Arial"/>
+          <w:sz w:val="18"/>
+        </w:rPr>
+        <w:t>Contract ngày 30/09 tách số hóa đơn, số biên nhận và mã giao dịch. Check/Trace/RRN chỉ được dùng khi là mã riêng của lần mua; ShopID, POS, MID/TID và pager không thay thế định danh. Nếu FACT và POLICY cùng tồn tại, FACT vẫn là trạng thái chính nhưng lý do giữ policy finding thứ cấp để quản lý không bỏ sót.</w:t>
+      </w:r>
+    </w:p>
+    <w:p>
+      <w:pPr>
         <w:keepNext/>
         <w:spacing w:before="100" w:after="30"/>
       </w:pPr>
@@ -648,6 +660,19 @@
           <w:sz w:val="18"/>
         </w:rPr>
         <w:t>Hoãn PDF nhiều trang, authentication, tax lookup, antivirus và object storage sang scope production.</w:t>
+      </w:r>
+    </w:p>
+    <w:p>
+      <w:pPr>
+        <w:pStyle w:val="ListBullet"/>
+        <w:spacing w:after="30" w:line="240" w:lineRule="auto"/>
+      </w:pPr>
+      <w:r>
+        <w:rPr>
+          <w:rFonts w:ascii="Arial" w:hAnsi="Arial" w:eastAsia="Arial"/>
+          <w:sz w:val="18"/>
+        </w:rPr>
+        <w:t>Giữ EF Core 8.0.31: NuGet không báo advisory; không nâng major .NET/EF sát ngày chốt.</w:t>
       </w:r>
     </w:p>
     <w:p>

</xml_diff>

<commit_message>
feat: reconcile receipt discounts with final payable amount
</commit_message>
<xml_diff>
--- a/AURA/submission/AURA_BUILD_LOG.docx
+++ b/AURA/submission/AURA_BUILD_LOG.docx
@@ -34,7 +34,7 @@
           <w:color w:val="555555"/>
           <w:sz w:val="18"/>
         </w:rPr>
-        <w:t>Track A The Escalation Referee | 30 09 2026 | Pham Gia Phu</w:t>
+        <w:t>Track A The Escalation Referee | 01 10 2026 | Pham Gia Phu</w:t>
       </w:r>
     </w:p>
     <w:p>
@@ -100,7 +100,7 @@
           <w:rFonts w:ascii="Arial" w:hAnsi="Arial" w:eastAsia="Arial"/>
           <w:sz w:val="18"/>
         </w:rPr>
-        <w:t>Gemini Free Tier từng gặp 429; model slug sai gây 404; Qwen có lúc trả JSON lệch schema hoặc đọc 295.199 VND sai đơn vị. Các lỗi này dẫn tới cấu hình provider rõ ràng, parser giới hạn, semantic validation và đúng một lượt repair. Kết quả còn mâu thuẫn luôn chuyển người xử lý.</w:t>
+        <w:t>Gemini Free Tier từng gặp 429; model slug sai gây 404; Qwen có lúc trả JSON lệch schema hoặc đọc 295.199 VND sai đơn vị. Ca Vinamilk đọc đúng 183.114 trừ 2.828 bằng 180.286 nhưng schema cũ không có trường giảm giá. Các lỗi này dẫn tới cấu hình provider rõ ràng, parser giới hạn, discountAmount có cấu trúc, semantic validation và đúng một lượt repair. Kết quả còn mâu thuẫn luôn chuyển người xử lý.</w:t>
       </w:r>
     </w:p>
     <w:tbl>
@@ -478,7 +478,7 @@
                 <w:b/>
                 <w:sz w:val="18"/>
               </w:rPr>
-              <w:t>93 trên 93 pass</w:t>
+              <w:t>100 trên 100 pass</w:t>
             </w:r>
           </w:p>
         </w:tc>
@@ -593,6 +593,18 @@
           <w:sz w:val="18"/>
         </w:rPr>
         <w:t>Contract ngày 30/09 tách số hóa đơn, số biên nhận và mã giao dịch. Check/Trace/RRN chỉ được dùng khi là mã riêng của lần mua; ShopID, POS, MID/TID và pager không thay thế định danh. Nếu FACT và POLICY cùng tồn tại, FACT vẫn là trạng thái chính nhưng lý do giữ policy finding thứ cấp để quản lý không bỏ sót.</w:t>
+      </w:r>
+    </w:p>
+    <w:p>
+      <w:pPr>
+        <w:spacing w:after="50" w:line="247" w:lineRule="auto"/>
+      </w:pPr>
+      <w:r>
+        <w:rPr>
+          <w:rFonts w:ascii="Arial" w:hAnsi="Arial" w:eastAsia="Arial"/>
+          <w:sz w:val="18"/>
+        </w:rPr>
+        <w:t>Contract ngày 01/10 thêm discountAmount cho khoản giảm được in rõ. Backend đối chiếu subtotal cộng thuế trừ giảm giá với tổng thanh toán, không suy ra từ claimed amount và không cho keyword trong warning bỏ qua arithmetic. Vì vậy số nhân viên khai được so với số thực trả sau giảm; mâu thuẫn còn lại vẫn đi ESCALATE_FACT.</w:t>
       </w:r>
     </w:p>
     <w:p>

</xml_diff>

<commit_message>
docs: sync demo baseline and judge setup
</commit_message>
<xml_diff>
--- a/AURA/submission/AURA_BUILD_LOG.docx
+++ b/AURA/submission/AURA_BUILD_LOG.docx
@@ -34,7 +34,7 @@
           <w:color w:val="555555"/>
           <w:sz w:val="18"/>
         </w:rPr>
-        <w:t>Track A The Escalation Referee | 01 10 2026 | Pham Gia Phu</w:t>
+        <w:t>Track A The Escalation Referee | 02 10 2026 | Pham Gia Phu</w:t>
       </w:r>
     </w:p>
     <w:p>
@@ -546,14 +546,7 @@
           <w:b/>
           <w:sz w:val="18"/>
         </w:rPr>
-        <w:t xml:space="preserve">Kết luận đo lường: </w:t>
-      </w:r>
-      <w:r>
-        <w:rPr>
-          <w:rFonts w:ascii="Arial" w:hAnsi="Arial" w:eastAsia="Arial"/>
-          <w:sz w:val="18"/>
-        </w:rPr>
-        <w:t>Trên cùng judge set 15 ca và fallback tắt, OpenRouter đạt 15 trên 15 quyết định, 70 trên 75 field và P95 16,459 giây. Ollama đạt 14 trên 15, 73 trên 75 field và P95 58,318 giây, đồng thời bỏ sót escalation TK-12. Đây là regression tổng hợp, không phải accuracy trên hóa đơn thật.</w:t>
+        <w:t>Kết luận đo lường: Judge set tổng hợp giữ OpenRouter ở 15/15 quyết định và Ollama ở 14/15 với missed escalation TK-12. Live gate ngày 02/10 đạt Phê La FACT, Vinamilk AUTO, Verify 5/5, restart pass và concurrent smoke 5/5 với P95 39,380 giây. Đây là regression evidence, không phải accuracy production.</w:t>
       </w:r>
     </w:p>
     <w:p>
@@ -576,11 +569,7 @@
         <w:spacing w:after="50" w:line="247" w:lineRule="auto"/>
       </w:pPr>
       <w:r>
-        <w:rPr>
-          <w:rFonts w:ascii="Arial" w:hAnsi="Arial" w:eastAsia="Arial"/>
-          <w:sz w:val="18"/>
-        </w:rPr>
-        <w:t>Upload lưu PENDING rồi trả HTTP 202; worker claim bằng lease nên refresh hoặc restart không làm mất job. Worker backoff 5 đến 60 giây khi SQL tạm lỗi. Fallback mặc định tắt và chỉ chuyển một lần cho lỗi hạ tầng đủ điều kiện. `/healthz` kiểm database, migration, storage, policy và cấu hình AI mà không gọi provider.</w:t>
+        <w:t>Upload lưu PENDING rồi trả HTTP 202; worker claim bằng lease nên refresh hoặc restart không làm mất job. Worker backoff 5 đến 60 giây khi SQL tạm lỗi. Fallback mặc định tắt và chỉ chuyển một lần cho lỗi hạ tầng đủ điều kiện. /healthz kiểm database, migration, storage, policy và cấu hình AI mà không gọi provider.</w:t>
       </w:r>
     </w:p>
     <w:p>
@@ -600,11 +589,7 @@
         <w:spacing w:after="50" w:line="247" w:lineRule="auto"/>
       </w:pPr>
       <w:r>
-        <w:rPr>
-          <w:rFonts w:ascii="Arial" w:hAnsi="Arial" w:eastAsia="Arial"/>
-          <w:sz w:val="18"/>
-        </w:rPr>
-        <w:t>Contract ngày 01/10 thêm discountAmount cho khoản giảm được in rõ. Backend đối chiếu subtotal cộng thuế trừ giảm giá với tổng thanh toán, không suy ra từ claimed amount và không cho keyword trong warning bỏ qua arithmetic. Vì vậy số nhân viên khai được so với số thực trả sau giảm; mâu thuẫn còn lại vẫn đi ESCALATE_FACT.</w:t>
+        <w:t>Contract ngày 01-02/10 thêm discountAmount, chuẩn hóa ngày receipt và guard dòng hàng. Backend đối chiếu tổng sau giảm; lineItems=[] trên hóa đơn giấy buộc repair một lần rồi FACT, có missing field/warning và confidence tối đa 0,69. Ca rõ ràng như Vinamilk vẫn AUTO_APPROVE.</w:t>
       </w:r>
     </w:p>
     <w:p>
@@ -711,7 +696,7 @@
           <w:rFonts w:ascii="Arial" w:hAnsi="Arial" w:eastAsia="Arial"/>
           <w:sz w:val="18"/>
         </w:rPr>
-        <w:t>Core workflow đã sẵn sàng để diễn tập. Các cổng còn mở là smoke Live URL sau hardening, holdout 10 đến 15 hóa đơn đã ẩn danh, phản hồi của ba người dùng và ba lượt Verify dưới 90 giây. Dữ liệu cá nhân thật không được đưa vào Git.</w:t>
+        <w:t>Core workflow đã sẵn sàng để diễn tập. Cổng còn mở là ba dress rehearsal dưới 90 giây, holdout 10-15 hóa đơn đã ẩn danh, phản hồi ba người dùng và smoke Live URL nếu còn sử dụng. Dữ liệu cá nhân thật không được đưa vào Git.</w:t>
       </w:r>
     </w:p>
     <w:sectPr>

</xml_diff>

<commit_message>
docs: sync final evidence and holdout guidance
</commit_message>
<xml_diff>
--- a/AURA/submission/AURA_BUILD_LOG.docx
+++ b/AURA/submission/AURA_BUILD_LOG.docx
@@ -34,7 +34,7 @@
           <w:color w:val="555555"/>
           <w:sz w:val="18"/>
         </w:rPr>
-        <w:t>Track A The Escalation Referee | 02 10 2026 | Pham Gia Phu</w:t>
+        <w:t>Track A The Escalation Referee | 05 10 2026 | Pham Gia Phu</w:t>
       </w:r>
     </w:p>
     <w:p>
@@ -478,7 +478,7 @@
                 <w:b/>
                 <w:sz w:val="18"/>
               </w:rPr>
-              <w:t>102 trên 102 pass</w:t>
+              <w:t>108 trên 108 pass</w:t>
             </w:r>
           </w:p>
         </w:tc>
@@ -504,7 +504,7 @@
                 <w:b/>
                 <w:sz w:val="18"/>
               </w:rPr>
-              <w:t>Không có advisory</w:t>
+              <w:t>EF model sạch</w:t>
             </w:r>
           </w:p>
         </w:tc>
@@ -530,7 +530,7 @@
                 <w:b/>
                 <w:sz w:val="18"/>
               </w:rPr>
-              <w:t>15 ca đã chạy thật</w:t>
+              <w:t>Verify live 5 trên 5</w:t>
             </w:r>
           </w:p>
         </w:tc>
@@ -546,7 +546,14 @@
           <w:b/>
           <w:sz w:val="18"/>
         </w:rPr>
-        <w:t>Kết luận đo lường: Judge set tổng hợp giữ OpenRouter ở 15/15 quyết định và Ollama ở 14/15 với missed escalation TK-12. Live gate ngày 02/10 đạt Phê La FACT, Vinamilk AUTO, Verify 5/5, restart pass và concurrent smoke 5/5 với P95 39,380 giây. Đây là regression evidence, không phải accuracy production.</w:t>
+        <w:t xml:space="preserve">Kết luận đo lường: </w:t>
+      </w:r>
+      <w:r>
+        <w:rPr>
+          <w:rFonts w:ascii="Arial" w:hAnsi="Arial" w:eastAsia="Arial"/>
+          <w:sz w:val="18"/>
+        </w:rPr>
+        <w:t>Trên cùng judge set 15 ca và fallback tắt, OpenRouter đạt 15 trên 15 quyết định, 70 trên 75 field và P95 16,459 giây. Ollama đạt 14 trên 15, 73 trên 75 field và P95 58,318 giây, đồng thời bỏ sót escalation TK-12. Đây là regression tổng hợp, không phải accuracy trên hóa đơn thật.</w:t>
       </w:r>
     </w:p>
     <w:p>
@@ -569,7 +576,11 @@
         <w:spacing w:after="50" w:line="247" w:lineRule="auto"/>
       </w:pPr>
       <w:r>
-        <w:t>Upload lưu PENDING rồi trả HTTP 202; worker claim bằng lease nên refresh hoặc restart không làm mất job. Worker backoff 5 đến 60 giây khi SQL tạm lỗi. Fallback mặc định tắt và chỉ chuyển một lần cho lỗi hạ tầng đủ điều kiện. /healthz kiểm database, migration, storage, policy và cấu hình AI mà không gọi provider.</w:t>
+        <w:rPr>
+          <w:rFonts w:ascii="Arial" w:hAnsi="Arial" w:eastAsia="Arial"/>
+          <w:sz w:val="18"/>
+        </w:rPr>
+        <w:t>Upload lưu PENDING rồi trả HTTP 202; worker claim bằng lease nên refresh hoặc restart không làm mất job. Worker backoff 5 đến 60 giây khi SQL tạm lỗi. Fallback mặc định tắt và chỉ chuyển một lần cho lỗi hạ tầng đủ điều kiện. `/healthz` kiểm database, migration, storage, policy và cấu hình AI mà không gọi provider.</w:t>
       </w:r>
     </w:p>
     <w:p>
@@ -589,7 +600,11 @@
         <w:spacing w:after="50" w:line="247" w:lineRule="auto"/>
       </w:pPr>
       <w:r>
-        <w:t>Contract ngày 01-02/10 thêm discountAmount, chuẩn hóa ngày receipt và guard dòng hàng. Backend đối chiếu tổng sau giảm; lineItems=[] trên hóa đơn giấy buộc repair một lần rồi FACT, có missing field/warning và confidence tối đa 0,69. Ca rõ ràng như Vinamilk vẫn AUTO_APPROVE.</w:t>
+        <w:rPr>
+          <w:rFonts w:ascii="Arial" w:hAnsi="Arial" w:eastAsia="Arial"/>
+          <w:sz w:val="18"/>
+        </w:rPr>
+        <w:t>Contract ngày 01/10 thêm discountAmount cho khoản giảm được in rõ. Backend đối chiếu subtotal cộng thuế trừ giảm giá với tổng thanh toán, không suy ra từ claimed amount và không cho keyword trong warning bỏ qua arithmetic. Vì vậy số nhân viên khai được so với số thực trả sau giảm; mâu thuẫn còn lại vẫn đi ESCALATE_FACT.</w:t>
       </w:r>
     </w:p>
     <w:p>
@@ -696,7 +711,7 @@
           <w:rFonts w:ascii="Arial" w:hAnsi="Arial" w:eastAsia="Arial"/>
           <w:sz w:val="18"/>
         </w:rPr>
-        <w:t>Core workflow đã sẵn sàng để diễn tập. Cổng còn mở là ba dress rehearsal dưới 90 giây, holdout 10-15 hóa đơn đã ẩn danh, phản hồi ba người dùng và smoke Live URL nếu còn sử dụng. Dữ liệu cá nhân thật không được đưa vào Git.</w:t>
+        <w:t>Deployment postfix c42c5ef đã pass health, security, AUTO/FACT smoke, Verify 5 trên 5, human workflow, persistence và concurrency 2 cộng 5 request. Các cổng còn mở là blind holdout đúng 15 ca đã khóa trước request đầu tiên, phản hồi của ba người dùng, manual mobile/4G/no-flash và ba dress rehearsal. Dữ liệu cá nhân thật không được đưa vào Git.</w:t>
       </w:r>
     </w:p>
     <w:sectPr>

</xml_diff>

<commit_message>
docs: sync live post-holdout evidence and proposal
</commit_message>
<xml_diff>
--- a/AURA/submission/AURA_BUILD_LOG.docx
+++ b/AURA/submission/AURA_BUILD_LOG.docx
@@ -19,7 +19,7 @@
           <w:color w:val="000000"/>
           <w:sz w:val="32"/>
         </w:rPr>
-        <w:t>AURA BUILD LOG SPRINT 1 VÀ HARDENING</w:t>
+        <w:t>AURA BUILD LOG SPRINT 2 VÀ HARDENING</w:t>
       </w:r>
     </w:p>
     <w:p>
@@ -34,7 +34,7 @@
           <w:color w:val="555555"/>
           <w:sz w:val="18"/>
         </w:rPr>
-        <w:t>Track A The Escalation Referee | 05 10 2026 | Pham Gia Phu</w:t>
+        <w:t>Track A The Escalation Referee | 06 10 2026 | Pham Gia Phu</w:t>
       </w:r>
     </w:p>
     <w:p>
@@ -478,7 +478,7 @@
                 <w:b/>
                 <w:sz w:val="18"/>
               </w:rPr>
-              <w:t>108 trên 108 pass</w:t>
+              <w:t>122 trên 122 pass</w:t>
             </w:r>
           </w:p>
         </w:tc>
@@ -553,7 +553,7 @@
           <w:rFonts w:ascii="Arial" w:hAnsi="Arial" w:eastAsia="Arial"/>
           <w:sz w:val="18"/>
         </w:rPr>
-        <w:t>Trên cùng judge set 15 ca và fallback tắt, OpenRouter đạt 15 trên 15 quyết định, 70 trên 75 field và P95 16,459 giây. Ollama đạt 14 trên 15, 73 trên 75 field và P95 58,318 giây, đồng thời bỏ sót escalation TK-12. Đây là regression tổng hợp, không phải accuracy trên hóa đơn thật.</w:t>
+        <w:t>Official holdout 15 hóa đơn thật, khóa nhãn và SHA-256 trước request đầu tiên, đạt raw 10 trên 15 quyết định; review phát hiện một nhãn người sai nên adjusted view là 11 trên 15. Có một missed escalation, hai over-escalation sau adjudication và không có system error. Đây là mẫu nhỏ, không phải accuracy production.</w:t>
       </w:r>
     </w:p>
     <w:p>
@@ -592,7 +592,7 @@
           <w:rFonts w:ascii="Arial" w:hAnsi="Arial" w:eastAsia="Arial"/>
           <w:sz w:val="18"/>
         </w:rPr>
-        <w:t>Contract ngày 30/09 tách số hóa đơn, số biên nhận và mã giao dịch. Check/Trace/RRN chỉ được dùng khi là mã riêng của lần mua; ShopID, POS, MID/TID và pager không thay thế định danh. Nếu FACT và POLICY cùng tồn tại, FACT vẫn là trạng thái chính nhưng lý do giữ policy finding thứ cấp để quản lý không bỏ sót.</w:t>
+        <w:t>Contract hậu holdout tách số hóa đơn, số biên nhận, mã giao dịch, Mã CQT, serial, số chứng từ và POS. Chỉ tổng cuối được in rõ cùng dòng evidence khớp số mới có thể tự duyệt; tổng bị rách hoặc suy từ subtotal/items luôn đi FACT. Ngày/giờ gốc, tiền khách đưa, tiền thối và VAT đã gồm được kiểm riêng để không che nhánh policy.</w:t>
       </w:r>
     </w:p>
     <w:p>
@@ -711,7 +711,7 @@
           <w:rFonts w:ascii="Arial" w:hAnsi="Arial" w:eastAsia="Arial"/>
           <w:sz w:val="18"/>
         </w:rPr>
-        <w:t>Deployment postfix c42c5ef đã pass health, security, AUTO/FACT smoke, Verify 5 trên 5, human workflow, persistence và concurrency 2 cộng 5 request. Các cổng còn mở là blind holdout đúng 15 ca đã khóa trước request đầu tiên, phản hồi của ba người dùng, manual mobile/4G/no-flash và ba dress rehearsal. Dữ liệu cá nhân thật không được đưa vào Git.</w:t>
+        <w:t>Live c382ce7 đã pass health 5 trên 5, security negative, upload guard và Verify 5 trên 5; UI mobile, manager và audit render đúng. Kiểm tra phát hiện giờ Audit phụ thuộc timezone máy host; source đã chuyển UTC sang Việt Nam rõ ràng và 122 test pass, còn cần publish/recycle rồi xác nhận lại. Sau đó mới làm ba user session, mobile 4G và ba rehearsal. Dữ liệu cá nhân thật không được đưa vào Git.</w:t>
       </w:r>
     </w:p>
     <w:sectPr>

</xml_diff>

<commit_message>
docs: sync final submission artifacts
</commit_message>
<xml_diff>
--- a/AURA/submission/AURA_BUILD_LOG.docx
+++ b/AURA/submission/AURA_BUILD_LOG.docx
@@ -34,7 +34,7 @@
           <w:color w:val="555555"/>
           <w:sz w:val="18"/>
         </w:rPr>
-        <w:t>Track A The Escalation Referee | 06 10 2026 | Pham Gia Phu</w:t>
+        <w:t>Track A The Escalation Referee | 11 10 2026 | Pham Gia Phu</w:t>
       </w:r>
     </w:p>
     <w:p>
@@ -478,7 +478,7 @@
                 <w:b/>
                 <w:sz w:val="18"/>
               </w:rPr>
-              <w:t>122 trên 122 pass</w:t>
+              <w:t>142 trên 142 pass</w:t>
             </w:r>
           </w:p>
         </w:tc>
@@ -711,7 +711,7 @@
           <w:rFonts w:ascii="Arial" w:hAnsi="Arial" w:eastAsia="Arial"/>
           <w:sz w:val="18"/>
         </w:rPr>
-        <w:t>Live 1f4b3c9 đã pass health 5 trên 5, security 6 trên 6 gồm hai upload guard, Verify 5 trên 5 và workflow fixture 2 trên 2; UI mobile-browser, manager và audit render đúng. Bản vá Audit UTC sang giờ Việt Nam đã được publish và xác minh trên live; 122 test pass. Tiếp theo là điện thoại thật 4G, ba user session và ba rehearsal. Dữ liệu cá nhân thật không được đưa vào Git.</w:t>
+        <w:t>Live baseline đã pass health, security gồm hai upload guard, Verify 5 trên 5 và workflow FACT chuyển quản lý, duyệt rồi hoàn tác; desktop, mobile 390x844 và điện thoại thật 4G/5G đều đạt. Post-holdout regression trên 15 receipt đạt 11 trên 15, 0 missed, 4 over và 0 system error; đây không phải accuracy production. 142 test pass; còn ba user session và rehearsal. Dữ liệu cá nhân thật không được đưa vào Git.</w:t>
       </w:r>
     </w:p>
     <w:sectPr>

</xml_diff>

<commit_message>
docs: sync receipt regression forensic evidence
</commit_message>
<xml_diff>
--- a/AURA/submission/AURA_BUILD_LOG.docx
+++ b/AURA/submission/AURA_BUILD_LOG.docx
@@ -34,7 +34,7 @@
           <w:color w:val="555555"/>
           <w:sz w:val="18"/>
         </w:rPr>
-        <w:t>Track A The Escalation Referee | 11 10 2026 | Pham Gia Phu</w:t>
+        <w:t>Track A The Escalation Referee | 12 10 2026 | Pham Gia Phu</w:t>
       </w:r>
     </w:p>
     <w:p>
@@ -478,7 +478,7 @@
                 <w:b/>
                 <w:sz w:val="18"/>
               </w:rPr>
-              <w:t>142 trên 142 pass</w:t>
+              <w:t>149 trên 149 pass</w:t>
             </w:r>
           </w:p>
         </w:tc>
@@ -711,7 +711,7 @@
           <w:rFonts w:ascii="Arial" w:hAnsi="Arial" w:eastAsia="Arial"/>
           <w:sz w:val="18"/>
         </w:rPr>
-        <w:t>Live baseline đã pass health, security gồm hai upload guard, Verify 5 trên 5 và workflow FACT chuyển quản lý, duyệt rồi hoàn tác; desktop, mobile 390x844 và điện thoại thật 4G/5G đều đạt. Post-holdout regression trên 15 receipt đạt 11 trên 15, 0 missed, 4 over và 0 system error; đây không phải accuracy production. 142 test pass; còn ba user session và rehearsal. Dữ liệu cá nhân thật không được đưa vào Git.</w:t>
+        <w:t>Live baseline đã pass health, security gồm hai upload guard, Verify 5 trên 5 và workflow FACT chuyển quản lý, duyệt rồi hoàn tác; desktop, mobile 390x844 và điện thoại thật 4G/5G đều đạt. Post-holdout regression trên 15 receipt đạt 11 trên 15, 0 missed, 4 over và 0 system error; đây không phải accuracy production. 149 test pass; còn ba user session và rehearsal. Dữ liệu cá nhân thật không được đưa vào Git.</w:t>
       </w:r>
     </w:p>
     <w:sectPr>

</xml_diff>

<commit_message>
docs: record live capacity gate
</commit_message>
<xml_diff>
--- a/AURA/submission/AURA_BUILD_LOG.docx
+++ b/AURA/submission/AURA_BUILD_LOG.docx
@@ -530,7 +530,7 @@
                 <w:b/>
                 <w:sz w:val="18"/>
               </w:rPr>
-              <w:t>Verify live 5 trên 5</w:t>
+              <w:t>Live gate có 429</w:t>
             </w:r>
           </w:p>
         </w:tc>
@@ -711,7 +711,7 @@
           <w:rFonts w:ascii="Arial" w:hAnsi="Arial" w:eastAsia="Arial"/>
           <w:sz w:val="18"/>
         </w:rPr>
-        <w:t>Live baseline đã pass health, security gồm hai upload guard, Verify 5 trên 5 và workflow FACT chuyển quản lý, duyệt rồi hoàn tác; desktop, mobile 390x844 và điện thoại thật 4G/5G đều đạt. Post-holdout regression trên 15 receipt đạt 11 trên 15, 0 missed, 4 over và 0 system error; đây không phải accuracy production. 149 test pass; còn ba user session và rehearsal. Dữ liệu cá nhân thật không được đưa vào Git.</w:t>
+        <w:t>Live baseline đã pass health, security gồm hai upload guard, Verify 5 trên 5 và workflow FACT chuyển quản lý, duyệt rồi hoàn tác; desktop, mobile 390x844 và điện thoại thật 4G/5G đều đạt. Post-holdout regression ngày 07/10 trên 15 receipt đạt 11 trên 15, 0 missed, 4 over và 0 system error; đây không phải accuracy production. Candidate đạt 149 test. Live capacity gate 12/10 gặp HTTP 429 dù chạy tuần tự, nên demo dùng một operator và evidence/video dự phòng; còn ba user session và rehearsal. Dữ liệu cá nhân thật không được đưa vào Git.</w:t>
       </w:r>
     </w:p>
     <w:sectPr>

</xml_diff>

<commit_message>
fix: align Ollama fallback with 16K evidence
</commit_message>
<xml_diff>
--- a/AURA/submission/AURA_BUILD_LOG.docx
+++ b/AURA/submission/AURA_BUILD_LOG.docx
@@ -478,7 +478,7 @@
                 <w:b/>
                 <w:sz w:val="18"/>
               </w:rPr>
-              <w:t>149 trên 149 pass</w:t>
+              <w:t>159 trên 159 pass</w:t>
             </w:r>
           </w:p>
         </w:tc>
@@ -658,7 +658,7 @@
           <w:rFonts w:ascii="Arial" w:hAnsi="Arial" w:eastAsia="Arial"/>
           <w:sz w:val="18"/>
         </w:rPr>
-        <w:t>Chọn OpenRouter làm primary; giữ Ollama cho offline/manual vì còn missed escalation và chậm trên RTX 3050 4 GB.</w:t>
+        <w:t>Chọn OpenRouter làm primary; Ollama 4B 16K chỉ fallback local có giám sát vì synthetic đạt 15/15 nhưng P95 khoảng 213 giây.</w:t>
       </w:r>
     </w:p>
     <w:p>
@@ -711,7 +711,7 @@
           <w:rFonts w:ascii="Arial" w:hAnsi="Arial" w:eastAsia="Arial"/>
           <w:sz w:val="18"/>
         </w:rPr>
-        <w:t>Live baseline đã pass health, security gồm hai upload guard, Verify 5 trên 5 và workflow FACT chuyển quản lý, duyệt rồi hoàn tác; desktop, mobile 390x844 và điện thoại thật 4G/5G đều đạt. Post-holdout regression ngày 07/10 trên 15 receipt đạt 11 trên 15, 0 missed, 4 over và 0 system error; đây không phải accuracy production. Candidate đạt 149 test. Live capacity gate 12/10 gặp HTTP 429 dù chạy tuần tự, nên demo dùng một operator và evidence/video dự phòng; còn ba user session và rehearsal. Dữ liệu cá nhân thật không được đưa vào Git.</w:t>
+        <w:t>Live baseline đã pass health, security gồm hai upload guard, Verify 5 trên 5 và workflow FACT chuyển quản lý, duyệt rồi hoàn tác; desktop, mobile 390x844 và điện thoại thật 4G/5G đều đạt. Post-holdout regression ngày 07/10 trên 15 receipt đạt 11 trên 15, 0 missed, 4 over và 0 system error; đây không phải accuracy production. Candidate đạt 159 test. Live capacity gate 12/10 gặp HTTP 429 dù chạy tuần tự, nên demo dùng một operator và evidence/video dự phòng; còn ba user session và rehearsal. Dữ liệu cá nhân thật không được đưa vào Git.</w:t>
       </w:r>
     </w:p>
     <w:sectPr>

</xml_diff>

<commit_message>
docs: record Qwen3.8 benchmark and refresh submission
</commit_message>
<xml_diff>
--- a/AURA/submission/AURA_BUILD_LOG.docx
+++ b/AURA/submission/AURA_BUILD_LOG.docx
@@ -73,7 +73,7 @@
           <w:rFonts w:ascii="Arial" w:hAnsi="Arial" w:eastAsia="Arial"/>
           <w:sz w:val="18"/>
         </w:rPr>
-        <w:t>Qwen3-VL-8B-Instruct qua OpenRouter đọc một ảnh JPG hoặc PNG và trả dữ kiện theo JSON Schema. Codex hỗ trợ truy route, refactor, viết test và đồng bộ tài liệu. Mọi thay đổi chỉ được giữ sau build, test và kiểm tra UI.</w:t>
+        <w:t>Qwen3.8 Flash qua OpenRouter, route Alibaba và reasoning none, đọc một ảnh JPG hoặc PNG rồi trả dữ kiện theo JSON Schema. Codex hỗ trợ truy route, refactor, viết test và đồng bộ tài liệu. Mọi thay đổi chỉ được giữ sau build, test và kiểm tra UI.</w:t>
       </w:r>
     </w:p>
     <w:p>
@@ -397,7 +397,7 @@
                 <w:color w:val="FFFFFF"/>
                 <w:sz w:val="17"/>
               </w:rPr>
-              <w:t>Dependency</w:t>
+              <w:t>Regression</w:t>
             </w:r>
           </w:p>
         </w:tc>
@@ -424,7 +424,7 @@
                 <w:color w:val="FFFFFF"/>
                 <w:sz w:val="17"/>
               </w:rPr>
-              <w:t>Evaluator</w:t>
+              <w:t>Burst 5 ca</w:t>
             </w:r>
           </w:p>
         </w:tc>
@@ -478,7 +478,7 @@
                 <w:b/>
                 <w:sz w:val="18"/>
               </w:rPr>
-              <w:t>159 trên 159 pass</w:t>
+              <w:t>161 trên 161 pass</w:t>
             </w:r>
           </w:p>
         </w:tc>
@@ -504,7 +504,7 @@
                 <w:b/>
                 <w:sz w:val="18"/>
               </w:rPr>
-              <w:t>EF model sạch</w:t>
+              <w:t>15 trên 15</w:t>
             </w:r>
           </w:p>
         </w:tc>
@@ -530,7 +530,7 @@
                 <w:b/>
                 <w:sz w:val="18"/>
               </w:rPr>
-              <w:t>Live gate có 429</w:t>
+              <w:t>P95 41.079 giây</w:t>
             </w:r>
           </w:p>
         </w:tc>
@@ -553,7 +553,7 @@
           <w:rFonts w:ascii="Arial" w:hAnsi="Arial" w:eastAsia="Arial"/>
           <w:sz w:val="18"/>
         </w:rPr>
-        <w:t>Official holdout 15 hóa đơn thật, khóa nhãn và SHA-256 trước request đầu tiên, đạt raw 10 trên 15 quyết định; review phát hiện một nhãn người sai nên adjusted view là 11 trên 15. Có một missed escalation, hai over-escalation sau adjudication và không có system error. Đây là mẫu nhỏ, không phải accuracy production.</w:t>
+        <w:t>Official holdout 15 hóa đơn thật, khóa nhãn và SHA-256 trước request đầu tiên, đạt raw 10 trên 15 quyết định; review phát hiện một nhãn người sai nên adjusted view là 11 trên 15. Có một missed escalation, hai over-escalation sau adjudication và không có system error. Candidate hậu chỉnh Qwen3.8 Flash đạt 15 trên 15, 0 missed, 0 over, 0 system error và 20 trên 20 upstream HTTP 200. Đây là regression hậu chỉnh, không phải blind holdout hay causal model-only A/B; mẫu nhỏ này không phải accuracy production.</w:t>
       </w:r>
     </w:p>
     <w:p>
@@ -658,7 +658,7 @@
           <w:rFonts w:ascii="Arial" w:hAnsi="Arial" w:eastAsia="Arial"/>
           <w:sz w:val="18"/>
         </w:rPr>
-        <w:t>Chọn OpenRouter làm primary; Ollama 4B 16K chỉ fallback local có giám sát vì synthetic đạt 15/15 nhưng P95 khoảng 213 giây.</w:t>
+        <w:t>Chọn Qwen3.8 Flash qua Alibaba làm primary; reasoning none tránh tiêu hết output budget. Ollama 4B 16K chỉ fallback local có giám sát vì P95 khoảng 213 giây.</w:t>
       </w:r>
     </w:p>
     <w:p>
@@ -711,7 +711,7 @@
           <w:rFonts w:ascii="Arial" w:hAnsi="Arial" w:eastAsia="Arial"/>
           <w:sz w:val="18"/>
         </w:rPr>
-        <w:t>Live baseline đã pass health, security gồm hai upload guard, Verify 5 trên 5 và workflow FACT chuyển quản lý, duyệt rồi hoàn tác; desktop, mobile 390x844 và điện thoại thật 4G/5G đều đạt. Post-holdout regression ngày 07/10 trên 15 receipt đạt 11 trên 15, 0 missed, 4 over và 0 system error; đây không phải accuracy production. Candidate đạt 159 test. Live capacity gate 12/10 gặp HTTP 429 dù chạy tuần tự, nên demo dùng một operator và evidence/video dự phòng; còn ba user session và rehearsal. Dữ liệu cá nhân thật không được đưa vào Git.</w:t>
+        <w:t>Live baseline đã pass health, security gồm hai upload guard, Verify 5 trên 5 và workflow FACT chuyển quản lý, duyệt rồi hoàn tác; desktop, mobile 390x844 và điện thoại thật 4G/5G đều đạt. Candidate ngày 12/10 trên cùng 15 receipt đạt 15 trên 15, 0 missed, 0 over và 0 system error; 20 trên 20 upstream request HTTP 200. Burst 5 upload đồng thời hoàn tất 5 trên 5, E2E P95 41.079 giây với AI concurrency bằng 1. Candidate đạt 161 test; còn ba user session và rehearsal. Dữ liệu cá nhân thật không được đưa vào Git.</w:t>
       </w:r>
     </w:p>
     <w:sectPr>

</xml_diff>

<commit_message>
docs: record live Qwen3.8 Verify gate and refresh submission
</commit_message>
<xml_diff>
--- a/AURA/submission/AURA_BUILD_LOG.docx
+++ b/AURA/submission/AURA_BUILD_LOG.docx
@@ -424,7 +424,7 @@
                 <w:color w:val="FFFFFF"/>
                 <w:sz w:val="17"/>
               </w:rPr>
-              <w:t>Burst 5 ca</w:t>
+              <w:t>Verify live</w:t>
             </w:r>
           </w:p>
         </w:tc>
@@ -530,7 +530,7 @@
                 <w:b/>
                 <w:sz w:val="18"/>
               </w:rPr>
-              <w:t>P95 41.079 giây</w:t>
+              <w:t>5 trên 5, 65.004 giây</w:t>
             </w:r>
           </w:p>
         </w:tc>
@@ -711,7 +711,7 @@
           <w:rFonts w:ascii="Arial" w:hAnsi="Arial" w:eastAsia="Arial"/>
           <w:sz w:val="18"/>
         </w:rPr>
-        <w:t>Live baseline đã pass health, security gồm hai upload guard, Verify 5 trên 5 và workflow FACT chuyển quản lý, duyệt rồi hoàn tác; desktop, mobile 390x844 và điện thoại thật 4G/5G đều đạt. Candidate ngày 12/10 trên cùng 15 receipt đạt 15 trên 15, 0 missed, 0 over và 0 system error; 20 trên 20 upstream request HTTP 200. Burst 5 upload đồng thời hoàn tất 5 trên 5, E2E P95 41.079 giây với AI concurrency bằng 1. Candidate đạt 161 test; còn ba user session và rehearsal. Dữ liệu cá nhân thật không được đưa vào Git.</w:t>
+        <w:t>Live baseline đã pass health, security gồm hai upload guard, Verify 5 trên 5 và workflow FACT chuyển quản lý, duyệt rồi hoàn tác; desktop, mobile 390x844 và điện thoại thật 4G/5G đều đạt. Candidate ngày 12/10 trên cùng 15 receipt đạt 15 trên 15, 0 missed, 0 over và 0 system error; 20 trên 20 upstream request HTTP 200. Burst 5 upload đồng thời hoàn tất 5 trên 5, E2E P95 41.079 giây với AI concurrency bằng 1. Verify live sau publish đạt 5 trên 5 trong 65.004 giây; năm client đồng thời tạo đúng một batch thật với một HTTP 200 và bốn HTTP 409. Candidate đạt 161 test; còn ba user session và rehearsal. Dữ liệu cá nhân thật không được đưa vào Git.</w:t>
       </w:r>
     </w:p>
     <w:sectPr>

</xml_diff>

<commit_message>
docs: record holdout evidence and localization plan
</commit_message>
<xml_diff>
--- a/AURA/submission/AURA_BUILD_LOG.docx
+++ b/AURA/submission/AURA_BUILD_LOG.docx
@@ -34,7 +34,7 @@
           <w:color w:val="555555"/>
           <w:sz w:val="18"/>
         </w:rPr>
-        <w:t>Track A The Escalation Referee | 12 10 2026 | Pham Gia Phu</w:t>
+        <w:t>Track A The Escalation Referee | 13 10 2026 | Pham Gia Phu</w:t>
       </w:r>
     </w:p>
     <w:p>
@@ -397,7 +397,7 @@
                 <w:color w:val="FFFFFF"/>
                 <w:sz w:val="17"/>
               </w:rPr>
-              <w:t>Regression</w:t>
+              <w:t>Mini-holdout</w:t>
             </w:r>
           </w:p>
         </w:tc>
@@ -504,7 +504,7 @@
                 <w:b/>
                 <w:sz w:val="18"/>
               </w:rPr>
-              <w:t>15 trên 15</w:t>
+              <w:t>8 trên 10</w:t>
             </w:r>
           </w:p>
         </w:tc>
@@ -546,14 +546,13 @@
           <w:b/>
           <w:sz w:val="18"/>
         </w:rPr>
-        <w:t xml:space="preserve">Kết luận đo lường: </w:t>
+        <w:t>Kết luận đo lường: Official holdout 15 hóa đơn thật đạt raw 10 trên 15; review phát hiện một nhãn người sai nên adjusted view là 11 trên 15, với một missed escalation, hai over-escalation sau adjudication và không có system error. Candidate hậu chỉnh Qwen3.8 Flash đạt 15 trên 15 regression. Prospective mini-holdout 10 ca mới ngày 13/10 đạt 8 trên 10, 0 missed, 2 over, 0 system/provider/429 error và 28 trên 30 field trọng yếu. Các mẫu nhỏ này không phải accuracy production.</w:t>
       </w:r>
       <w:r>
         <w:rPr>
           <w:rFonts w:ascii="Arial" w:hAnsi="Arial" w:eastAsia="Arial"/>
           <w:sz w:val="18"/>
         </w:rPr>
-        <w:t>Official holdout 15 hóa đơn thật, khóa nhãn và SHA-256 trước request đầu tiên, đạt raw 10 trên 15 quyết định; review phát hiện một nhãn người sai nên adjusted view là 11 trên 15. Có một missed escalation, hai over-escalation sau adjudication và không có system error. Candidate hậu chỉnh Qwen3.8 Flash đạt 15 trên 15, 0 missed, 0 over, 0 system error và 20 trên 20 upstream HTTP 200. Đây là regression hậu chỉnh, không phải blind holdout hay causal model-only A/B; mẫu nhỏ này không phải accuracy production.</w:t>
       </w:r>
     </w:p>
     <w:p>
@@ -711,7 +710,7 @@
           <w:rFonts w:ascii="Arial" w:hAnsi="Arial" w:eastAsia="Arial"/>
           <w:sz w:val="18"/>
         </w:rPr>
-        <w:t>Live baseline đã pass health, security gồm hai upload guard, Verify 5 trên 5 và workflow FACT chuyển quản lý, duyệt rồi hoàn tác; desktop, mobile 390x844 và điện thoại thật 4G/5G đều đạt. Candidate ngày 12/10 trên cùng 15 receipt đạt 15 trên 15, 0 missed, 0 over và 0 system error; 20 trên 20 upstream request HTTP 200. Burst 5 upload đồng thời hoàn tất 5 trên 5, E2E P95 41.079 giây với AI concurrency bằng 1. Verify live sau publish đạt 5 trên 5 trong 65.004 giây; năm client đồng thời tạo đúng một batch thật với một HTTP 200 và bốn HTTP 409. Candidate đạt 161 test; còn ba user session và rehearsal. Dữ liệu cá nhân thật không được đưa vào Git.</w:t>
+        <w:t>Live baseline đã pass health, security, Verify 5 trên 5, human workflow, desktop, mobile 390x844 và điện thoại thật 4G/5G. Candidate ngày 12/10 đạt 15 trên 15 post-holdout regression; mini-holdout mới ngày 13/10 đạt 8 trên 10 với 0 missed và 0 system/provider error. Năm request đầu của mini-holdout terminal trong 64,763 giây ở AI concurrency 1. Verify live đạt 5 trên 5 trong 65,004 giây; năm client chỉ tạo một batch thật. Candidate đạt 161 test; còn ba user session và rehearsal. Dữ liệu cá nhân thật không được đưa vào Git.</w:t>
       </w:r>
     </w:p>
     <w:sectPr>

</xml_diff>

<commit_message>
docs: consolidate final submission package
</commit_message>
<xml_diff>
--- a/AURA/submission/AURA_BUILD_LOG.docx
+++ b/AURA/submission/AURA_BUILD_LOG.docx
@@ -5,189 +5,208 @@
     <w:p>
       <w:pPr>
         <w:pStyle w:val="Title"/>
-        <w:keepNext/>
-        <w:spacing w:after="20"/>
-        <w:jc w:val="center"/>
-        <w:pBdr>
-          <w:bottom w:val="nil" w:sz="0" w:space="0"/>
-        </w:pBdr>
+        <w:jc w:val="left"/>
       </w:pPr>
       <w:r>
+        <w:t>AURA Project Build Log</w:t>
+      </w:r>
+    </w:p>
+    <w:p>
+      <w:r>
         <w:rPr>
-          <w:rFonts w:ascii="Arial" w:hAnsi="Arial" w:eastAsia="Arial"/>
           <w:b/>
-          <w:color w:val="000000"/>
-          <w:sz w:val="32"/>
         </w:rPr>
-        <w:t>AURA BUILD LOG SPRINT 2 VÀ HARDENING</w:t>
+        <w:t>Track A The Escalation Referee | Bản chốt 14/10/2026 | Phạm Gia Phú</w:t>
+      </w:r>
+    </w:p>
+    <w:p>
+      <w:r>
+        <w:t>AURA is a supervised reimbursement-review assistant. A vision model extracts structured receipt facts, deterministic C# policy decides the route, and people remain responsible for exceptions. The system covers upload, durable background processing, review, Audit, and Undo.</w:t>
       </w:r>
     </w:p>
     <w:p>
       <w:pPr>
-        <w:spacing w:after="100"/>
-        <w:jc w:val="center"/>
+        <w:pStyle w:val="Heading1"/>
       </w:pPr>
       <w:r>
-        <w:rPr>
-          <w:rFonts w:ascii="Arial" w:hAnsi="Arial" w:eastAsia="Arial"/>
-          <w:i/>
-          <w:color w:val="555555"/>
-          <w:sz w:val="18"/>
-        </w:rPr>
-        <w:t>Track A The Escalation Referee | 13 10 2026 | Pham Gia Phu</w:t>
+        <w:t>How I used AI</w:t>
+      </w:r>
+    </w:p>
+    <w:p>
+      <w:r>
+        <w:t>Qwen3.8 Flash through OpenRouter and Alibaba, with reasoning disabled, reads one JPG or PNG and returns a strict JSON contract. Codex helped trace code paths, design tests, review refactors, and synchronize documentation. I accepted changes only after build, tests, and evidence review. The model never receives approval authority.</w:t>
       </w:r>
     </w:p>
     <w:p>
       <w:pPr>
-        <w:spacing w:after="80" w:line="252" w:lineRule="auto"/>
+        <w:pStyle w:val="Heading1"/>
       </w:pPr>
       <w:r>
-        <w:rPr>
-          <w:rFonts w:ascii="Arial" w:hAnsi="Arial" w:eastAsia="Arial"/>
-          <w:sz w:val="18"/>
-        </w:rPr>
-        <w:t>Tôi dùng AI để tăng tốc việc đọc code, thử nghiệm kiến trúc và chuẩn hóa dữ liệu hóa đơn, nhưng giữ quyết định nghiệp vụ trong policy C# có thể kiểm thử. AURA chạy trọn luồng từ upload đến quản lý, audit và hoàn tác; lỗi model được chuyển cho con người thay vì tạo kết quả giả.</w:t>
+        <w:t>Where AI helped</w:t>
       </w:r>
     </w:p>
     <w:p>
       <w:pPr>
-        <w:keepNext/>
-        <w:spacing w:before="100" w:after="30"/>
+        <w:pStyle w:val="ListBullet"/>
+        <w:ind w:left="230" w:hanging="173"/>
       </w:pPr>
       <w:r>
-        <w:rPr>
-          <w:rFonts w:ascii="Arial" w:hAnsi="Arial" w:eastAsia="Arial"/>
-          <w:b/>
-          <w:color w:val="000000"/>
-          <w:sz w:val="21"/>
-        </w:rPr>
-        <w:t>1 Công cụ và phạm vi sử dụng</w:t>
+        <w:t>Fast code navigation exposed the difference between an in-memory signal and the durable SQL job queue.</w:t>
       </w:r>
     </w:p>
     <w:p>
       <w:pPr>
-        <w:spacing w:after="50" w:line="247" w:lineRule="auto"/>
+        <w:pStyle w:val="ListBullet"/>
+        <w:ind w:left="230" w:hanging="173"/>
       </w:pPr>
       <w:r>
-        <w:rPr>
-          <w:rFonts w:ascii="Arial" w:hAnsi="Arial" w:eastAsia="Arial"/>
-          <w:sz w:val="18"/>
-        </w:rPr>
-        <w:t>Qwen3.8 Flash qua OpenRouter, route Alibaba và reasoning none, đọc một ảnh JPG hoặc PNG rồi trả dữ kiện theo JSON Schema. Codex hỗ trợ truy route, refactor, viết test và đồng bộ tài liệu. Mọi thay đổi chỉ được giữ sau build, test và kiểm tra UI.</w:t>
+        <w:t>Generated test cases expanded coverage for field roles, arithmetic, date evidence, fallback, concurrency, Audit, and UI contracts.</w:t>
       </w:r>
     </w:p>
     <w:p>
       <w:pPr>
-        <w:keepNext/>
-        <w:spacing w:before="100" w:after="30"/>
+        <w:pStyle w:val="ListBullet"/>
+        <w:ind w:left="230" w:hanging="173"/>
       </w:pPr>
       <w:r>
-        <w:rPr>
-          <w:rFonts w:ascii="Arial" w:hAnsi="Arial" w:eastAsia="Arial"/>
-          <w:b/>
-          <w:color w:val="000000"/>
-          <w:sz w:val="21"/>
-        </w:rPr>
-        <w:t>2 Hành trình xây dựng và các lần AI sai</w:t>
+        <w:t>Vision extraction handled varied receipt layouts while policy remained replaceable and testable.</w:t>
       </w:r>
     </w:p>
     <w:p>
       <w:pPr>
-        <w:spacing w:after="50" w:line="247" w:lineRule="auto"/>
+        <w:pStyle w:val="Heading1"/>
       </w:pPr>
       <w:r>
+        <w:t>Where AI cost time or money</w:t>
+      </w:r>
+    </w:p>
+    <w:p>
+      <w:r>
+        <w:t>Provider names and model slugs changed, and earlier routes produced 404 or intermittent 429 errors. Schema-valid outputs also contained semantic errors such as the wrong money unit or identifier role. A reasoning-enabled request used its completion budget without returning usable JSON. These failures required provider diagnostics, a strict schema, semantic validation, a single repair attempt, cooldown, and explicit claim boundaries. Paid API reruns were avoided once data became known.</w:t>
+      </w:r>
+    </w:p>
+    <w:p>
+      <w:pPr>
+        <w:pStyle w:val="Heading1"/>
+      </w:pPr>
+      <w:r>
+        <w:t>What changed after failure</w:t>
+      </w:r>
+    </w:p>
+    <w:p>
+      <w:r>
+        <w:t xml:space="preserve">The first real-receipt holdout exposed a missed escalation even though the response parsed. I replaced “valid JSON is enough” with evidence contract v2: identifiers have distinct roles, dates preserve raw evidence, discounts are explicit, and an amount can auto-approve only when a printed final-total line corroborates it. Unresolved uncertainty becomes FACT review. The policy priority remains </w:t>
+      </w:r>
+      <w:r>
         <w:rPr>
-          <w:rFonts w:ascii="Arial" w:hAnsi="Arial" w:eastAsia="Arial"/>
-          <w:sz w:val="18"/>
+          <w:rFonts w:ascii="Consolas" w:hAnsi="Consolas"/>
+          <w:color w:val="2F5597"/>
         </w:rPr>
-        <w:t>Gemini Free Tier từng gặp 429; model slug sai gây 404; Qwen có lúc trả JSON lệch schema hoặc đọc 295.199 VND sai đơn vị. Ca Vinamilk đọc đúng 183.114 trừ 2.828 bằng 180.286 nhưng schema cũ không có trường giảm giá. Các lỗi này dẫn tới cấu hình provider rõ ràng, parser giới hạn, discountAmount có cấu trúc, semantic validation và đúng một lượt repair. Kết quả còn mâu thuẫn luôn chuyển người xử lý.</w:t>
+        <w:t>FACT -&gt; POLICY -&gt; AUTHORITY</w:t>
+      </w:r>
+      <w:r>
+        <w:t>.</w:t>
+      </w:r>
+    </w:p>
+    <w:p>
+      <w:pPr>
+        <w:pStyle w:val="Heading1"/>
+      </w:pPr>
+      <w:r>
+        <w:t>Verified evidence</w:t>
       </w:r>
     </w:p>
     <w:tbl>
       <w:tblPr>
         <w:tblW w:type="auto" w:w="0"/>
         <w:jc w:val="center"/>
-        <w:tblLayout w:type="fixed"/>
+        <w:tblLayout w:type="autofit"/>
         <w:tblLook w:firstColumn="1" w:firstRow="1" w:lastColumn="0" w:lastRow="0" w:noHBand="0" w:noVBand="1" w:val="04A0"/>
         <w:tblBorders>
-          <w:top w:val="single" w:sz="4" w:color="D9D9D9"/>
-          <w:left w:val="single" w:sz="4" w:color="D9D9D9"/>
-          <w:bottom w:val="single" w:sz="4" w:color="D9D9D9"/>
-          <w:right w:val="single" w:sz="4" w:color="D9D9D9"/>
-          <w:insideH w:val="single" w:sz="4" w:color="D9D9D9"/>
-          <w:insideV w:val="single" w:sz="4" w:color="D9D9D9"/>
+          <w:top w:val="single" w:sz="6" w:space="0" w:color="CFD8E3"/>
+          <w:left w:val="single" w:sz="6" w:space="0" w:color="CFD8E3"/>
+          <w:bottom w:val="single" w:sz="6" w:space="0" w:color="CFD8E3"/>
+          <w:right w:val="single" w:sz="6" w:space="0" w:color="CFD8E3"/>
+          <w:insideH w:val="single" w:sz="6" w:space="0" w:color="CFD8E3"/>
+          <w:insideV w:val="single" w:sz="6" w:space="0" w:color="CFD8E3"/>
         </w:tblBorders>
       </w:tblPr>
       <w:tblGrid>
-        <w:gridCol w:w="5046"/>
-        <w:gridCol w:w="5046"/>
+        <w:gridCol w:w="7229"/>
+        <w:gridCol w:w="7229"/>
       </w:tblGrid>
       <w:tr>
+        <w:trPr>
+          <w:tblHeader w:val="true"/>
+          <w:cantSplit w:val="true"/>
+        </w:trPr>
         <w:tc>
           <w:tcPr>
-            <w:tcW w:type="dxa" w:w="5188"/>
-            <w:shd w:fill="17365D"/>
+            <w:tcW w:type="dxa" w:w="7229"/>
             <w:tcMar>
-              <w:top w:w="85" w:type="dxa"/>
-              <w:start w:w="115" w:type="dxa"/>
-              <w:bottom w:w="85" w:type="dxa"/>
-              <w:end w:w="115" w:type="dxa"/>
+              <w:top w:w="75" w:type="dxa"/>
+              <w:start w:w="105" w:type="dxa"/>
+              <w:bottom w:w="75" w:type="dxa"/>
+              <w:end w:w="105" w:type="dxa"/>
             </w:tcMar>
             <w:vAlign w:val="center"/>
+            <w:shd w:fill="17365D"/>
           </w:tcPr>
           <w:p>
             <w:pPr>
-              <w:jc w:val="center"/>
+              <w:spacing w:after="0"/>
             </w:pPr>
             <w:r>
               <w:rPr>
-                <w:rFonts w:ascii="Arial" w:hAnsi="Arial" w:eastAsia="Arial"/>
+                <w:rFonts w:ascii="Arial" w:hAnsi="Arial"/>
                 <w:b/>
                 <w:color w:val="FFFFFF"/>
-                <w:sz w:val="19"/>
+                <w:sz w:val="15"/>
               </w:rPr>
-              <w:t>AI giúp tăng tốc</w:t>
+              <w:t>Gate</w:t>
             </w:r>
           </w:p>
         </w:tc>
         <w:tc>
           <w:tcPr>
-            <w:tcW w:type="dxa" w:w="5188"/>
-            <w:shd w:fill="17365D"/>
+            <w:tcW w:type="dxa" w:w="7229"/>
             <w:tcMar>
-              <w:top w:w="85" w:type="dxa"/>
-              <w:start w:w="115" w:type="dxa"/>
-              <w:bottom w:w="85" w:type="dxa"/>
-              <w:end w:w="115" w:type="dxa"/>
+              <w:top w:w="75" w:type="dxa"/>
+              <w:start w:w="105" w:type="dxa"/>
+              <w:bottom w:w="75" w:type="dxa"/>
+              <w:end w:w="105" w:type="dxa"/>
             </w:tcMar>
             <w:vAlign w:val="center"/>
+            <w:shd w:fill="17365D"/>
           </w:tcPr>
           <w:p>
             <w:pPr>
-              <w:jc w:val="center"/>
+              <w:spacing w:after="0"/>
             </w:pPr>
             <w:r>
               <w:rPr>
-                <w:rFonts w:ascii="Arial" w:hAnsi="Arial" w:eastAsia="Arial"/>
+                <w:rFonts w:ascii="Arial" w:hAnsi="Arial"/>
                 <w:b/>
                 <w:color w:val="FFFFFF"/>
-                <w:sz w:val="19"/>
+                <w:sz w:val="15"/>
               </w:rPr>
-              <w:t>AI làm tốn công khi</w:t>
+              <w:t>Current result</w:t>
             </w:r>
           </w:p>
         </w:tc>
       </w:tr>
       <w:tr>
+        <w:trPr>
+          <w:cantSplit w:val="true"/>
+        </w:trPr>
         <w:tc>
           <w:tcPr>
-            <w:tcW w:type="dxa" w:w="5046"/>
-            <w:shd w:fill="EAF2F8"/>
+            <w:tcW w:type="dxa" w:w="7229"/>
             <w:tcMar>
-              <w:top w:w="85" w:type="dxa"/>
-              <w:start w:w="115" w:type="dxa"/>
-              <w:bottom w:w="85" w:type="dxa"/>
-              <w:end w:w="115" w:type="dxa"/>
+              <w:top w:w="75" w:type="dxa"/>
+              <w:start w:w="105" w:type="dxa"/>
+              <w:bottom w:w="75" w:type="dxa"/>
+              <w:end w:w="105" w:type="dxa"/>
             </w:tcMar>
             <w:vAlign w:val="center"/>
           </w:tcPr>
@@ -197,22 +216,21 @@
             </w:pPr>
             <w:r>
               <w:rPr>
-                <w:rFonts w:ascii="Arial" w:hAnsi="Arial" w:eastAsia="Arial"/>
-                <w:sz w:val="18"/>
+                <w:rFonts w:ascii="Arial" w:hAnsi="Arial"/>
+                <w:sz w:val="15"/>
               </w:rPr>
-              <w:t>Tìm nhanh luồng upload, Verify, reviewer và audit.</w:t>
+              <w:t>Release build</w:t>
             </w:r>
           </w:p>
         </w:tc>
         <w:tc>
           <w:tcPr>
-            <w:tcW w:type="dxa" w:w="5046"/>
-            <w:shd w:fill="EAF2F8"/>
+            <w:tcW w:type="dxa" w:w="7229"/>
             <w:tcMar>
-              <w:top w:w="85" w:type="dxa"/>
-              <w:start w:w="115" w:type="dxa"/>
-              <w:bottom w:w="85" w:type="dxa"/>
-              <w:end w:w="115" w:type="dxa"/>
+              <w:top w:w="75" w:type="dxa"/>
+              <w:start w:w="105" w:type="dxa"/>
+              <w:bottom w:w="75" w:type="dxa"/>
+              <w:end w:w="105" w:type="dxa"/>
             </w:tcMar>
             <w:vAlign w:val="center"/>
           </w:tcPr>
@@ -222,24 +240,81 @@
             </w:pPr>
             <w:r>
               <w:rPr>
-                <w:rFonts w:ascii="Arial" w:hAnsi="Arial" w:eastAsia="Arial"/>
-                <w:sz w:val="18"/>
+                <w:rFonts w:ascii="Arial" w:hAnsi="Arial"/>
+                <w:sz w:val="15"/>
               </w:rPr>
-              <w:t>Đề xuất model hoặc API không tồn tại/chưa đúng slug.</w:t>
+              <w:t>0 warnings, 0 errors</w:t>
             </w:r>
           </w:p>
         </w:tc>
       </w:tr>
       <w:tr>
+        <w:trPr>
+          <w:cantSplit w:val="true"/>
+        </w:trPr>
         <w:tc>
           <w:tcPr>
-            <w:tcW w:type="dxa" w:w="5046"/>
-            <w:shd w:fill="FFFFFF"/>
+            <w:tcW w:type="dxa" w:w="7229"/>
             <w:tcMar>
-              <w:top w:w="85" w:type="dxa"/>
-              <w:start w:w="115" w:type="dxa"/>
-              <w:bottom w:w="85" w:type="dxa"/>
-              <w:end w:w="115" w:type="dxa"/>
+              <w:top w:w="75" w:type="dxa"/>
+              <w:start w:w="105" w:type="dxa"/>
+              <w:bottom w:w="75" w:type="dxa"/>
+              <w:end w:w="105" w:type="dxa"/>
+            </w:tcMar>
+            <w:vAlign w:val="center"/>
+            <w:shd w:fill="F3F6F9"/>
+          </w:tcPr>
+          <w:p>
+            <w:pPr>
+              <w:spacing w:after="0"/>
+            </w:pPr>
+            <w:r>
+              <w:rPr>
+                <w:rFonts w:ascii="Arial" w:hAnsi="Arial"/>
+                <w:sz w:val="15"/>
+              </w:rPr>
+              <w:t>Offline tests</w:t>
+            </w:r>
+          </w:p>
+        </w:tc>
+        <w:tc>
+          <w:tcPr>
+            <w:tcW w:type="dxa" w:w="7229"/>
+            <w:tcMar>
+              <w:top w:w="75" w:type="dxa"/>
+              <w:start w:w="105" w:type="dxa"/>
+              <w:bottom w:w="75" w:type="dxa"/>
+              <w:end w:w="105" w:type="dxa"/>
+            </w:tcMar>
+            <w:vAlign w:val="center"/>
+            <w:shd w:fill="F3F6F9"/>
+          </w:tcPr>
+          <w:p>
+            <w:pPr>
+              <w:spacing w:after="0"/>
+            </w:pPr>
+            <w:r>
+              <w:rPr>
+                <w:rFonts w:ascii="Arial" w:hAnsi="Arial"/>
+                <w:sz w:val="15"/>
+              </w:rPr>
+              <w:t>163/163 passed</w:t>
+            </w:r>
+          </w:p>
+        </w:tc>
+      </w:tr>
+      <w:tr>
+        <w:trPr>
+          <w:cantSplit w:val="true"/>
+        </w:trPr>
+        <w:tc>
+          <w:tcPr>
+            <w:tcW w:type="dxa" w:w="7229"/>
+            <w:tcMar>
+              <w:top w:w="75" w:type="dxa"/>
+              <w:start w:w="105" w:type="dxa"/>
+              <w:bottom w:w="75" w:type="dxa"/>
+              <w:end w:w="105" w:type="dxa"/>
             </w:tcMar>
             <w:vAlign w:val="center"/>
           </w:tcPr>
@@ -249,22 +324,21 @@
             </w:pPr>
             <w:r>
               <w:rPr>
-                <w:rFonts w:ascii="Arial" w:hAnsi="Arial" w:eastAsia="Arial"/>
-                <w:sz w:val="18"/>
+                <w:rFonts w:ascii="Arial" w:hAnsi="Arial"/>
+                <w:sz w:val="15"/>
               </w:rPr>
-              <w:t>Sinh test policy, contract và kiểm tra fixture offline.</w:t>
+              <w:t>Live Verify</w:t>
             </w:r>
           </w:p>
         </w:tc>
         <w:tc>
           <w:tcPr>
-            <w:tcW w:type="dxa" w:w="5046"/>
-            <w:shd w:fill="FFFFFF"/>
+            <w:tcW w:type="dxa" w:w="7229"/>
             <w:tcMar>
-              <w:top w:w="85" w:type="dxa"/>
-              <w:start w:w="115" w:type="dxa"/>
-              <w:bottom w:w="85" w:type="dxa"/>
-              <w:end w:w="115" w:type="dxa"/>
+              <w:top w:w="75" w:type="dxa"/>
+              <w:start w:w="105" w:type="dxa"/>
+              <w:bottom w:w="75" w:type="dxa"/>
+              <w:end w:w="105" w:type="dxa"/>
             </w:tcMar>
             <w:vAlign w:val="center"/>
           </w:tcPr>
@@ -274,453 +348,206 @@
             </w:pPr>
             <w:r>
               <w:rPr>
-                <w:rFonts w:ascii="Arial" w:hAnsi="Arial" w:eastAsia="Arial"/>
-                <w:sz w:val="18"/>
+                <w:rFonts w:ascii="Arial" w:hAnsi="Arial"/>
+                <w:sz w:val="15"/>
               </w:rPr>
-              <w:t>Output trông hợp lý nhưng không đúng schema hoặc policy.</w:t>
+              <w:t>5/5 in 65.004 seconds</w:t>
+            </w:r>
+          </w:p>
+        </w:tc>
+      </w:tr>
+      <w:tr>
+        <w:trPr>
+          <w:cantSplit w:val="true"/>
+        </w:trPr>
+        <w:tc>
+          <w:tcPr>
+            <w:tcW w:type="dxa" w:w="7229"/>
+            <w:tcMar>
+              <w:top w:w="75" w:type="dxa"/>
+              <w:start w:w="105" w:type="dxa"/>
+              <w:bottom w:w="75" w:type="dxa"/>
+              <w:end w:w="105" w:type="dxa"/>
+            </w:tcMar>
+            <w:vAlign w:val="center"/>
+            <w:shd w:fill="F3F6F9"/>
+          </w:tcPr>
+          <w:p>
+            <w:pPr>
+              <w:spacing w:after="0"/>
+            </w:pPr>
+            <w:r>
+              <w:rPr>
+                <w:rFonts w:ascii="Arial" w:hAnsi="Arial"/>
+                <w:sz w:val="15"/>
+              </w:rPr>
+              <w:t>Prospective mini-holdout</w:t>
+            </w:r>
+          </w:p>
+        </w:tc>
+        <w:tc>
+          <w:tcPr>
+            <w:tcW w:type="dxa" w:w="7229"/>
+            <w:tcMar>
+              <w:top w:w="75" w:type="dxa"/>
+              <w:start w:w="105" w:type="dxa"/>
+              <w:bottom w:w="75" w:type="dxa"/>
+              <w:end w:w="105" w:type="dxa"/>
+            </w:tcMar>
+            <w:vAlign w:val="center"/>
+            <w:shd w:fill="F3F6F9"/>
+          </w:tcPr>
+          <w:p>
+            <w:pPr>
+              <w:spacing w:after="0"/>
+            </w:pPr>
+            <w:r>
+              <w:rPr>
+                <w:rFonts w:ascii="Arial" w:hAnsi="Arial"/>
+                <w:sz w:val="15"/>
+              </w:rPr>
+              <w:t>8/10, 0 missed, 2 over, 0 system/provider/429 errors</w:t>
+            </w:r>
+          </w:p>
+        </w:tc>
+      </w:tr>
+      <w:tr>
+        <w:trPr>
+          <w:cantSplit w:val="true"/>
+        </w:trPr>
+        <w:tc>
+          <w:tcPr>
+            <w:tcW w:type="dxa" w:w="7229"/>
+            <w:tcMar>
+              <w:top w:w="75" w:type="dxa"/>
+              <w:start w:w="105" w:type="dxa"/>
+              <w:bottom w:w="75" w:type="dxa"/>
+              <w:end w:w="105" w:type="dxa"/>
+            </w:tcMar>
+            <w:vAlign w:val="center"/>
+          </w:tcPr>
+          <w:p>
+            <w:pPr>
+              <w:spacing w:after="0"/>
+            </w:pPr>
+            <w:r>
+              <w:rPr>
+                <w:rFonts w:ascii="Arial" w:hAnsi="Arial"/>
+                <w:sz w:val="15"/>
+              </w:rPr>
+              <w:t>Sequential known-data repeat</w:t>
+            </w:r>
+          </w:p>
+        </w:tc>
+        <w:tc>
+          <w:tcPr>
+            <w:tcW w:type="dxa" w:w="7229"/>
+            <w:tcMar>
+              <w:top w:w="75" w:type="dxa"/>
+              <w:start w:w="105" w:type="dxa"/>
+              <w:bottom w:w="75" w:type="dxa"/>
+              <w:end w:w="105" w:type="dxa"/>
+            </w:tcMar>
+            <w:vAlign w:val="center"/>
+          </w:tcPr>
+          <w:p>
+            <w:pPr>
+              <w:spacing w:after="0"/>
+            </w:pPr>
+            <w:r>
+              <w:rPr>
+                <w:rFonts w:ascii="Arial" w:hAnsi="Arial"/>
+                <w:sz w:val="15"/>
+              </w:rPr>
+              <w:t>11/12, 0 missed, 1 over; stability evidence only</w:t>
             </w:r>
           </w:p>
         </w:tc>
       </w:tr>
     </w:tbl>
     <w:p>
-      <w:pPr>
-        <w:keepNext/>
-        <w:spacing w:before="100" w:after="30"/>
-      </w:pPr>
       <w:r>
-        <w:rPr>
-          <w:rFonts w:ascii="Arial" w:hAnsi="Arial" w:eastAsia="Arial"/>
-          <w:b/>
-          <w:color w:val="000000"/>
-          <w:sz w:val="21"/>
-        </w:rPr>
-        <w:t>3 Bằng chứng kiểm thử</w:t>
-      </w:r>
-    </w:p>
-    <w:tbl>
-      <w:tblPr>
-        <w:tblW w:type="auto" w:w="0"/>
-        <w:jc w:val="center"/>
-        <w:tblLayout w:type="fixed"/>
-        <w:tblLook w:firstColumn="1" w:firstRow="1" w:lastColumn="0" w:lastRow="0" w:noHBand="0" w:noVBand="1" w:val="04A0"/>
-        <w:tblBorders>
-          <w:top w:val="single" w:sz="4" w:color="D9D9D9"/>
-          <w:left w:val="single" w:sz="4" w:color="D9D9D9"/>
-          <w:bottom w:val="single" w:sz="4" w:color="D9D9D9"/>
-          <w:right w:val="single" w:sz="4" w:color="D9D9D9"/>
-          <w:insideH w:val="single" w:sz="4" w:color="D9D9D9"/>
-          <w:insideV w:val="single" w:sz="4" w:color="D9D9D9"/>
-        </w:tblBorders>
-      </w:tblPr>
-      <w:tblGrid>
-        <w:gridCol w:w="2466"/>
-        <w:gridCol w:w="2466"/>
-        <w:gridCol w:w="2466"/>
-        <w:gridCol w:w="2466"/>
-      </w:tblGrid>
-      <w:tr>
-        <w:tc>
-          <w:tcPr>
-            <w:tcW w:type="dxa" w:w="2594"/>
-            <w:shd w:fill="17365D"/>
-            <w:tcMar>
-              <w:top w:w="85" w:type="dxa"/>
-              <w:start w:w="115" w:type="dxa"/>
-              <w:bottom w:w="85" w:type="dxa"/>
-              <w:end w:w="115" w:type="dxa"/>
-            </w:tcMar>
-            <w:vAlign w:val="center"/>
-          </w:tcPr>
-          <w:p>
-            <w:pPr>
-              <w:jc w:val="center"/>
-            </w:pPr>
-            <w:r>
-              <w:rPr>
-                <w:rFonts w:ascii="Arial" w:hAnsi="Arial" w:eastAsia="Arial"/>
-                <w:b/>
-                <w:color w:val="FFFFFF"/>
-                <w:sz w:val="17"/>
-              </w:rPr>
-              <w:t>Build</w:t>
-            </w:r>
-          </w:p>
-        </w:tc>
-        <w:tc>
-          <w:tcPr>
-            <w:tcW w:type="dxa" w:w="2594"/>
-            <w:shd w:fill="17365D"/>
-            <w:tcMar>
-              <w:top w:w="85" w:type="dxa"/>
-              <w:start w:w="115" w:type="dxa"/>
-              <w:bottom w:w="85" w:type="dxa"/>
-              <w:end w:w="115" w:type="dxa"/>
-            </w:tcMar>
-            <w:vAlign w:val="center"/>
-          </w:tcPr>
-          <w:p>
-            <w:pPr>
-              <w:jc w:val="center"/>
-            </w:pPr>
-            <w:r>
-              <w:rPr>
-                <w:rFonts w:ascii="Arial" w:hAnsi="Arial" w:eastAsia="Arial"/>
-                <w:b/>
-                <w:color w:val="FFFFFF"/>
-                <w:sz w:val="17"/>
-              </w:rPr>
-              <w:t>Test offline</w:t>
-            </w:r>
-          </w:p>
-        </w:tc>
-        <w:tc>
-          <w:tcPr>
-            <w:tcW w:type="dxa" w:w="2594"/>
-            <w:shd w:fill="17365D"/>
-            <w:tcMar>
-              <w:top w:w="85" w:type="dxa"/>
-              <w:start w:w="115" w:type="dxa"/>
-              <w:bottom w:w="85" w:type="dxa"/>
-              <w:end w:w="115" w:type="dxa"/>
-            </w:tcMar>
-            <w:vAlign w:val="center"/>
-          </w:tcPr>
-          <w:p>
-            <w:pPr>
-              <w:jc w:val="center"/>
-            </w:pPr>
-            <w:r>
-              <w:rPr>
-                <w:rFonts w:ascii="Arial" w:hAnsi="Arial" w:eastAsia="Arial"/>
-                <w:b/>
-                <w:color w:val="FFFFFF"/>
-                <w:sz w:val="17"/>
-              </w:rPr>
-              <w:t>Mini-holdout</w:t>
-            </w:r>
-          </w:p>
-        </w:tc>
-        <w:tc>
-          <w:tcPr>
-            <w:tcW w:type="dxa" w:w="2594"/>
-            <w:shd w:fill="17365D"/>
-            <w:tcMar>
-              <w:top w:w="85" w:type="dxa"/>
-              <w:start w:w="115" w:type="dxa"/>
-              <w:bottom w:w="85" w:type="dxa"/>
-              <w:end w:w="115" w:type="dxa"/>
-            </w:tcMar>
-            <w:vAlign w:val="center"/>
-          </w:tcPr>
-          <w:p>
-            <w:pPr>
-              <w:jc w:val="center"/>
-            </w:pPr>
-            <w:r>
-              <w:rPr>
-                <w:rFonts w:ascii="Arial" w:hAnsi="Arial" w:eastAsia="Arial"/>
-                <w:b/>
-                <w:color w:val="FFFFFF"/>
-                <w:sz w:val="17"/>
-              </w:rPr>
-              <w:t>Verify live</w:t>
-            </w:r>
-          </w:p>
-        </w:tc>
-      </w:tr>
-      <w:tr>
-        <w:tc>
-          <w:tcPr>
-            <w:tcW w:type="dxa" w:w="2594"/>
-            <w:shd w:fill="EAF2F8"/>
-            <w:tcMar>
-              <w:top w:w="95" w:type="dxa"/>
-              <w:start w:w="115" w:type="dxa"/>
-              <w:bottom w:w="95" w:type="dxa"/>
-              <w:end w:w="115" w:type="dxa"/>
-            </w:tcMar>
-            <w:vAlign w:val="center"/>
-          </w:tcPr>
-          <w:p>
-            <w:pPr>
-              <w:jc w:val="center"/>
-            </w:pPr>
-            <w:r>
-              <w:rPr>
-                <w:rFonts w:ascii="Arial" w:hAnsi="Arial" w:eastAsia="Arial"/>
-                <w:b/>
-                <w:sz w:val="18"/>
-              </w:rPr>
-              <w:t>0 warning 0 error</w:t>
-            </w:r>
-          </w:p>
-        </w:tc>
-        <w:tc>
-          <w:tcPr>
-            <w:tcW w:type="dxa" w:w="2594"/>
-            <w:shd w:fill="F5F6F7"/>
-            <w:tcMar>
-              <w:top w:w="95" w:type="dxa"/>
-              <w:start w:w="115" w:type="dxa"/>
-              <w:bottom w:w="95" w:type="dxa"/>
-              <w:end w:w="115" w:type="dxa"/>
-            </w:tcMar>
-            <w:vAlign w:val="center"/>
-          </w:tcPr>
-          <w:p>
-            <w:pPr>
-              <w:jc w:val="center"/>
-            </w:pPr>
-            <w:r>
-              <w:rPr>
-                <w:rFonts w:ascii="Arial" w:hAnsi="Arial" w:eastAsia="Arial"/>
-                <w:b/>
-                <w:sz w:val="18"/>
-              </w:rPr>
-              <w:t>161 trên 161 pass</w:t>
-            </w:r>
-          </w:p>
-        </w:tc>
-        <w:tc>
-          <w:tcPr>
-            <w:tcW w:type="dxa" w:w="2594"/>
-            <w:shd w:fill="EAF2F8"/>
-            <w:tcMar>
-              <w:top w:w="95" w:type="dxa"/>
-              <w:start w:w="115" w:type="dxa"/>
-              <w:bottom w:w="95" w:type="dxa"/>
-              <w:end w:w="115" w:type="dxa"/>
-            </w:tcMar>
-            <w:vAlign w:val="center"/>
-          </w:tcPr>
-          <w:p>
-            <w:pPr>
-              <w:jc w:val="center"/>
-            </w:pPr>
-            <w:r>
-              <w:rPr>
-                <w:rFonts w:ascii="Arial" w:hAnsi="Arial" w:eastAsia="Arial"/>
-                <w:b/>
-                <w:sz w:val="18"/>
-              </w:rPr>
-              <w:t>8 trên 10</w:t>
-            </w:r>
-          </w:p>
-        </w:tc>
-        <w:tc>
-          <w:tcPr>
-            <w:tcW w:type="dxa" w:w="2594"/>
-            <w:shd w:fill="F5F6F7"/>
-            <w:tcMar>
-              <w:top w:w="95" w:type="dxa"/>
-              <w:start w:w="115" w:type="dxa"/>
-              <w:bottom w:w="95" w:type="dxa"/>
-              <w:end w:w="115" w:type="dxa"/>
-            </w:tcMar>
-            <w:vAlign w:val="center"/>
-          </w:tcPr>
-          <w:p>
-            <w:pPr>
-              <w:jc w:val="center"/>
-            </w:pPr>
-            <w:r>
-              <w:rPr>
-                <w:rFonts w:ascii="Arial" w:hAnsi="Arial" w:eastAsia="Arial"/>
-                <w:b/>
-                <w:sz w:val="18"/>
-              </w:rPr>
-              <w:t>5 trên 5, 65.004 giây</w:t>
-            </w:r>
-          </w:p>
-        </w:tc>
-      </w:tr>
-    </w:tbl>
-    <w:p>
-      <w:pPr>
-        <w:spacing w:after="50" w:line="247" w:lineRule="auto"/>
-      </w:pPr>
-      <w:r>
-        <w:rPr>
-          <w:rFonts w:ascii="Arial" w:hAnsi="Arial" w:eastAsia="Arial"/>
-          <w:b/>
-          <w:sz w:val="18"/>
-        </w:rPr>
-        <w:t>Kết luận đo lường: Official holdout 15 hóa đơn thật đạt raw 10 trên 15; review phát hiện một nhãn người sai nên adjusted view là 11 trên 15, với một missed escalation, hai over-escalation sau adjudication và không có system error. Candidate hậu chỉnh Qwen3.8 Flash đạt 15 trên 15 regression. Prospective mini-holdout 10 ca mới ngày 13/10 đạt 8 trên 10, 0 missed, 2 over, 0 system/provider/429 error và 28 trên 30 field trọng yếu. Các mẫu nhỏ này không phải accuracy production.</w:t>
-      </w:r>
-      <w:r>
-        <w:rPr>
-          <w:rFonts w:ascii="Arial" w:hAnsi="Arial" w:eastAsia="Arial"/>
-          <w:sz w:val="18"/>
-        </w:rPr>
+        <w:t>The prospective sample is small and redacted. It supports a supervised demo, not production accuracy. Three real-user sessions remain incomplete.</w:t>
       </w:r>
     </w:p>
     <w:p>
       <w:pPr>
-        <w:keepNext/>
-        <w:spacing w:before="100" w:after="30"/>
+        <w:pStyle w:val="Heading1"/>
       </w:pPr>
       <w:r>
-        <w:rPr>
-          <w:rFonts w:ascii="Arial" w:hAnsi="Arial" w:eastAsia="Arial"/>
-          <w:b/>
-          <w:color w:val="000000"/>
-          <w:sz w:val="21"/>
-        </w:rPr>
-        <w:t>4 Cơ chế fail safe đã triển khai</w:t>
+        <w:t>Largest feature cut</w:t>
+      </w:r>
+    </w:p>
+    <w:p>
+      <w:r>
+        <w:t>I cut production evidence localization from the final baseline. Highlighting where a fact appears could improve reviewer confidence, but without word-level OCR, independent annotations, and a false-highlight benchmark it could point to the wrong amount and create false confidence. A synthetic hash-bound SVG prototype remains isolated from extraction and policy. PDF, production RBAC, malware scanning, object storage, and distributed rate limiting also remain roadmap items.</w:t>
       </w:r>
     </w:p>
     <w:p>
       <w:pPr>
-        <w:spacing w:after="50" w:line="247" w:lineRule="auto"/>
+        <w:pStyle w:val="Heading1"/>
       </w:pPr>
       <w:r>
-        <w:rPr>
-          <w:rFonts w:ascii="Arial" w:hAnsi="Arial" w:eastAsia="Arial"/>
-          <w:sz w:val="18"/>
-        </w:rPr>
-        <w:t>Upload lưu PENDING rồi trả HTTP 202; worker claim bằng lease nên refresh hoặc restart không làm mất job. Worker backoff 5 đến 60 giây khi SQL tạm lỗi. Fallback mặc định tắt và chỉ chuyển một lần cho lỗi hạ tầng đủ điều kiện. `/healthz` kiểm database, migration, storage, policy và cấu hình AI mà không gọi provider.</w:t>
+        <w:t>Next gate</w:t>
       </w:r>
     </w:p>
     <w:p>
-      <w:pPr>
-        <w:spacing w:after="50" w:line="247" w:lineRule="auto"/>
-      </w:pPr>
       <w:r>
-        <w:rPr>
-          <w:rFonts w:ascii="Arial" w:hAnsi="Arial" w:eastAsia="Arial"/>
-          <w:sz w:val="18"/>
-        </w:rPr>
-        <w:t>Contract hậu holdout tách số hóa đơn, số biên nhận, mã giao dịch, Mã CQT, serial, số chứng từ và POS. Chỉ tổng cuối được in rõ cùng dòng evidence khớp số mới có thể tự duyệt; tổng bị rách hoặc suy từ subtotal/items luôn đi FACT. Ngày/giờ gốc, tiền khách đưa, tiền thối và VAT đã gồm được kiểm riêng để không che nhánh policy.</w:t>
-      </w:r>
-    </w:p>
-    <w:p>
-      <w:pPr>
-        <w:spacing w:after="50" w:line="247" w:lineRule="auto"/>
-      </w:pPr>
-      <w:r>
-        <w:rPr>
-          <w:rFonts w:ascii="Arial" w:hAnsi="Arial" w:eastAsia="Arial"/>
-          <w:sz w:val="18"/>
-        </w:rPr>
-        <w:t>Contract ngày 01/10 thêm discountAmount cho khoản giảm được in rõ. Backend đối chiếu subtotal cộng thuế trừ giảm giá với tổng thanh toán, không suy ra từ claimed amount và không cho keyword trong warning bỏ qua arithmetic. Vì vậy số nhân viên khai được so với số thực trả sau giảm; mâu thuẫn còn lại vẫn đi ESCALATE_FACT.</w:t>
-      </w:r>
-    </w:p>
-    <w:p>
-      <w:pPr>
-        <w:keepNext/>
-        <w:spacing w:before="100" w:after="30"/>
-      </w:pPr>
-      <w:r>
-        <w:rPr>
-          <w:rFonts w:ascii="Arial" w:hAnsi="Arial" w:eastAsia="Arial"/>
-          <w:b/>
-          <w:color w:val="000000"/>
-          <w:sz w:val="21"/>
-        </w:rPr>
-        <w:t>5 Quyết định kiến trúc và phần cắt giảm</w:t>
-      </w:r>
-    </w:p>
-    <w:p>
-      <w:pPr>
-        <w:pStyle w:val="ListBullet"/>
-        <w:spacing w:after="30" w:line="240" w:lineRule="auto"/>
-      </w:pPr>
-      <w:r>
-        <w:rPr>
-          <w:rFonts w:ascii="Arial" w:hAnsi="Arial" w:eastAsia="Arial"/>
-          <w:sz w:val="18"/>
-        </w:rPr>
-        <w:t>Tách extraction, semantic validation và PolicyDecisionEngine để đổi model mà không đổi luật duyệt.</w:t>
-      </w:r>
-    </w:p>
-    <w:p>
-      <w:pPr>
-        <w:pStyle w:val="ListBullet"/>
-        <w:spacing w:after="30" w:line="240" w:lineRule="auto"/>
-      </w:pPr>
-      <w:r>
-        <w:rPr>
-          <w:rFonts w:ascii="Arial" w:hAnsi="Arial" w:eastAsia="Arial"/>
-          <w:sz w:val="18"/>
-        </w:rPr>
-        <w:t>Giữ Official Verify đúng năm ca; evaluator 15/30 nằm ngoài UI và đi qua cùng production endpoint.</w:t>
-      </w:r>
-    </w:p>
-    <w:p>
-      <w:pPr>
-        <w:pStyle w:val="ListBullet"/>
-        <w:spacing w:after="30" w:line="240" w:lineRule="auto"/>
-      </w:pPr>
-      <w:r>
-        <w:rPr>
-          <w:rFonts w:ascii="Arial" w:hAnsi="Arial" w:eastAsia="Arial"/>
-          <w:sz w:val="18"/>
-        </w:rPr>
-        <w:t>Chọn Qwen3.8 Flash qua Alibaba làm primary; reasoning none tránh tiêu hết output budget. Ollama 4B 16K chỉ fallback local có giám sát vì P95 khoảng 213 giây.</w:t>
-      </w:r>
-    </w:p>
-    <w:p>
-      <w:pPr>
-        <w:pStyle w:val="ListBullet"/>
-        <w:spacing w:after="30" w:line="240" w:lineRule="auto"/>
-      </w:pPr>
-      <w:r>
-        <w:rPr>
-          <w:rFonts w:ascii="Arial" w:hAnsi="Arial" w:eastAsia="Arial"/>
-          <w:sz w:val="18"/>
-        </w:rPr>
-        <w:t>Hoãn PDF nhiều trang, authentication, tax lookup, antivirus và object storage sang scope production.</w:t>
-      </w:r>
-    </w:p>
-    <w:p>
-      <w:pPr>
-        <w:pStyle w:val="ListBullet"/>
-        <w:spacing w:after="30" w:line="240" w:lineRule="auto"/>
-      </w:pPr>
-      <w:r>
-        <w:rPr>
-          <w:rFonts w:ascii="Arial" w:hAnsi="Arial" w:eastAsia="Arial"/>
-          <w:sz w:val="18"/>
-        </w:rPr>
-        <w:t>Giữ EF Core 8.0.31: NuGet không báo advisory; không nâng major .NET/EF sát ngày chốt.</w:t>
-      </w:r>
-    </w:p>
-    <w:p>
-      <w:pPr>
-        <w:keepNext/>
-        <w:spacing w:before="100" w:after="30"/>
-      </w:pPr>
-      <w:r>
-        <w:rPr>
-          <w:rFonts w:ascii="Arial" w:hAnsi="Arial" w:eastAsia="Arial"/>
-          <w:b/>
-          <w:color w:val="000000"/>
-          <w:sz w:val="21"/>
-        </w:rPr>
-        <w:t>6 Bài học và bước tiếp theo</w:t>
-      </w:r>
-    </w:p>
-    <w:p>
-      <w:pPr>
-        <w:spacing w:after="50" w:line="247" w:lineRule="auto"/>
-      </w:pPr>
-      <w:r>
-        <w:rPr>
-          <w:rFonts w:ascii="Arial" w:hAnsi="Arial" w:eastAsia="Arial"/>
-          <w:sz w:val="18"/>
-        </w:rPr>
-        <w:t>Live baseline đã pass health, security, Verify 5 trên 5, human workflow, desktop, mobile 390x844 và điện thoại thật 4G/5G. Candidate ngày 12/10 đạt 15 trên 15 post-holdout regression; mini-holdout mới ngày 13/10 đạt 8 trên 10 với 0 missed và 0 system/provider error. Năm request đầu của mini-holdout terminal trong 64,763 giây ở AI concurrency 1. Verify live đạt 5 trên 5 trong 65,004 giây; năm client chỉ tạo một batch thật. Candidate đạt 161 test; còn ba user session và rehearsal. Dữ liệu cá nhân thật không được đưa vào Git.</w:t>
+        <w:t>Complete three consented user sessions, preserve verbatim feedback, trace one change to a commit, and report one negative operational impact. Then reduce over-escalation with independent positive and negative fixtures without weakening the missed-escalation guard.</w:t>
       </w:r>
     </w:p>
     <w:sectPr>
-      <w:pgSz w:w="11906" w:h="16838"/>
-      <w:pgMar w:top="595" w:right="765" w:bottom="567" w:left="765" w:header="720" w:footer="720" w:gutter="0"/>
+      <w:headerReference w:type="default" r:id="rId9"/>
+      <w:footerReference w:type="default" r:id="rId10"/>
+      <w:pgSz w:w="15840" w:h="12240" w:orient="landscape"/>
+      <w:pgMar w:top="605" w:right="691" w:bottom="576" w:left="691" w:header="346" w:footer="360" w:gutter="0"/>
       <w:cols w:space="720"/>
       <w:docGrid w:linePitch="360"/>
     </w:sectPr>
   </w:body>
 </w:document>
+</file>
+
+<file path=word/footer1.xml><?xml version="1.0" encoding="utf-8"?>
+<w:ftr xmlns:m="http://schemas.openxmlformats.org/officeDocument/2006/math" xmlns:mc="http://schemas.openxmlformats.org/markup-compatibility/2006" xmlns:mo="http://schemas.microsoft.com/office/mac/office/2008/main" xmlns:mv="urn:schemas-microsoft-com:mac:vml" xmlns:o="urn:schemas-microsoft-com:office:office" xmlns:r="http://schemas.openxmlformats.org/officeDocument/2006/relationships" xmlns:v="urn:schemas-microsoft-com:vml" xmlns:w10="urn:schemas-microsoft-com:office:word" xmlns:w14="http://schemas.microsoft.com/office/word/2010/wordml" xmlns:w="http://schemas.openxmlformats.org/wordprocessingml/2006/main" xmlns:wne="http://schemas.microsoft.com/office/word/2006/wordml" xmlns:wp14="http://schemas.microsoft.com/office/word/2010/wordprocessingDrawing" xmlns:wp="http://schemas.openxmlformats.org/drawingml/2006/wordprocessingDrawing" xmlns:wpc="http://schemas.microsoft.com/office/word/2010/wordprocessingCanvas" xmlns:wpg="http://schemas.microsoft.com/office/word/2010/wordprocessingGroup" xmlns:wpi="http://schemas.microsoft.com/office/word/2010/wordprocessingInk" xmlns:wps="http://schemas.microsoft.com/office/word/2010/wordprocessingShape" mc:Ignorable="w14 wp14">
+  <w:p>
+    <w:pPr>
+      <w:pStyle w:val="Footer"/>
+      <w:jc w:val="right"/>
+    </w:pPr>
+    <w:r>
+      <w:rPr>
+        <w:rFonts w:ascii="Arial" w:hAnsi="Arial"/>
+        <w:color w:val="5B6770"/>
+        <w:sz w:val="16"/>
+      </w:rPr>
+      <w:t xml:space="preserve">Page </w:t>
+      <w:fldChar w:fldCharType="begin"/>
+      <w:instrText xml:space="preserve">PAGE</w:instrText>
+      <w:fldChar w:fldCharType="end"/>
+    </w:r>
+  </w:p>
+</w:ftr>
+</file>
+
+<file path=word/header1.xml><?xml version="1.0" encoding="utf-8"?>
+<w:hdr xmlns:m="http://schemas.openxmlformats.org/officeDocument/2006/math" xmlns:mc="http://schemas.openxmlformats.org/markup-compatibility/2006" xmlns:mo="http://schemas.microsoft.com/office/mac/office/2008/main" xmlns:mv="urn:schemas-microsoft-com:mac:vml" xmlns:o="urn:schemas-microsoft-com:office:office" xmlns:r="http://schemas.openxmlformats.org/officeDocument/2006/relationships" xmlns:v="urn:schemas-microsoft-com:vml" xmlns:w10="urn:schemas-microsoft-com:office:word" xmlns:w14="http://schemas.microsoft.com/office/word/2010/wordml" xmlns:w="http://schemas.openxmlformats.org/wordprocessingml/2006/main" xmlns:wne="http://schemas.microsoft.com/office/word/2006/wordml" xmlns:wp14="http://schemas.microsoft.com/office/word/2010/wordprocessingDrawing" xmlns:wp="http://schemas.openxmlformats.org/drawingml/2006/wordprocessingDrawing" xmlns:wpc="http://schemas.microsoft.com/office/word/2010/wordprocessingCanvas" xmlns:wpg="http://schemas.microsoft.com/office/word/2010/wordprocessingGroup" xmlns:wpi="http://schemas.microsoft.com/office/word/2010/wordprocessingInk" xmlns:wps="http://schemas.microsoft.com/office/word/2010/wordprocessingShape" mc:Ignorable="w14 wp14">
+  <w:p>
+    <w:pPr>
+      <w:pStyle w:val="Header"/>
+      <w:jc w:val="right"/>
+    </w:pPr>
+    <w:r>
+      <w:rPr>
+        <w:rFonts w:ascii="Arial" w:hAnsi="Arial"/>
+        <w:b/>
+        <w:color w:val="2F5597"/>
+        <w:sz w:val="15"/>
+      </w:rPr>
+      <w:t>AURA  |  OrganizationAI  |  The Deciders</w:t>
+    </w:r>
+  </w:p>
+</w:hdr>
 </file>
 
 <file path=word/numbering.xml><?xml version="1.0" encoding="utf-8"?>
@@ -1086,9 +913,13 @@
     <w:name w:val="Normal"/>
     <w:qFormat/>
     <w:rsid w:val="00FC693F"/>
+    <w:pPr>
+      <w:spacing w:after="48" w:line="240" w:lineRule="auto"/>
+    </w:pPr>
     <w:rPr>
-      <w:rFonts w:ascii="Arial" w:hAnsi="Arial" w:eastAsia="Arial"/>
-      <w:sz w:val="18"/>
+      <w:rFonts w:ascii="Arial" w:hAnsi="Arial"/>
+      <w:color w:val="17212B"/>
+      <w:sz w:val="16"/>
     </w:rPr>
   </w:style>
   <w:style w:type="paragraph" w:styleId="Header">
@@ -1146,15 +977,15 @@
     <w:pPr>
       <w:keepNext/>
       <w:keepLines/>
-      <w:spacing w:before="480" w:after="0"/>
+      <w:spacing w:before="60" w:after="30"/>
       <w:outlineLvl w:val="0"/>
     </w:pPr>
     <w:rPr>
-      <w:rFonts w:asciiTheme="majorHAnsi" w:eastAsiaTheme="majorEastAsia" w:hAnsiTheme="majorHAnsi" w:cstheme="majorBidi"/>
+      <w:rFonts w:asciiTheme="majorHAnsi" w:eastAsiaTheme="majorEastAsia" w:hAnsiTheme="majorHAnsi" w:cstheme="majorBidi" w:ascii="Arial" w:hAnsi="Arial"/>
       <w:b/>
       <w:bCs/>
-      <w:color w:val="365F91" w:themeColor="accent1" w:themeShade="BF"/>
-      <w:sz w:val="28"/>
+      <w:color w:val="17365D"/>
+      <w:sz w:val="21"/>
       <w:szCs w:val="28"/>
     </w:rPr>
   </w:style>
@@ -1170,15 +1001,15 @@
     <w:pPr>
       <w:keepNext/>
       <w:keepLines/>
-      <w:spacing w:before="200" w:after="0"/>
+      <w:spacing w:before="60" w:after="30"/>
       <w:outlineLvl w:val="1"/>
     </w:pPr>
     <w:rPr>
-      <w:rFonts w:asciiTheme="majorHAnsi" w:eastAsiaTheme="majorEastAsia" w:hAnsiTheme="majorHAnsi" w:cstheme="majorBidi"/>
+      <w:rFonts w:asciiTheme="majorHAnsi" w:eastAsiaTheme="majorEastAsia" w:hAnsiTheme="majorHAnsi" w:cstheme="majorBidi" w:ascii="Arial" w:hAnsi="Arial"/>
       <w:b/>
       <w:bCs/>
-      <w:color w:val="4F81BD" w:themeColor="accent1"/>
-      <w:sz w:val="26"/>
+      <w:color w:val="2F5597"/>
+      <w:sz w:val="18"/>
       <w:szCs w:val="26"/>
     </w:rPr>
   </w:style>
@@ -1194,14 +1025,15 @@
     <w:pPr>
       <w:keepNext/>
       <w:keepLines/>
-      <w:spacing w:before="200" w:after="0"/>
+      <w:spacing w:before="60" w:after="30"/>
       <w:outlineLvl w:val="2"/>
     </w:pPr>
     <w:rPr>
-      <w:rFonts w:asciiTheme="majorHAnsi" w:eastAsiaTheme="majorEastAsia" w:hAnsiTheme="majorHAnsi" w:cstheme="majorBidi"/>
+      <w:rFonts w:asciiTheme="majorHAnsi" w:eastAsiaTheme="majorEastAsia" w:hAnsiTheme="majorHAnsi" w:cstheme="majorBidi" w:ascii="Arial" w:hAnsi="Arial"/>
       <w:b/>
       <w:bCs/>
-      <w:color w:val="4F81BD" w:themeColor="accent1"/>
+      <w:color w:val="17212B"/>
+      <w:sz w:val="17"/>
     </w:rPr>
   </w:style>
   <w:style w:type="paragraph" w:styleId="Heading4">
@@ -1432,18 +1264,17 @@
     <w:qFormat/>
     <w:rsid w:val="00FC693F"/>
     <w:pPr>
-      <w:pBdr>
-        <w:bottom w:val="single" w:sz="8" w:space="4" w:color="4F81BD" w:themeColor="accent1"/>
-      </w:pBdr>
-      <w:spacing w:after="300" w:line="240" w:lineRule="auto"/>
+      <w:keepNext/>
+      <w:spacing w:after="30" w:line="240" w:lineRule="auto" w:before="60"/>
       <w:contextualSpacing/>
     </w:pPr>
     <w:rPr>
-      <w:rFonts w:asciiTheme="majorHAnsi" w:eastAsiaTheme="majorEastAsia" w:hAnsiTheme="majorHAnsi" w:cstheme="majorBidi"/>
-      <w:color w:val="17365D" w:themeColor="text2" w:themeShade="BF"/>
+      <w:rFonts w:asciiTheme="majorHAnsi" w:eastAsiaTheme="majorEastAsia" w:hAnsiTheme="majorHAnsi" w:cstheme="majorBidi" w:ascii="Arial" w:hAnsi="Arial"/>
+      <w:b/>
+      <w:color w:val="17365D"/>
       <w:spacing w:val="5"/>
       <w:kern w:val="28"/>
-      <w:sz w:val="52"/>
+      <w:sz w:val="36"/>
       <w:szCs w:val="52"/>
     </w:rPr>
   </w:style>

</xml_diff>

<commit_message>
docs: localize final judge package to Vietnamese
</commit_message>
<xml_diff>
--- a/AURA/submission/AURA_BUILD_LOG.docx
+++ b/AURA/submission/AURA_BUILD_LOG.docx
@@ -8,7 +8,7 @@
         <w:jc w:val="left"/>
       </w:pPr>
       <w:r>
-        <w:t>AURA Project Build Log</w:t>
+        <w:t>Nhật ký xây dựng dự án AURA</w:t>
       </w:r>
     </w:p>
     <w:p>
@@ -21,7 +21,7 @@
     </w:p>
     <w:p>
       <w:r>
-        <w:t>AURA is a supervised reimbursement-review assistant. A vision model extracts structured receipt facts, deterministic C# policy decides the route, and people remain responsible for exceptions. The system covers upload, durable background processing, review, Audit, and Undo.</w:t>
+        <w:t>AURA là trợ lý thẩm định tuyến đầu có con người giám sát cho quy trình hoàn ứng. Vision model trích xuất dữ kiện có cấu trúc từ hóa đơn, policy C# tất định quyết định hướng xử lý, còn con người chịu trách nhiệm với ngoại lệ. Hệ thống bao phủ upload, xử lý nền bền vững, duyệt thủ công, Audit và Undo.</w:t>
       </w:r>
     </w:p>
     <w:p>
@@ -29,12 +29,12 @@
         <w:pStyle w:val="Heading1"/>
       </w:pPr>
       <w:r>
-        <w:t>How I used AI</w:t>
+        <w:t>Tôi đã dùng AI như thế nào</w:t>
       </w:r>
     </w:p>
     <w:p>
       <w:r>
-        <w:t>Qwen3.8 Flash through OpenRouter and Alibaba, with reasoning disabled, reads one JPG or PNG and returns a strict JSON contract. Codex helped trace code paths, design tests, review refactors, and synchronize documentation. I accepted changes only after build, tests, and evidence review. The model never receives approval authority.</w:t>
+        <w:t>Qwen3.8 Flash qua OpenRouter và Alibaba, với reasoning tắt, đọc một ảnh JPG/PNG và trả về hợp đồng JSON nghiêm ngặt. Codex hỗ trợ truy luồng code, thiết kế test, rà soát refactor và đồng bộ tài liệu. Tôi chỉ giữ thay đổi sau khi build, chạy test và kiểm tra evidence. Model không có quyền phê duyệt.</w:t>
       </w:r>
     </w:p>
     <w:p>
@@ -42,7 +42,7 @@
         <w:pStyle w:val="Heading1"/>
       </w:pPr>
       <w:r>
-        <w:t>Where AI helped</w:t>
+        <w:t>AI đã giúp ở đâu</w:t>
       </w:r>
     </w:p>
     <w:p>
@@ -51,7 +51,7 @@
         <w:ind w:left="230" w:hanging="173"/>
       </w:pPr>
       <w:r>
-        <w:t>Fast code navigation exposed the difference between an in-memory signal and the durable SQL job queue.</w:t>
+        <w:t>Truy code nhanh đã làm rõ sự khác nhau giữa tín hiệu trong bộ nhớ và hàng đợi công việc bền vững trong SQL.</w:t>
       </w:r>
     </w:p>
     <w:p>
@@ -60,7 +60,7 @@
         <w:ind w:left="230" w:hanging="173"/>
       </w:pPr>
       <w:r>
-        <w:t>Generated test cases expanded coverage for field roles, arithmetic, date evidence, fallback, concurrency, Audit, and UI contracts.</w:t>
+        <w:t>Các test được bổ sung bao phủ vai trò trường dữ liệu, số học, evidence ngày tháng, fallback, concurrency, Audit và hợp đồng UI.</w:t>
       </w:r>
     </w:p>
     <w:p>
@@ -69,7 +69,7 @@
         <w:ind w:left="230" w:hanging="173"/>
       </w:pPr>
       <w:r>
-        <w:t>Vision extraction handled varied receipt layouts while policy remained replaceable and testable.</w:t>
+        <w:t>Vision extraction xử lý nhiều bố cục hóa đơn trong khi policy vẫn có thể thay thế và kiểm thử độc lập.</w:t>
       </w:r>
     </w:p>
     <w:p>
@@ -77,12 +77,12 @@
         <w:pStyle w:val="Heading1"/>
       </w:pPr>
       <w:r>
-        <w:t>Where AI cost time or money</w:t>
+        <w:t>AI đã làm tốn thời gian hoặc chi phí ở đâu</w:t>
       </w:r>
     </w:p>
     <w:p>
       <w:r>
-        <w:t>Provider names and model slugs changed, and earlier routes produced 404 or intermittent 429 errors. Schema-valid outputs also contained semantic errors such as the wrong money unit or identifier role. A reasoning-enabled request used its completion budget without returning usable JSON. These failures required provider diagnostics, a strict schema, semantic validation, a single repair attempt, cooldown, and explicit claim boundaries. Paid API reruns were avoided once data became known.</w:t>
+        <w:t>Tên provider và model slug từng thay đổi; một số route cũ trả 404 hoặc lỗi 429 không ổn định. Output đúng schema vẫn có thể sai nghĩa, chẳng hạn nhầm đơn vị tiền hoặc vai trò mã định danh. Một request bật reasoning đã dùng hết completion budget nhưng không trả JSON dùng được. Các lỗi này buộc dự án phải có chẩn đoán provider, schema nghiêm ngặt, semantic validation, đúng một lần repair, cooldown và ranh giới claim rõ ràng. Khi dữ liệu đã trở thành known data, dự án không chạy lại API trả phí để săn số đẹp.</w:t>
       </w:r>
     </w:p>
     <w:p>
@@ -90,12 +90,12 @@
         <w:pStyle w:val="Heading1"/>
       </w:pPr>
       <w:r>
-        <w:t>What changed after failure</w:t>
+        <w:t>Điều gì thay đổi sau thất bại</w:t>
       </w:r>
     </w:p>
     <w:p>
       <w:r>
-        <w:t xml:space="preserve">The first real-receipt holdout exposed a missed escalation even though the response parsed. I replaced “valid JSON is enough” with evidence contract v2: identifiers have distinct roles, dates preserve raw evidence, discounts are explicit, and an amount can auto-approve only when a printed final-total line corroborates it. Unresolved uncertainty becomes FACT review. The policy priority remains </w:t>
+        <w:t xml:space="preserve">Holdout hóa đơn thật đầu tiên phát hiện một missed escalation dù response parse thành công. Tôi thay giả định “JSON hợp lệ là đủ” bằng evidence contract v2: mỗi mã định danh có vai trò riêng, ngày tháng giữ chuỗi gốc, khoản giảm giá có trường riêng và số tiền chỉ được tự duyệt khi có dòng tổng cuối in rõ để đối chứng. Bất định chưa giải quyết được chuyển sang FACT review. Thứ tự policy vẫn là </w:t>
       </w:r>
       <w:r>
         <w:rPr>
@@ -113,7 +113,7 @@
         <w:pStyle w:val="Heading1"/>
       </w:pPr>
       <w:r>
-        <w:t>Verified evidence</w:t>
+        <w:t>Bằng chứng đã xác minh</w:t>
       </w:r>
     </w:p>
     <w:tbl>
@@ -190,7 +190,7 @@
                 <w:color w:val="FFFFFF"/>
                 <w:sz w:val="15"/>
               </w:rPr>
-              <w:t>Current result</w:t>
+              <w:t>Kết quả hiện tại</w:t>
             </w:r>
           </w:p>
         </w:tc>
@@ -243,7 +243,7 @@
                 <w:rFonts w:ascii="Arial" w:hAnsi="Arial"/>
                 <w:sz w:val="15"/>
               </w:rPr>
-              <w:t>0 warnings, 0 errors</w:t>
+              <w:t>0 warning, 0 error</w:t>
             </w:r>
           </w:p>
         </w:tc>
@@ -273,7 +273,7 @@
                 <w:rFonts w:ascii="Arial" w:hAnsi="Arial"/>
                 <w:sz w:val="15"/>
               </w:rPr>
-              <w:t>Offline tests</w:t>
+              <w:t>Test offline</w:t>
             </w:r>
           </w:p>
         </w:tc>
@@ -298,7 +298,7 @@
                 <w:rFonts w:ascii="Arial" w:hAnsi="Arial"/>
                 <w:sz w:val="15"/>
               </w:rPr>
-              <w:t>163/163 passed</w:t>
+              <w:t>163/163 pass</w:t>
             </w:r>
           </w:p>
         </w:tc>
@@ -327,7 +327,7 @@
                 <w:rFonts w:ascii="Arial" w:hAnsi="Arial"/>
                 <w:sz w:val="15"/>
               </w:rPr>
-              <w:t>Live Verify</w:t>
+              <w:t>Verify live</w:t>
             </w:r>
           </w:p>
         </w:tc>
@@ -351,7 +351,7 @@
                 <w:rFonts w:ascii="Arial" w:hAnsi="Arial"/>
                 <w:sz w:val="15"/>
               </w:rPr>
-              <w:t>5/5 in 65.004 seconds</w:t>
+              <w:t>5/5 trong 65,004 giây</w:t>
             </w:r>
           </w:p>
         </w:tc>
@@ -381,7 +381,7 @@
                 <w:rFonts w:ascii="Arial" w:hAnsi="Arial"/>
                 <w:sz w:val="15"/>
               </w:rPr>
-              <w:t>Prospective mini-holdout</w:t>
+              <w:t>Mini-holdout prospective</w:t>
             </w:r>
           </w:p>
         </w:tc>
@@ -406,7 +406,7 @@
                 <w:rFonts w:ascii="Arial" w:hAnsi="Arial"/>
                 <w:sz w:val="15"/>
               </w:rPr>
-              <w:t>8/10, 0 missed, 2 over, 0 system/provider/429 errors</w:t>
+              <w:t>8/10, 0 missed, 2 over, 0 lỗi system/provider/429</w:t>
             </w:r>
           </w:p>
         </w:tc>
@@ -435,7 +435,7 @@
                 <w:rFonts w:ascii="Arial" w:hAnsi="Arial"/>
                 <w:sz w:val="15"/>
               </w:rPr>
-              <w:t>Sequential known-data repeat</w:t>
+              <w:t>Lặp tuần tự trên known data</w:t>
             </w:r>
           </w:p>
         </w:tc>
@@ -459,7 +459,7 @@
                 <w:rFonts w:ascii="Arial" w:hAnsi="Arial"/>
                 <w:sz w:val="15"/>
               </w:rPr>
-              <w:t>11/12, 0 missed, 1 over; stability evidence only</w:t>
+              <w:t>11/12, 0 missed, 1 over; chỉ là evidence ổn định</w:t>
             </w:r>
           </w:p>
         </w:tc>
@@ -467,7 +467,7 @@
     </w:tbl>
     <w:p>
       <w:r>
-        <w:t>The prospective sample is small and redacted. It supports a supervised demo, not production accuracy. Three real-user sessions remain incomplete.</w:t>
+        <w:t>Mẫu prospective nhỏ và đã redaction. Kết quả đủ hỗ trợ demo có giám sát, không phải production accuracy. Ba phiên người dùng thực tế vẫn chưa hoàn tất.</w:t>
       </w:r>
     </w:p>
     <w:p>
@@ -475,12 +475,12 @@
         <w:pStyle w:val="Heading1"/>
       </w:pPr>
       <w:r>
-        <w:t>Largest feature cut</w:t>
+        <w:t>Tính năng lớn nhất đã cắt</w:t>
       </w:r>
     </w:p>
     <w:p>
       <w:r>
-        <w:t>I cut production evidence localization from the final baseline. Highlighting where a fact appears could improve reviewer confidence, but without word-level OCR, independent annotations, and a false-highlight benchmark it could point to the wrong amount and create false confidence. A synthetic hash-bound SVG prototype remains isolated from extraction and policy. PDF, production RBAC, malware scanning, object storage, and distributed rate limiting also remain roadmap items.</w:t>
+        <w:t>Tôi chưa đưa evidence localization vào baseline production. Việc khoanh vùng dữ kiện có thể tăng độ tin cậy của reviewer, nhưng khi chưa có word-level OCR, annotation độc lập và benchmark false-highlight, hệ thống có thể trỏ nhầm số tiền và tạo tự tin sai. Prototype SVG gắn với hash ảnh tổng hợp vẫn được giữ tách biệt với extraction và policy. PDF, production RBAC, malware scanning, object storage và distributed rate limiting cũng nằm trong roadmap.</w:t>
       </w:r>
     </w:p>
     <w:p>
@@ -488,12 +488,12 @@
         <w:pStyle w:val="Heading1"/>
       </w:pPr>
       <w:r>
-        <w:t>Next gate</w:t>
+        <w:t>Gate tiếp theo</w:t>
       </w:r>
     </w:p>
     <w:p>
       <w:r>
-        <w:t>Complete three consented user sessions, preserve verbatim feedback, trace one change to a commit, and report one negative operational impact. Then reduce over-escalation with independent positive and negative fixtures without weakening the missed-escalation guard.</w:t>
+        <w:t>Hoàn tất ba phiên người dùng có đồng ý tham gia, giữ feedback nguyên văn, truy vết một thay đổi tới commit và ghi nhận ít nhất một tác động vận hành tiêu cực. Sau đó mới giảm over-escalation bằng fixture dương/âm độc lập mà không làm yếu guard chống missed escalation.</w:t>
       </w:r>
     </w:p>
     <w:sectPr>
@@ -521,7 +521,7 @@
         <w:color w:val="5B6770"/>
         <w:sz w:val="16"/>
       </w:rPr>
-      <w:t xml:space="preserve">Page </w:t>
+      <w:t xml:space="preserve">Trang </w:t>
       <w:fldChar w:fldCharType="begin"/>
       <w:instrText xml:space="preserve">PAGE</w:instrText>
       <w:fldChar w:fldCharType="end"/>

</xml_diff>

<commit_message>
Synchronize Drive UX evidence and contest artifacts
</commit_message>
<xml_diff>
--- a/AURA/submission/AURA_BUILD_LOG.docx
+++ b/AURA/submission/AURA_BUILD_LOG.docx
@@ -2,6 +2,30 @@
 <file path=word/document.xml><?xml version="1.0" encoding="utf-8"?>
 <w:document xmlns:wpc="http://schemas.microsoft.com/office/word/2010/wordprocessingCanvas" xmlns:mo="http://schemas.microsoft.com/office/mac/office/2008/main" xmlns:mc="http://schemas.openxmlformats.org/markup-compatibility/2006" xmlns:mv="urn:schemas-microsoft-com:mac:vml" xmlns:o="urn:schemas-microsoft-com:office:office" xmlns:r="http://schemas.openxmlformats.org/officeDocument/2006/relationships" xmlns:m="http://schemas.openxmlformats.org/officeDocument/2006/math" xmlns:v="urn:schemas-microsoft-com:vml" xmlns:wp14="http://schemas.microsoft.com/office/word/2010/wordprocessingDrawing" xmlns:wp="http://schemas.openxmlformats.org/drawingml/2006/wordprocessingDrawing" xmlns:w10="urn:schemas-microsoft-com:office:word" xmlns:w="http://schemas.openxmlformats.org/wordprocessingml/2006/main" xmlns:w14="http://schemas.microsoft.com/office/word/2010/wordml" xmlns:wpg="http://schemas.microsoft.com/office/word/2010/wordprocessingGroup" xmlns:wpi="http://schemas.microsoft.com/office/word/2010/wordprocessingInk" xmlns:wne="http://schemas.microsoft.com/office/word/2006/wordml" xmlns:wps="http://schemas.microsoft.com/office/word/2010/wordprocessingShape" mc:Ignorable="w14 wp14">
   <w:body>
+    <w:p>
+      <w:pPr>
+        <w:spacing w:after="40"/>
+      </w:pPr>
+      <w:r>
+        <w:rPr>
+          <w:b/>
+          <w:color w:val="24467B"/>
+          <w:sz w:val="16"/>
+        </w:rPr>
+        <w:t>CẬP NHẬT 26/10/2026</w:t>
+      </w:r>
+    </w:p>
+    <w:p>
+      <w:pPr>
+        <w:spacing w:after="120"/>
+      </w:pPr>
+      <w:r>
+        <w:rPr>
+          <w:sz w:val="16"/>
+        </w:rPr>
+        <w:t>Local synthetic: Drive Restricted (Viewer) → SQL; bảng nhân viên tự hiện chờ/chạy/kết quả qua fetch; file Drive cũ được bỏ qua. Release unit suite 378/378. Strict ZDR là yêu cầu routing, chưa phải chứng nhận privacy. Số liệu 163 test/Verify 5/5 bên dưới thuộc bản đã nộp.</w:t>
+      </w:r>
+    </w:p>
     <w:p>
       <w:pPr>
         <w:pStyle w:val="Title"/>

</xml_diff>